<commit_message>
docs: dodaj rozdział „Szybki start" i mapę panelu (drzewo systemu)
- Szybki start: 7 kroków od logowania do wysłanej oferty + minimalne pola
- Mapa panelu: diagram SVG struktury /admin (Oferty, Katalogi, Ustawienia,
  Użytkownicy) w kolorach K2
Diakrytyka zweryfikowana (hunspell), typografia i stopka bez zmian.

Co-Authored-By: Claude Opus 4.8 <noreply@anthropic.com>
</commit_message>
<xml_diff>
--- a/docs/K2Biznes_Oferta_-_instrukcja_i_architektura.docx
+++ b/docs/K2Biznes_Oferta_-_instrukcja_i_architektura.docx
@@ -89,6 +89,314 @@
           <w:sz w:val="22"/>
         </w:rPr>
         <w:t>Dokument ma dwie warstwy. Część I to praktyczna instrukcja dla konsultantów i administratorów tworzących oferty - krok po kroku, prostym językiem. Część II opisuje architekturę systemu dla zespołu technicznego. Kanonem wiedzy technicznej pozostają pliki w repozytorium: docs/BACKEND_SPEC.md oraz docs/TECH_ADMIN_MANUAL.md.</w:t>
+      </w:r>
+    </w:p>
+    <w:p>
+      <w:pPr>
+        <w:jc w:val="left"/>
+        <w:spacing w:before="160" w:after="40"/>
+      </w:pPr>
+      <w:r>
+        <w:rPr>
+          <w:rFonts w:ascii="Roboto Condensed" w:hAnsi="Roboto Condensed"/>
+          <w:b w:val="0"/>
+          <w:color w:val="2A324B"/>
+          <w:sz w:val="36"/>
+        </w:rPr>
+        <w:t>Szybki start - od zera do wysłanej oferty</w:t>
+      </w:r>
+    </w:p>
+    <w:p>
+      <w:pPr>
+        <w:jc w:val="both"/>
+        <w:spacing w:after="120" w:before="0"/>
+      </w:pPr>
+      <w:r>
+        <w:rPr>
+          <w:rFonts w:ascii="Roboto Condensed Light" w:hAnsi="Roboto Condensed Light"/>
+          <w:b w:val="0"/>
+          <w:color w:val="2A324B"/>
+          <w:sz w:val="22"/>
+        </w:rPr>
+        <w:t>Najkrótsza droga do wysłania pierwszej oferty. Szczegóły każdego kroku opisuje Część I.</w:t>
+      </w:r>
+    </w:p>
+    <w:p>
+      <w:pPr>
+        <w:jc w:val="both"/>
+        <w:spacing w:after="80" w:before="0"/>
+        <w:ind w:left="360" w:hanging="360"/>
+      </w:pPr>
+      <w:r>
+        <w:rPr>
+          <w:rFonts w:ascii="Roboto Condensed Light" w:hAnsi="Roboto Condensed Light"/>
+          <w:b w:val="0"/>
+          <w:color w:val="2A324B"/>
+          <w:sz w:val="22"/>
+        </w:rPr>
+        <w:t xml:space="preserve">1. </w:t>
+      </w:r>
+      <w:r>
+        <w:rPr>
+          <w:rFonts w:ascii="Roboto Condensed Light" w:hAnsi="Roboto Condensed Light"/>
+          <w:b w:val="0"/>
+          <w:color w:val="2A324B"/>
+          <w:sz w:val="22"/>
+        </w:rPr>
+        <w:t>Zaloguj się na /auth/signin. Przy pierwszym logowaniu jako administrator skonfiguruj weryfikację dwuetapową.</w:t>
+      </w:r>
+    </w:p>
+    <w:p>
+      <w:pPr>
+        <w:jc w:val="both"/>
+        <w:spacing w:after="80" w:before="0"/>
+        <w:ind w:left="360" w:hanging="360"/>
+      </w:pPr>
+      <w:r>
+        <w:rPr>
+          <w:rFonts w:ascii="Roboto Condensed Light" w:hAnsi="Roboto Condensed Light"/>
+          <w:b w:val="0"/>
+          <w:color w:val="2A324B"/>
+          <w:sz w:val="22"/>
+        </w:rPr>
+        <w:t xml:space="preserve">2. </w:t>
+      </w:r>
+      <w:r>
+        <w:rPr>
+          <w:rFonts w:ascii="Roboto Condensed Light" w:hAnsi="Roboto Condensed Light"/>
+          <w:b w:val="0"/>
+          <w:color w:val="2A324B"/>
+          <w:sz w:val="22"/>
+        </w:rPr>
+        <w:t>Wejdź w Oferty i kliknij Nowa oferta.</w:t>
+      </w:r>
+    </w:p>
+    <w:p>
+      <w:pPr>
+        <w:jc w:val="both"/>
+        <w:spacing w:after="80" w:before="0"/>
+        <w:ind w:left="360" w:hanging="360"/>
+      </w:pPr>
+      <w:r>
+        <w:rPr>
+          <w:rFonts w:ascii="Roboto Condensed Light" w:hAnsi="Roboto Condensed Light"/>
+          <w:b w:val="0"/>
+          <w:color w:val="2A324B"/>
+          <w:sz w:val="22"/>
+        </w:rPr>
+        <w:t xml:space="preserve">3. </w:t>
+      </w:r>
+      <w:r>
+        <w:rPr>
+          <w:rFonts w:ascii="Roboto Condensed Light" w:hAnsi="Roboto Condensed Light"/>
+          <w:b w:val="0"/>
+          <w:color w:val="2A324B"/>
+          <w:sz w:val="22"/>
+        </w:rPr>
+        <w:t>Uzupełnij dane klienta (nazwa firmy jest wymagana) i wybierz program (nazwa programu jest wymagana).</w:t>
+      </w:r>
+    </w:p>
+    <w:p>
+      <w:pPr>
+        <w:jc w:val="both"/>
+        <w:spacing w:after="80" w:before="0"/>
+        <w:ind w:left="360" w:hanging="360"/>
+      </w:pPr>
+      <w:r>
+        <w:rPr>
+          <w:rFonts w:ascii="Roboto Condensed Light" w:hAnsi="Roboto Condensed Light"/>
+          <w:b w:val="0"/>
+          <w:color w:val="2A324B"/>
+          <w:sz w:val="22"/>
+        </w:rPr>
+        <w:t xml:space="preserve">4. </w:t>
+      </w:r>
+      <w:r>
+        <w:rPr>
+          <w:rFonts w:ascii="Roboto Condensed Light" w:hAnsi="Roboto Condensed Light"/>
+          <w:b w:val="0"/>
+          <w:color w:val="2A324B"/>
+          <w:sz w:val="22"/>
+        </w:rPr>
+        <w:t>Wpisz wartość projektu i ustaw intensywność. Cennik przeliczy się automatycznie. Zaznacz oferowane warianty i wskaż rekomendowany.</w:t>
+      </w:r>
+    </w:p>
+    <w:p>
+      <w:pPr>
+        <w:jc w:val="both"/>
+        <w:spacing w:after="80" w:before="0"/>
+        <w:ind w:left="360" w:hanging="360"/>
+      </w:pPr>
+      <w:r>
+        <w:rPr>
+          <w:rFonts w:ascii="Roboto Condensed Light" w:hAnsi="Roboto Condensed Light"/>
+          <w:b w:val="0"/>
+          <w:color w:val="2A324B"/>
+          <w:sz w:val="22"/>
+        </w:rPr>
+        <w:t xml:space="preserve">5. </w:t>
+      </w:r>
+      <w:r>
+        <w:rPr>
+          <w:rFonts w:ascii="Roboto Condensed Light" w:hAnsi="Roboto Condensed Light"/>
+          <w:b w:val="0"/>
+          <w:color w:val="2A324B"/>
+          <w:sz w:val="22"/>
+        </w:rPr>
+        <w:t>Opcjonalnie dostosuj treści, wybierz osobę kontaktową i case study.</w:t>
+      </w:r>
+    </w:p>
+    <w:p>
+      <w:pPr>
+        <w:jc w:val="both"/>
+        <w:spacing w:after="80" w:before="0"/>
+        <w:ind w:left="360" w:hanging="360"/>
+      </w:pPr>
+      <w:r>
+        <w:rPr>
+          <w:rFonts w:ascii="Roboto Condensed Light" w:hAnsi="Roboto Condensed Light"/>
+          <w:b w:val="0"/>
+          <w:color w:val="2A324B"/>
+          <w:sz w:val="22"/>
+        </w:rPr>
+        <w:t xml:space="preserve">6. </w:t>
+      </w:r>
+      <w:r>
+        <w:rPr>
+          <w:rFonts w:ascii="Roboto Condensed Light" w:hAnsi="Roboto Condensed Light"/>
+          <w:b w:val="0"/>
+          <w:color w:val="2A324B"/>
+          <w:sz w:val="22"/>
+        </w:rPr>
+        <w:t>Kliknij Stwórz ofertę. Powstanie wersja robocza. Sprawdź wygląd przyciskiem Podgląd.</w:t>
+      </w:r>
+    </w:p>
+    <w:p>
+      <w:pPr>
+        <w:jc w:val="both"/>
+        <w:spacing w:after="280" w:before="0"/>
+        <w:ind w:left="360" w:hanging="360"/>
+      </w:pPr>
+      <w:r>
+        <w:rPr>
+          <w:rFonts w:ascii="Roboto Condensed Light" w:hAnsi="Roboto Condensed Light"/>
+          <w:b w:val="0"/>
+          <w:color w:val="2A324B"/>
+          <w:sz w:val="22"/>
+        </w:rPr>
+        <w:t xml:space="preserve">7. </w:t>
+      </w:r>
+      <w:r>
+        <w:rPr>
+          <w:rFonts w:ascii="Roboto Condensed Light" w:hAnsi="Roboto Condensed Light"/>
+          <w:b w:val="0"/>
+          <w:color w:val="2A324B"/>
+          <w:sz w:val="22"/>
+        </w:rPr>
+        <w:t>Kliknij Wyślij ofertę i podaj adres email klienta. Klient dostanie link, a Ty śledzisz otwarcia w zakładce Aktywność.</w:t>
+      </w:r>
+    </w:p>
+    <w:p>
+      <w:pPr>
+        <w:jc w:val="both"/>
+        <w:spacing w:after="120" w:before="0"/>
+      </w:pPr>
+      <w:r>
+        <w:rPr>
+          <w:rFonts w:ascii="Roboto Condensed" w:hAnsi="Roboto Condensed"/>
+          <w:b/>
+          <w:color w:val="CE181A"/>
+          <w:sz w:val="22"/>
+        </w:rPr>
+        <w:t xml:space="preserve">Uwaga: </w:t>
+      </w:r>
+      <w:r>
+        <w:rPr>
+          <w:rFonts w:ascii="Roboto Condensed Light" w:hAnsi="Roboto Condensed Light"/>
+          <w:b w:val="0"/>
+          <w:color w:val="2A324B"/>
+          <w:sz w:val="22"/>
+        </w:rPr>
+        <w:t>Minimalny zestaw wymaganych pól to nazwa firmy, nazwa programu i wartość projektu. Resztę możesz zostawić na wartościach domyślnych.</w:t>
+      </w:r>
+    </w:p>
+    <w:p>
+      <w:pPr>
+        <w:jc w:val="left"/>
+        <w:spacing w:before="160" w:after="40"/>
+      </w:pPr>
+      <w:r>
+        <w:rPr>
+          <w:rFonts w:ascii="Roboto Condensed" w:hAnsi="Roboto Condensed"/>
+          <w:b w:val="0"/>
+          <w:color w:val="2A324B"/>
+          <w:sz w:val="36"/>
+        </w:rPr>
+        <w:t>Mapa panelu (struktura systemu)</w:t>
+      </w:r>
+    </w:p>
+    <w:p>
+      <w:pPr>
+        <w:jc w:val="both"/>
+        <w:spacing w:after="120" w:before="0"/>
+      </w:pPr>
+      <w:r>
+        <w:rPr>
+          <w:rFonts w:ascii="Roboto Condensed Light" w:hAnsi="Roboto Condensed Light"/>
+          <w:b w:val="0"/>
+          <w:color w:val="2A324B"/>
+          <w:sz w:val="22"/>
+        </w:rPr>
+        <w:t>Diagram pokazuje, gdzie w panelu znajdziesz poszczególne funkcje. Moduły opisane jako super_admin są dostępne tylko dla właściciela systemu.</w:t>
+      </w:r>
+    </w:p>
+    <w:p>
+      <w:pPr>
+        <w:jc w:val="center"/>
+        <w:spacing w:before="80" w:after="160"/>
+      </w:pPr>
+      <w:r>
+        <w:drawing xmlns:a="http://schemas.openxmlformats.org/drawingml/2006/main" xmlns:pic="http://schemas.openxmlformats.org/drawingml/2006/picture">
+          <wp:inline distT="0" distB="0" distL="0" distR="0">
+            <wp:extent cx="5375529" cy="5440686"/>
+            <wp:effectExtent l="0" t="0" r="0" b="0"/>
+            <wp:docPr id="6995" name="StopkaK2"/>
+            <wp:cNvGraphicFramePr>
+              <a:graphicFrameLocks noChangeAspect="1"/>
+            </wp:cNvGraphicFramePr>
+            <a:graphic>
+              <a:graphicData uri="http://schemas.openxmlformats.org/drawingml/2006/picture">
+                <pic:pic>
+                  <pic:nvPicPr>
+                    <pic:cNvPr id="6995" name="StopkaK2"/>
+                    <pic:cNvPicPr/>
+                  </pic:nvPicPr>
+                  <pic:blipFill>
+                    <a:blip r:embed="rId9">
+                      <a:extLst>
+                        <a:ext uri="{96DAC541-7B7A-43D3-8B79-37D633B846F1}">
+                          <asvg:svgBlob xmlns:asvg="http://schemas.microsoft.com/office/drawing/2016/SVG/main" r:embed="rId9"/>
+                        </a:ext>
+                      </a:extLst>
+                    </a:blip>
+                    <a:stretch>
+                      <a:fillRect/>
+                    </a:stretch>
+                  </pic:blipFill>
+                  <pic:spPr>
+                    <a:xfrm>
+                      <a:off x="0" y="0"/>
+                      <a:ext cx="5375529" cy="5440686"/>
+                    </a:xfrm>
+                    <a:prstGeom prst="rect">
+                      <a:avLst/>
+                    </a:prstGeom>
+                  </pic:spPr>
+                </pic:pic>
+              </a:graphicData>
+            </a:graphic>
+          </wp:inline>
+        </w:drawing>
       </w:r>
     </w:p>
     <w:p>
@@ -7799,7 +8107,7 @@
       </w:r>
     </w:p>
     <w:sectPr>
-      <w:footerReference w:type="default" r:id="rId9"/>
+      <w:footerReference w:type="default" r:id="rId10"/>
       <w:pgSz w:w="12240" w:h="15840"/>
       <w:pgMar w:top="1417" w:right="1417" w:bottom="1701" w:left="1417" w:header="720" w:footer="720" w:gutter="0"/>
       <w:cols w:space="720"/>
@@ -7843,7 +8151,7 @@
               <wp:inline distT="0" distB="0" distL="0" distR="0">
                 <wp:extent cx="5465746" cy="131252"/>
                 <wp:effectExtent l="0" t="0" r="0" b="0"/>
-                <wp:docPr id="6688" name="StopkaK2"/>
+                <wp:docPr id="2594" name="StopkaK2"/>
                 <wp:cNvGraphicFramePr>
                   <a:graphicFrameLocks noChangeAspect="1"/>
                 </wp:cNvGraphicFramePr>
@@ -7851,7 +8159,7 @@
                   <a:graphicData uri="http://schemas.openxmlformats.org/drawingml/2006/picture">
                     <pic:pic>
                       <pic:nvPicPr>
-                        <pic:cNvPr id="6688" name="StopkaK2"/>
+                        <pic:cNvPr id="2594" name="StopkaK2"/>
                         <pic:cNvPicPr/>
                       </pic:nvPicPr>
                       <pic:blipFill>

</xml_diff>

<commit_message>
docs: dodaj rozdział „Szybki start" i mapę panelu (drzewo systemu) (#73)
- Szybki start: 7 kroków od logowania do wysłanej oferty + minimalne pola
- Mapa panelu: diagram SVG struktury /admin (Oferty, Katalogi, Ustawienia,
  Użytkownicy) w kolorach K2
Diakrytyka zweryfikowana (hunspell), typografia i stopka bez zmian.

Co-authored-by: Claude Opus 4.8 <noreply@anthropic.com>
</commit_message>
<xml_diff>
--- a/docs/K2Biznes_Oferta_-_instrukcja_i_architektura.docx
+++ b/docs/K2Biznes_Oferta_-_instrukcja_i_architektura.docx
@@ -89,6 +89,314 @@
           <w:sz w:val="22"/>
         </w:rPr>
         <w:t>Dokument ma dwie warstwy. Część I to praktyczna instrukcja dla konsultantów i administratorów tworzących oferty - krok po kroku, prostym językiem. Część II opisuje architekturę systemu dla zespołu technicznego. Kanonem wiedzy technicznej pozostają pliki w repozytorium: docs/BACKEND_SPEC.md oraz docs/TECH_ADMIN_MANUAL.md.</w:t>
+      </w:r>
+    </w:p>
+    <w:p>
+      <w:pPr>
+        <w:jc w:val="left"/>
+        <w:spacing w:before="160" w:after="40"/>
+      </w:pPr>
+      <w:r>
+        <w:rPr>
+          <w:rFonts w:ascii="Roboto Condensed" w:hAnsi="Roboto Condensed"/>
+          <w:b w:val="0"/>
+          <w:color w:val="2A324B"/>
+          <w:sz w:val="36"/>
+        </w:rPr>
+        <w:t>Szybki start - od zera do wysłanej oferty</w:t>
+      </w:r>
+    </w:p>
+    <w:p>
+      <w:pPr>
+        <w:jc w:val="both"/>
+        <w:spacing w:after="120" w:before="0"/>
+      </w:pPr>
+      <w:r>
+        <w:rPr>
+          <w:rFonts w:ascii="Roboto Condensed Light" w:hAnsi="Roboto Condensed Light"/>
+          <w:b w:val="0"/>
+          <w:color w:val="2A324B"/>
+          <w:sz w:val="22"/>
+        </w:rPr>
+        <w:t>Najkrótsza droga do wysłania pierwszej oferty. Szczegóły każdego kroku opisuje Część I.</w:t>
+      </w:r>
+    </w:p>
+    <w:p>
+      <w:pPr>
+        <w:jc w:val="both"/>
+        <w:spacing w:after="80" w:before="0"/>
+        <w:ind w:left="360" w:hanging="360"/>
+      </w:pPr>
+      <w:r>
+        <w:rPr>
+          <w:rFonts w:ascii="Roboto Condensed Light" w:hAnsi="Roboto Condensed Light"/>
+          <w:b w:val="0"/>
+          <w:color w:val="2A324B"/>
+          <w:sz w:val="22"/>
+        </w:rPr>
+        <w:t xml:space="preserve">1. </w:t>
+      </w:r>
+      <w:r>
+        <w:rPr>
+          <w:rFonts w:ascii="Roboto Condensed Light" w:hAnsi="Roboto Condensed Light"/>
+          <w:b w:val="0"/>
+          <w:color w:val="2A324B"/>
+          <w:sz w:val="22"/>
+        </w:rPr>
+        <w:t>Zaloguj się na /auth/signin. Przy pierwszym logowaniu jako administrator skonfiguruj weryfikację dwuetapową.</w:t>
+      </w:r>
+    </w:p>
+    <w:p>
+      <w:pPr>
+        <w:jc w:val="both"/>
+        <w:spacing w:after="80" w:before="0"/>
+        <w:ind w:left="360" w:hanging="360"/>
+      </w:pPr>
+      <w:r>
+        <w:rPr>
+          <w:rFonts w:ascii="Roboto Condensed Light" w:hAnsi="Roboto Condensed Light"/>
+          <w:b w:val="0"/>
+          <w:color w:val="2A324B"/>
+          <w:sz w:val="22"/>
+        </w:rPr>
+        <w:t xml:space="preserve">2. </w:t>
+      </w:r>
+      <w:r>
+        <w:rPr>
+          <w:rFonts w:ascii="Roboto Condensed Light" w:hAnsi="Roboto Condensed Light"/>
+          <w:b w:val="0"/>
+          <w:color w:val="2A324B"/>
+          <w:sz w:val="22"/>
+        </w:rPr>
+        <w:t>Wejdź w Oferty i kliknij Nowa oferta.</w:t>
+      </w:r>
+    </w:p>
+    <w:p>
+      <w:pPr>
+        <w:jc w:val="both"/>
+        <w:spacing w:after="80" w:before="0"/>
+        <w:ind w:left="360" w:hanging="360"/>
+      </w:pPr>
+      <w:r>
+        <w:rPr>
+          <w:rFonts w:ascii="Roboto Condensed Light" w:hAnsi="Roboto Condensed Light"/>
+          <w:b w:val="0"/>
+          <w:color w:val="2A324B"/>
+          <w:sz w:val="22"/>
+        </w:rPr>
+        <w:t xml:space="preserve">3. </w:t>
+      </w:r>
+      <w:r>
+        <w:rPr>
+          <w:rFonts w:ascii="Roboto Condensed Light" w:hAnsi="Roboto Condensed Light"/>
+          <w:b w:val="0"/>
+          <w:color w:val="2A324B"/>
+          <w:sz w:val="22"/>
+        </w:rPr>
+        <w:t>Uzupełnij dane klienta (nazwa firmy jest wymagana) i wybierz program (nazwa programu jest wymagana).</w:t>
+      </w:r>
+    </w:p>
+    <w:p>
+      <w:pPr>
+        <w:jc w:val="both"/>
+        <w:spacing w:after="80" w:before="0"/>
+        <w:ind w:left="360" w:hanging="360"/>
+      </w:pPr>
+      <w:r>
+        <w:rPr>
+          <w:rFonts w:ascii="Roboto Condensed Light" w:hAnsi="Roboto Condensed Light"/>
+          <w:b w:val="0"/>
+          <w:color w:val="2A324B"/>
+          <w:sz w:val="22"/>
+        </w:rPr>
+        <w:t xml:space="preserve">4. </w:t>
+      </w:r>
+      <w:r>
+        <w:rPr>
+          <w:rFonts w:ascii="Roboto Condensed Light" w:hAnsi="Roboto Condensed Light"/>
+          <w:b w:val="0"/>
+          <w:color w:val="2A324B"/>
+          <w:sz w:val="22"/>
+        </w:rPr>
+        <w:t>Wpisz wartość projektu i ustaw intensywność. Cennik przeliczy się automatycznie. Zaznacz oferowane warianty i wskaż rekomendowany.</w:t>
+      </w:r>
+    </w:p>
+    <w:p>
+      <w:pPr>
+        <w:jc w:val="both"/>
+        <w:spacing w:after="80" w:before="0"/>
+        <w:ind w:left="360" w:hanging="360"/>
+      </w:pPr>
+      <w:r>
+        <w:rPr>
+          <w:rFonts w:ascii="Roboto Condensed Light" w:hAnsi="Roboto Condensed Light"/>
+          <w:b w:val="0"/>
+          <w:color w:val="2A324B"/>
+          <w:sz w:val="22"/>
+        </w:rPr>
+        <w:t xml:space="preserve">5. </w:t>
+      </w:r>
+      <w:r>
+        <w:rPr>
+          <w:rFonts w:ascii="Roboto Condensed Light" w:hAnsi="Roboto Condensed Light"/>
+          <w:b w:val="0"/>
+          <w:color w:val="2A324B"/>
+          <w:sz w:val="22"/>
+        </w:rPr>
+        <w:t>Opcjonalnie dostosuj treści, wybierz osobę kontaktową i case study.</w:t>
+      </w:r>
+    </w:p>
+    <w:p>
+      <w:pPr>
+        <w:jc w:val="both"/>
+        <w:spacing w:after="80" w:before="0"/>
+        <w:ind w:left="360" w:hanging="360"/>
+      </w:pPr>
+      <w:r>
+        <w:rPr>
+          <w:rFonts w:ascii="Roboto Condensed Light" w:hAnsi="Roboto Condensed Light"/>
+          <w:b w:val="0"/>
+          <w:color w:val="2A324B"/>
+          <w:sz w:val="22"/>
+        </w:rPr>
+        <w:t xml:space="preserve">6. </w:t>
+      </w:r>
+      <w:r>
+        <w:rPr>
+          <w:rFonts w:ascii="Roboto Condensed Light" w:hAnsi="Roboto Condensed Light"/>
+          <w:b w:val="0"/>
+          <w:color w:val="2A324B"/>
+          <w:sz w:val="22"/>
+        </w:rPr>
+        <w:t>Kliknij Stwórz ofertę. Powstanie wersja robocza. Sprawdź wygląd przyciskiem Podgląd.</w:t>
+      </w:r>
+    </w:p>
+    <w:p>
+      <w:pPr>
+        <w:jc w:val="both"/>
+        <w:spacing w:after="280" w:before="0"/>
+        <w:ind w:left="360" w:hanging="360"/>
+      </w:pPr>
+      <w:r>
+        <w:rPr>
+          <w:rFonts w:ascii="Roboto Condensed Light" w:hAnsi="Roboto Condensed Light"/>
+          <w:b w:val="0"/>
+          <w:color w:val="2A324B"/>
+          <w:sz w:val="22"/>
+        </w:rPr>
+        <w:t xml:space="preserve">7. </w:t>
+      </w:r>
+      <w:r>
+        <w:rPr>
+          <w:rFonts w:ascii="Roboto Condensed Light" w:hAnsi="Roboto Condensed Light"/>
+          <w:b w:val="0"/>
+          <w:color w:val="2A324B"/>
+          <w:sz w:val="22"/>
+        </w:rPr>
+        <w:t>Kliknij Wyślij ofertę i podaj adres email klienta. Klient dostanie link, a Ty śledzisz otwarcia w zakładce Aktywność.</w:t>
+      </w:r>
+    </w:p>
+    <w:p>
+      <w:pPr>
+        <w:jc w:val="both"/>
+        <w:spacing w:after="120" w:before="0"/>
+      </w:pPr>
+      <w:r>
+        <w:rPr>
+          <w:rFonts w:ascii="Roboto Condensed" w:hAnsi="Roboto Condensed"/>
+          <w:b/>
+          <w:color w:val="CE181A"/>
+          <w:sz w:val="22"/>
+        </w:rPr>
+        <w:t xml:space="preserve">Uwaga: </w:t>
+      </w:r>
+      <w:r>
+        <w:rPr>
+          <w:rFonts w:ascii="Roboto Condensed Light" w:hAnsi="Roboto Condensed Light"/>
+          <w:b w:val="0"/>
+          <w:color w:val="2A324B"/>
+          <w:sz w:val="22"/>
+        </w:rPr>
+        <w:t>Minimalny zestaw wymaganych pól to nazwa firmy, nazwa programu i wartość projektu. Resztę możesz zostawić na wartościach domyślnych.</w:t>
+      </w:r>
+    </w:p>
+    <w:p>
+      <w:pPr>
+        <w:jc w:val="left"/>
+        <w:spacing w:before="160" w:after="40"/>
+      </w:pPr>
+      <w:r>
+        <w:rPr>
+          <w:rFonts w:ascii="Roboto Condensed" w:hAnsi="Roboto Condensed"/>
+          <w:b w:val="0"/>
+          <w:color w:val="2A324B"/>
+          <w:sz w:val="36"/>
+        </w:rPr>
+        <w:t>Mapa panelu (struktura systemu)</w:t>
+      </w:r>
+    </w:p>
+    <w:p>
+      <w:pPr>
+        <w:jc w:val="both"/>
+        <w:spacing w:after="120" w:before="0"/>
+      </w:pPr>
+      <w:r>
+        <w:rPr>
+          <w:rFonts w:ascii="Roboto Condensed Light" w:hAnsi="Roboto Condensed Light"/>
+          <w:b w:val="0"/>
+          <w:color w:val="2A324B"/>
+          <w:sz w:val="22"/>
+        </w:rPr>
+        <w:t>Diagram pokazuje, gdzie w panelu znajdziesz poszczególne funkcje. Moduły opisane jako super_admin są dostępne tylko dla właściciela systemu.</w:t>
+      </w:r>
+    </w:p>
+    <w:p>
+      <w:pPr>
+        <w:jc w:val="center"/>
+        <w:spacing w:before="80" w:after="160"/>
+      </w:pPr>
+      <w:r>
+        <w:drawing xmlns:a="http://schemas.openxmlformats.org/drawingml/2006/main" xmlns:pic="http://schemas.openxmlformats.org/drawingml/2006/picture">
+          <wp:inline distT="0" distB="0" distL="0" distR="0">
+            <wp:extent cx="5375529" cy="5440686"/>
+            <wp:effectExtent l="0" t="0" r="0" b="0"/>
+            <wp:docPr id="6995" name="StopkaK2"/>
+            <wp:cNvGraphicFramePr>
+              <a:graphicFrameLocks noChangeAspect="1"/>
+            </wp:cNvGraphicFramePr>
+            <a:graphic>
+              <a:graphicData uri="http://schemas.openxmlformats.org/drawingml/2006/picture">
+                <pic:pic>
+                  <pic:nvPicPr>
+                    <pic:cNvPr id="6995" name="StopkaK2"/>
+                    <pic:cNvPicPr/>
+                  </pic:nvPicPr>
+                  <pic:blipFill>
+                    <a:blip r:embed="rId9">
+                      <a:extLst>
+                        <a:ext uri="{96DAC541-7B7A-43D3-8B79-37D633B846F1}">
+                          <asvg:svgBlob xmlns:asvg="http://schemas.microsoft.com/office/drawing/2016/SVG/main" r:embed="rId9"/>
+                        </a:ext>
+                      </a:extLst>
+                    </a:blip>
+                    <a:stretch>
+                      <a:fillRect/>
+                    </a:stretch>
+                  </pic:blipFill>
+                  <pic:spPr>
+                    <a:xfrm>
+                      <a:off x="0" y="0"/>
+                      <a:ext cx="5375529" cy="5440686"/>
+                    </a:xfrm>
+                    <a:prstGeom prst="rect">
+                      <a:avLst/>
+                    </a:prstGeom>
+                  </pic:spPr>
+                </pic:pic>
+              </a:graphicData>
+            </a:graphic>
+          </wp:inline>
+        </w:drawing>
       </w:r>
     </w:p>
     <w:p>
@@ -7799,7 +8107,7 @@
       </w:r>
     </w:p>
     <w:sectPr>
-      <w:footerReference w:type="default" r:id="rId9"/>
+      <w:footerReference w:type="default" r:id="rId10"/>
       <w:pgSz w:w="12240" w:h="15840"/>
       <w:pgMar w:top="1417" w:right="1417" w:bottom="1701" w:left="1417" w:header="720" w:footer="720" w:gutter="0"/>
       <w:cols w:space="720"/>
@@ -7843,7 +8151,7 @@
               <wp:inline distT="0" distB="0" distL="0" distR="0">
                 <wp:extent cx="5465746" cy="131252"/>
                 <wp:effectExtent l="0" t="0" r="0" b="0"/>
-                <wp:docPr id="6688" name="StopkaK2"/>
+                <wp:docPr id="2594" name="StopkaK2"/>
                 <wp:cNvGraphicFramePr>
                   <a:graphicFrameLocks noChangeAspect="1"/>
                 </wp:cNvGraphicFramePr>
@@ -7851,7 +8159,7 @@
                   <a:graphicData uri="http://schemas.openxmlformats.org/drawingml/2006/picture">
                     <pic:pic>
                       <pic:nvPicPr>
-                        <pic:cNvPr id="6688" name="StopkaK2"/>
+                        <pic:cNvPr id="2594" name="StopkaK2"/>
                         <pic:cNvPicPr/>
                       </pic:nvPicPr>
                       <pic:blipFill>

</xml_diff>

<commit_message>
docs: aktualizacja README + instrukcji .docx po pilotazu UX (PR #75-#80)
README: sekcja "Model oferty i katalogow" (nowa struktura sekcji 01/02,
scalenie katalogow w biblioteke programow wsparcia, link case study,
kolejnosc pol = kolejnosc sekcji), status PR #1-#80, link do instrukcji .docx.

Instrukcja .docx (edycja tresci w miejscu, standard K2 nietkniety):
- 3.2 "Program dotacyjny" -> "Programy wsparcia" (lista + rekomendowany)
- 3.6 Tresc: 2-kolumnowa diagnoza (sek. 01), zalozenia, bez intro/footer/programReason
- Case study: opcjonalny link "Zobacz pelny opis projektu"
- Sekcje 01/02 klienta zaktualizowane; katalog "Programy" wygaszony
- Szybki start + wymagane pola dopasowane do nowego modelu

Co-Authored-By: Claude Opus 4.8 <noreply@anthropic.com>
</commit_message>
<xml_diff>
--- a/docs/K2Biznes_Oferta_-_instrukcja_i_architektura.docx
+++ b/docs/K2Biznes_Oferta_-_instrukcja_i_architektura.docx
@@ -184,16 +184,7 @@
           <w:color w:val="2A324B"/>
           <w:sz w:val="22"/>
         </w:rPr>
-        <w:t xml:space="preserve">3. </w:t>
-      </w:r>
-      <w:r>
-        <w:rPr>
-          <w:rFonts w:ascii="Roboto Condensed Light" w:hAnsi="Roboto Condensed Light"/>
-          <w:b w:val="0"/>
-          <w:color w:val="2A324B"/>
-          <w:sz w:val="22"/>
-        </w:rPr>
-        <w:t>Uzupełnij dane klienta (nazwa firmy jest wymagana) i wybierz program (nazwa programu jest wymagana).</w:t>
+        <w:t>3. Uzupełnij dane klienta (nazwa firmy jest wymagana). W sekcji „Programy wsparcia” dodaj z biblioteki program, który rekomendujesz, i zaznacz go jako rekomendowany - trafi do sekcji 02 oferty.</w:t>
       </w:r>
     </w:p>
     <w:p>
@@ -308,16 +299,7 @@
           <w:color w:val="CE181A"/>
           <w:sz w:val="22"/>
         </w:rPr>
-        <w:t xml:space="preserve">Uwaga: </w:t>
-      </w:r>
-      <w:r>
-        <w:rPr>
-          <w:rFonts w:ascii="Roboto Condensed Light" w:hAnsi="Roboto Condensed Light"/>
-          <w:b w:val="0"/>
-          <w:color w:val="2A324B"/>
-          <w:sz w:val="22"/>
-        </w:rPr>
-        <w:t>Minimalny zestaw wymaganych pól to nazwa firmy, nazwa programu i wartość projektu. Resztę możesz zostawić na wartościach domyślnych.</w:t>
+        <w:t>Uwaga: Minimalny zestaw wymaganych pól to nazwa firmy, wartość projektu oraz jeden program wsparcia oznaczony jako rekomendowany. Pozostałe pola można uzupełnić później.</w:t>
       </w:r>
     </w:p>
     <w:p>
@@ -630,7 +612,7 @@
           <w:color w:val="2A324B"/>
           <w:sz w:val="22"/>
         </w:rPr>
-        <w:t>Formularz jest podzielony na sekcje wypełniane od góry do dołu. Pola oznaczone gwiazdką są wymagane, pozostałe są opcjonalne i mają wartości domyślne. W trybie tworzenia nowej oferty, jeśli istnieją zapisane szablony, u góry pojawia się pole Zacznij od szablonu, które wypełnia wszystko poza danymi klienta.</w:t>
+        <w:t>Formularz jest podzielony na sekcje wypełniane od góry do dołu; ich kolejność odpowiada kolejności sekcji w gotowej ofercie. Pola oznaczone gwiazdką są wymagane, reszta jest opcjonalna.</w:t>
       </w:r>
     </w:p>
     <w:p>
@@ -1294,7 +1276,7 @@
           <w:color w:val="2A324B"/>
           <w:sz w:val="28"/>
         </w:rPr>
-        <w:t>3.2 Program dotacyjny</w:t>
+        <w:t>3.2 Programy wsparcia</w:t>
       </w:r>
     </w:p>
     <w:tbl>
@@ -1423,7 +1405,179 @@
                 <w:color w:val="2A324B"/>
                 <w:sz w:val="20"/>
               </w:rPr>
-              <w:t>Wybierz z katalogu</w:t>
+              <w:t>Programy wsparcia (biblioteka)</w:t>
+            </w:r>
+          </w:p>
+        </w:tc>
+        <w:tc>
+          <w:tcPr>
+            <w:tcW w:type="dxa" w:w="1504"/>
+            <w:tcBorders>
+              <w:top w:val="single" w:sz="4" w:color="CCCCCC"/>
+              <w:left w:val="single" w:sz="4" w:color="CCCCCC"/>
+              <w:bottom w:val="single" w:sz="4" w:color="CCCCCC"/>
+              <w:right w:val="single" w:sz="4" w:color="CCCCCC"/>
+              <w:insideH w:val="single" w:sz="4" w:color="CCCCCC"/>
+              <w:insideV w:val="single" w:sz="4" w:color="CCCCCC"/>
+            </w:tcBorders>
+          </w:tcPr>
+          <w:p>
+            <w:pPr>
+              <w:jc w:val="both"/>
+              <w:spacing w:after="20" w:before="20"/>
+            </w:pPr>
+            <w:r>
+              <w:rPr>
+                <w:rFonts w:ascii="Roboto Condensed Light" w:hAnsi="Roboto Condensed Light"/>
+                <w:b w:val="0"/>
+                <w:color w:val="2A324B"/>
+                <w:sz w:val="20"/>
+              </w:rPr>
+              <w:t>Tak</w:t>
+            </w:r>
+          </w:p>
+        </w:tc>
+        <w:tc>
+          <w:tcPr>
+            <w:tcW w:type="dxa" w:w="5455"/>
+            <w:tcBorders>
+              <w:top w:val="single" w:sz="4" w:color="CCCCCC"/>
+              <w:left w:val="single" w:sz="4" w:color="CCCCCC"/>
+              <w:bottom w:val="single" w:sz="4" w:color="CCCCCC"/>
+              <w:right w:val="single" w:sz="4" w:color="CCCCCC"/>
+              <w:insideH w:val="single" w:sz="4" w:color="CCCCCC"/>
+              <w:insideV w:val="single" w:sz="4" w:color="CCCCCC"/>
+            </w:tcBorders>
+          </w:tcPr>
+          <w:p>
+            <w:pPr>
+              <w:jc w:val="both"/>
+              <w:spacing w:after="20" w:before="20"/>
+            </w:pPr>
+            <w:r>
+              <w:rPr>
+                <w:rFonts w:ascii="Roboto Condensed Light" w:hAnsi="Roboto Condensed Light"/>
+                <w:b w:val="0"/>
+                <w:color w:val="2A324B"/>
+                <w:sz w:val="20"/>
+              </w:rPr>
+              <w:t>Rozwijana lista z katalogu programów wsparcia. Dodane pozycje tworzą listę; każdą można usunąć.</w:t>
+            </w:r>
+          </w:p>
+        </w:tc>
+      </w:tr>
+      <w:tr>
+        <w:tc>
+          <w:tcPr>
+            <w:tcW w:type="dxa" w:w="2445"/>
+            <w:tcBorders>
+              <w:top w:val="single" w:sz="4" w:color="CCCCCC"/>
+              <w:left w:val="single" w:sz="4" w:color="CCCCCC"/>
+              <w:bottom w:val="single" w:sz="4" w:color="CCCCCC"/>
+              <w:right w:val="single" w:sz="4" w:color="CCCCCC"/>
+              <w:insideH w:val="single" w:sz="4" w:color="CCCCCC"/>
+              <w:insideV w:val="single" w:sz="4" w:color="CCCCCC"/>
+            </w:tcBorders>
+          </w:tcPr>
+          <w:p>
+            <w:pPr>
+              <w:jc w:val="left"/>
+              <w:spacing w:after="20" w:before="20"/>
+            </w:pPr>
+            <w:r>
+              <w:rPr>
+                <w:rFonts w:ascii="Roboto Condensed Light" w:hAnsi="Roboto Condensed Light"/>
+                <w:b/>
+                <w:color w:val="2A324B"/>
+                <w:sz w:val="20"/>
+              </w:rPr>
+              <w:t>Rekomendowany</w:t>
+            </w:r>
+          </w:p>
+        </w:tc>
+        <w:tc>
+          <w:tcPr>
+            <w:tcW w:type="dxa" w:w="1504"/>
+            <w:tcBorders>
+              <w:top w:val="single" w:sz="4" w:color="CCCCCC"/>
+              <w:left w:val="single" w:sz="4" w:color="CCCCCC"/>
+              <w:bottom w:val="single" w:sz="4" w:color="CCCCCC"/>
+              <w:right w:val="single" w:sz="4" w:color="CCCCCC"/>
+              <w:insideH w:val="single" w:sz="4" w:color="CCCCCC"/>
+              <w:insideV w:val="single" w:sz="4" w:color="CCCCCC"/>
+            </w:tcBorders>
+          </w:tcPr>
+          <w:p>
+            <w:pPr>
+              <w:jc w:val="both"/>
+              <w:spacing w:after="20" w:before="20"/>
+            </w:pPr>
+            <w:r>
+              <w:rPr>
+                <w:rFonts w:ascii="Roboto Condensed Light" w:hAnsi="Roboto Condensed Light"/>
+                <w:b w:val="0"/>
+                <w:color w:val="2A324B"/>
+                <w:sz w:val="20"/>
+              </w:rPr>
+              <w:t>Tak</w:t>
+            </w:r>
+          </w:p>
+        </w:tc>
+        <w:tc>
+          <w:tcPr>
+            <w:tcW w:type="dxa" w:w="5455"/>
+            <w:tcBorders>
+              <w:top w:val="single" w:sz="4" w:color="CCCCCC"/>
+              <w:left w:val="single" w:sz="4" w:color="CCCCCC"/>
+              <w:bottom w:val="single" w:sz="4" w:color="CCCCCC"/>
+              <w:right w:val="single" w:sz="4" w:color="CCCCCC"/>
+              <w:insideH w:val="single" w:sz="4" w:color="CCCCCC"/>
+              <w:insideV w:val="single" w:sz="4" w:color="CCCCCC"/>
+            </w:tcBorders>
+          </w:tcPr>
+          <w:p>
+            <w:pPr>
+              <w:jc w:val="both"/>
+              <w:spacing w:after="20" w:before="20"/>
+            </w:pPr>
+            <w:r>
+              <w:rPr>
+                <w:rFonts w:ascii="Roboto Condensed Light" w:hAnsi="Roboto Condensed Light"/>
+                <w:b w:val="0"/>
+                <w:color w:val="2A324B"/>
+                <w:sz w:val="20"/>
+              </w:rPr>
+              <w:t>Znacznik przy jednej pozycji. Rekomendowany program pojawia się w sekcji 02 jako wyróżniony kafelek. Wymagany co najmniej jeden.</w:t>
+            </w:r>
+          </w:p>
+        </w:tc>
+      </w:tr>
+      <w:tr>
+        <w:tc>
+          <w:tcPr>
+            <w:tcW w:type="dxa" w:w="2445"/>
+            <w:tcBorders>
+              <w:top w:val="single" w:sz="4" w:color="CCCCCC"/>
+              <w:left w:val="single" w:sz="4" w:color="CCCCCC"/>
+              <w:bottom w:val="single" w:sz="4" w:color="CCCCCC"/>
+              <w:right w:val="single" w:sz="4" w:color="CCCCCC"/>
+              <w:insideH w:val="single" w:sz="4" w:color="CCCCCC"/>
+              <w:insideV w:val="single" w:sz="4" w:color="CCCCCC"/>
+            </w:tcBorders>
+          </w:tcPr>
+          <w:p>
+            <w:pPr>
+              <w:jc w:val="left"/>
+              <w:spacing w:after="20" w:before="20"/>
+            </w:pPr>
+            <w:r>
+              <w:rPr>
+                <w:rFonts w:ascii="Roboto Condensed Light" w:hAnsi="Roboto Condensed Light"/>
+                <w:b/>
+                <w:color w:val="2A324B"/>
+                <w:sz w:val="20"/>
+              </w:rPr>
+              <w:t>Nazwa, termin, opis</w:t>
             </w:r>
           </w:p>
         </w:tc>
@@ -1479,179 +1633,7 @@
                 <w:color w:val="2A324B"/>
                 <w:sz w:val="20"/>
               </w:rPr>
-              <w:t>Lista programów pogrupowana tematycznie. Wybór uzupełnia automatycznie nazwę programu.</w:t>
-            </w:r>
-          </w:p>
-        </w:tc>
-      </w:tr>
-      <w:tr>
-        <w:tc>
-          <w:tcPr>
-            <w:tcW w:type="dxa" w:w="2445"/>
-            <w:tcBorders>
-              <w:top w:val="single" w:sz="4" w:color="CCCCCC"/>
-              <w:left w:val="single" w:sz="4" w:color="CCCCCC"/>
-              <w:bottom w:val="single" w:sz="4" w:color="CCCCCC"/>
-              <w:right w:val="single" w:sz="4" w:color="CCCCCC"/>
-              <w:insideH w:val="single" w:sz="4" w:color="CCCCCC"/>
-              <w:insideV w:val="single" w:sz="4" w:color="CCCCCC"/>
-            </w:tcBorders>
-          </w:tcPr>
-          <w:p>
-            <w:pPr>
-              <w:jc w:val="left"/>
-              <w:spacing w:after="20" w:before="20"/>
-            </w:pPr>
-            <w:r>
-              <w:rPr>
-                <w:rFonts w:ascii="Roboto Condensed Light" w:hAnsi="Roboto Condensed Light"/>
-                <w:b/>
-                <w:color w:val="2A324B"/>
-                <w:sz w:val="20"/>
-              </w:rPr>
-              <w:t>Nazwa programu</w:t>
-            </w:r>
-          </w:p>
-        </w:tc>
-        <w:tc>
-          <w:tcPr>
-            <w:tcW w:type="dxa" w:w="1504"/>
-            <w:tcBorders>
-              <w:top w:val="single" w:sz="4" w:color="CCCCCC"/>
-              <w:left w:val="single" w:sz="4" w:color="CCCCCC"/>
-              <w:bottom w:val="single" w:sz="4" w:color="CCCCCC"/>
-              <w:right w:val="single" w:sz="4" w:color="CCCCCC"/>
-              <w:insideH w:val="single" w:sz="4" w:color="CCCCCC"/>
-              <w:insideV w:val="single" w:sz="4" w:color="CCCCCC"/>
-            </w:tcBorders>
-          </w:tcPr>
-          <w:p>
-            <w:pPr>
-              <w:jc w:val="both"/>
-              <w:spacing w:after="20" w:before="20"/>
-            </w:pPr>
-            <w:r>
-              <w:rPr>
-                <w:rFonts w:ascii="Roboto Condensed Light" w:hAnsi="Roboto Condensed Light"/>
-                <w:b w:val="0"/>
-                <w:color w:val="2A324B"/>
-                <w:sz w:val="20"/>
-              </w:rPr>
-              <w:t>Tak</w:t>
-            </w:r>
-          </w:p>
-        </w:tc>
-        <w:tc>
-          <w:tcPr>
-            <w:tcW w:type="dxa" w:w="5455"/>
-            <w:tcBorders>
-              <w:top w:val="single" w:sz="4" w:color="CCCCCC"/>
-              <w:left w:val="single" w:sz="4" w:color="CCCCCC"/>
-              <w:bottom w:val="single" w:sz="4" w:color="CCCCCC"/>
-              <w:right w:val="single" w:sz="4" w:color="CCCCCC"/>
-              <w:insideH w:val="single" w:sz="4" w:color="CCCCCC"/>
-              <w:insideV w:val="single" w:sz="4" w:color="CCCCCC"/>
-            </w:tcBorders>
-          </w:tcPr>
-          <w:p>
-            <w:pPr>
-              <w:jc w:val="both"/>
-              <w:spacing w:after="20" w:before="20"/>
-            </w:pPr>
-            <w:r>
-              <w:rPr>
-                <w:rFonts w:ascii="Roboto Condensed Light" w:hAnsi="Roboto Condensed Light"/>
-                <w:b w:val="0"/>
-                <w:color w:val="2A324B"/>
-                <w:sz w:val="20"/>
-              </w:rPr>
-              <w:t>Etykieta programu widoczna w ofercie.</w:t>
-            </w:r>
-          </w:p>
-        </w:tc>
-      </w:tr>
-      <w:tr>
-        <w:tc>
-          <w:tcPr>
-            <w:tcW w:type="dxa" w:w="2445"/>
-            <w:tcBorders>
-              <w:top w:val="single" w:sz="4" w:color="CCCCCC"/>
-              <w:left w:val="single" w:sz="4" w:color="CCCCCC"/>
-              <w:bottom w:val="single" w:sz="4" w:color="CCCCCC"/>
-              <w:right w:val="single" w:sz="4" w:color="CCCCCC"/>
-              <w:insideH w:val="single" w:sz="4" w:color="CCCCCC"/>
-              <w:insideV w:val="single" w:sz="4" w:color="CCCCCC"/>
-            </w:tcBorders>
-          </w:tcPr>
-          <w:p>
-            <w:pPr>
-              <w:jc w:val="left"/>
-              <w:spacing w:after="20" w:before="20"/>
-            </w:pPr>
-            <w:r>
-              <w:rPr>
-                <w:rFonts w:ascii="Roboto Condensed Light" w:hAnsi="Roboto Condensed Light"/>
-                <w:b/>
-                <w:color w:val="2A324B"/>
-                <w:sz w:val="20"/>
-              </w:rPr>
-              <w:t>Nazwa własna (override)</w:t>
-            </w:r>
-          </w:p>
-        </w:tc>
-        <w:tc>
-          <w:tcPr>
-            <w:tcW w:type="dxa" w:w="1504"/>
-            <w:tcBorders>
-              <w:top w:val="single" w:sz="4" w:color="CCCCCC"/>
-              <w:left w:val="single" w:sz="4" w:color="CCCCCC"/>
-              <w:bottom w:val="single" w:sz="4" w:color="CCCCCC"/>
-              <w:right w:val="single" w:sz="4" w:color="CCCCCC"/>
-              <w:insideH w:val="single" w:sz="4" w:color="CCCCCC"/>
-              <w:insideV w:val="single" w:sz="4" w:color="CCCCCC"/>
-            </w:tcBorders>
-          </w:tcPr>
-          <w:p>
-            <w:pPr>
-              <w:jc w:val="both"/>
-              <w:spacing w:after="20" w:before="20"/>
-            </w:pPr>
-            <w:r>
-              <w:rPr>
-                <w:rFonts w:ascii="Roboto Condensed Light" w:hAnsi="Roboto Condensed Light"/>
-                <w:b w:val="0"/>
-                <w:color w:val="2A324B"/>
-                <w:sz w:val="20"/>
-              </w:rPr>
-              <w:t>Nie</w:t>
-            </w:r>
-          </w:p>
-        </w:tc>
-        <w:tc>
-          <w:tcPr>
-            <w:tcW w:type="dxa" w:w="5455"/>
-            <w:tcBorders>
-              <w:top w:val="single" w:sz="4" w:color="CCCCCC"/>
-              <w:left w:val="single" w:sz="4" w:color="CCCCCC"/>
-              <w:bottom w:val="single" w:sz="4" w:color="CCCCCC"/>
-              <w:right w:val="single" w:sz="4" w:color="CCCCCC"/>
-              <w:insideH w:val="single" w:sz="4" w:color="CCCCCC"/>
-              <w:insideV w:val="single" w:sz="4" w:color="CCCCCC"/>
-            </w:tcBorders>
-          </w:tcPr>
-          <w:p>
-            <w:pPr>
-              <w:jc w:val="both"/>
-              <w:spacing w:after="20" w:before="20"/>
-            </w:pPr>
-            <w:r>
-              <w:rPr>
-                <w:rFonts w:ascii="Roboto Condensed Light" w:hAnsi="Roboto Condensed Light"/>
-                <w:b w:val="0"/>
-                <w:color w:val="2A324B"/>
-                <w:sz w:val="20"/>
-              </w:rPr>
-              <w:t>Opcjonalne nadpisanie nazwy.</w:t>
+              <w:t>Dane każdej pozycji pobierane z biblioteki; służą do prezentacji programu w ofercie.</w:t>
             </w:r>
           </w:p>
         </w:tc>
@@ -3172,7 +3154,7 @@
                 <w:color w:val="2A324B"/>
                 <w:sz w:val="20"/>
               </w:rPr>
-              <w:t>Potrzeby klienta</w:t>
+              <w:t>Zdiagnozowane potrzeby (lewa kolumna)</w:t>
             </w:r>
           </w:p>
         </w:tc>
@@ -3200,7 +3182,7 @@
                 <w:color w:val="2A324B"/>
                 <w:sz w:val="20"/>
               </w:rPr>
-              <w:t>Punkty sekcji Wprowadzenie. Każdy punkt ma tytuł i opis.</w:t>
+              <w:t>Krótki opis realnie zdiagnozowanych potrzeb klienta. Sekcja 01 Wprowadzenie.</w:t>
             </w:r>
           </w:p>
         </w:tc>
@@ -3231,7 +3213,7 @@
                 <w:color w:val="2A324B"/>
                 <w:sz w:val="20"/>
               </w:rPr>
-              <w:t>Wstęp (intro)</w:t>
+              <w:t>Podstawa rekomendacji (prawa kolumna)</w:t>
             </w:r>
           </w:p>
         </w:tc>
@@ -3260,7 +3242,7 @@
                 <w:color w:val="2A324B"/>
                 <w:sz w:val="20"/>
               </w:rPr>
-              <w:t>Tekst nad cennikiem.</w:t>
+              <w:t>Merytoryczne uzasadnienie rekomendacji, do 1500 znaków. Sekcja 01, układ dwukolumnowy.</w:t>
             </w:r>
           </w:p>
         </w:tc>
@@ -3290,7 +3272,7 @@
                 <w:color w:val="2A324B"/>
                 <w:sz w:val="20"/>
               </w:rPr>
-              <w:t>Podsumowanie (footer)</w:t>
+              <w:t>Opis rekomendowanego programu</w:t>
             </w:r>
           </w:p>
         </w:tc>
@@ -3318,7 +3300,7 @@
                 <w:color w:val="2A324B"/>
                 <w:sz w:val="20"/>
               </w:rPr>
-              <w:t>Tekst pod cennikiem.</w:t>
+              <w:t>Edytor tekstu sformatowanego. Puste oznacza opis z biblioteki. Sekcja 02.</w:t>
             </w:r>
           </w:p>
         </w:tc>
@@ -3349,7 +3331,7 @@
                 <w:color w:val="2A324B"/>
                 <w:sz w:val="20"/>
               </w:rPr>
-              <w:t>Uwagi do wyceny</w:t>
+              <w:t>Założenia oferty (punktory)</w:t>
             </w:r>
           </w:p>
         </w:tc>
@@ -3378,7 +3360,7 @@
                 <w:color w:val="2A324B"/>
                 <w:sz w:val="20"/>
               </w:rPr>
-              <w:t>Wyróżniony box w sekcji wynagrodzenia, na przykład informacja o rabacie.</w:t>
+              <w:t>Lista punktów w kafelku sekcji 04 (Model wynagrodzenia).</w:t>
             </w:r>
           </w:p>
         </w:tc>
@@ -3408,7 +3390,7 @@
                 <w:color w:val="2A324B"/>
                 <w:sz w:val="20"/>
               </w:rPr>
-              <w:t>Dlaczego ten nabór</w:t>
+              <w:t>Uwagi do wyceny</w:t>
             </w:r>
           </w:p>
         </w:tc>
@@ -3436,125 +3418,7 @@
                 <w:color w:val="2A324B"/>
                 <w:sz w:val="20"/>
               </w:rPr>
-              <w:t>Uzasadnienie w sekcji Rekomendujemy.</w:t>
-            </w:r>
-          </w:p>
-        </w:tc>
-      </w:tr>
-      <w:tr>
-        <w:tc>
-          <w:tcPr>
-            <w:tcW w:type="dxa" w:w="3009"/>
-            <w:tcBorders>
-              <w:top w:val="single" w:sz="4" w:color="CCCCCC"/>
-              <w:left w:val="single" w:sz="4" w:color="CCCCCC"/>
-              <w:bottom w:val="single" w:sz="4" w:color="CCCCCC"/>
-              <w:right w:val="single" w:sz="4" w:color="CCCCCC"/>
-              <w:insideH w:val="single" w:sz="4" w:color="CCCCCC"/>
-              <w:insideV w:val="single" w:sz="4" w:color="CCCCCC"/>
-            </w:tcBorders>
-            <w:shd w:fill="ECECEC" w:val="clear"/>
-          </w:tcPr>
-          <w:p>
-            <w:pPr>
-              <w:jc w:val="left"/>
-              <w:spacing w:after="20" w:before="20"/>
-            </w:pPr>
-            <w:r>
-              <w:rPr>
-                <w:rFonts w:ascii="Roboto Condensed Light" w:hAnsi="Roboto Condensed Light"/>
-                <w:b/>
-                <w:color w:val="2A324B"/>
-                <w:sz w:val="20"/>
-              </w:rPr>
-              <w:t>Opis rekomendowanego programu</w:t>
-            </w:r>
-          </w:p>
-        </w:tc>
-        <w:tc>
-          <w:tcPr>
-            <w:tcW w:type="dxa" w:w="6396"/>
-            <w:tcBorders>
-              <w:top w:val="single" w:sz="4" w:color="CCCCCC"/>
-              <w:left w:val="single" w:sz="4" w:color="CCCCCC"/>
-              <w:bottom w:val="single" w:sz="4" w:color="CCCCCC"/>
-              <w:right w:val="single" w:sz="4" w:color="CCCCCC"/>
-              <w:insideH w:val="single" w:sz="4" w:color="CCCCCC"/>
-              <w:insideV w:val="single" w:sz="4" w:color="CCCCCC"/>
-            </w:tcBorders>
-            <w:shd w:fill="ECECEC" w:val="clear"/>
-          </w:tcPr>
-          <w:p>
-            <w:pPr>
-              <w:jc w:val="both"/>
-              <w:spacing w:after="20" w:before="20"/>
-            </w:pPr>
-            <w:r>
-              <w:rPr>
-                <w:rFonts w:ascii="Roboto Condensed Light" w:hAnsi="Roboto Condensed Light"/>
-                <w:b w:val="0"/>
-                <w:color w:val="2A324B"/>
-                <w:sz w:val="20"/>
-              </w:rPr>
-              <w:t>Edytor tekstu sformatowanego. Puste oznacza cztery domyślne punkty.</w:t>
-            </w:r>
-          </w:p>
-        </w:tc>
-      </w:tr>
-      <w:tr>
-        <w:tc>
-          <w:tcPr>
-            <w:tcW w:type="dxa" w:w="3009"/>
-            <w:tcBorders>
-              <w:top w:val="single" w:sz="4" w:color="CCCCCC"/>
-              <w:left w:val="single" w:sz="4" w:color="CCCCCC"/>
-              <w:bottom w:val="single" w:sz="4" w:color="CCCCCC"/>
-              <w:right w:val="single" w:sz="4" w:color="CCCCCC"/>
-              <w:insideH w:val="single" w:sz="4" w:color="CCCCCC"/>
-              <w:insideV w:val="single" w:sz="4" w:color="CCCCCC"/>
-            </w:tcBorders>
-          </w:tcPr>
-          <w:p>
-            <w:pPr>
-              <w:jc w:val="left"/>
-              <w:spacing w:after="20" w:before="20"/>
-            </w:pPr>
-            <w:r>
-              <w:rPr>
-                <w:rFonts w:ascii="Roboto Condensed Light" w:hAnsi="Roboto Condensed Light"/>
-                <w:b/>
-                <w:color w:val="2A324B"/>
-                <w:sz w:val="20"/>
-              </w:rPr>
-              <w:t>Alternatywne programy</w:t>
-            </w:r>
-          </w:p>
-        </w:tc>
-        <w:tc>
-          <w:tcPr>
-            <w:tcW w:type="dxa" w:w="6396"/>
-            <w:tcBorders>
-              <w:top w:val="single" w:sz="4" w:color="CCCCCC"/>
-              <w:left w:val="single" w:sz="4" w:color="CCCCCC"/>
-              <w:bottom w:val="single" w:sz="4" w:color="CCCCCC"/>
-              <w:right w:val="single" w:sz="4" w:color="CCCCCC"/>
-              <w:insideH w:val="single" w:sz="4" w:color="CCCCCC"/>
-              <w:insideV w:val="single" w:sz="4" w:color="CCCCCC"/>
-            </w:tcBorders>
-          </w:tcPr>
-          <w:p>
-            <w:pPr>
-              <w:jc w:val="both"/>
-              <w:spacing w:after="20" w:before="20"/>
-            </w:pPr>
-            <w:r>
-              <w:rPr>
-                <w:rFonts w:ascii="Roboto Condensed Light" w:hAnsi="Roboto Condensed Light"/>
-                <w:b w:val="0"/>
-                <w:color w:val="2A324B"/>
-                <w:sz w:val="20"/>
-              </w:rPr>
-              <w:t>Lista programów zapasowych. Puste oznacza cztery domyślne pozycje.</w:t>
+              <w:t>Wyróżniony box przy wynagrodzeniu wykonawczym.</w:t>
             </w:r>
           </w:p>
         </w:tc>
@@ -3763,7 +3627,7 @@
                 <w:color w:val="2A324B"/>
                 <w:sz w:val="20"/>
               </w:rPr>
-              <w:t>Wybór zrealizowanego projektu z katalogu, prezentowany klientowi jako dowód.</w:t>
+              <w:t>Wybór zrealizowanego projektu z katalogu, pokazywany w sekcji 06. Jeśli projekt ma zapisany link, w ofercie pojawia się odnośnik „Zobacz pełny opis projektu”.</w:t>
             </w:r>
           </w:p>
         </w:tc>
@@ -4521,7 +4385,7 @@
                 <w:color w:val="2A324B"/>
                 <w:sz w:val="20"/>
               </w:rPr>
-              <w:t>Powitanie i lista potrzeb klienta.</w:t>
+              <w:t>Zdiagnozowane potrzeby klienta i merytoryczna podstawa rekomendacji w układzie dwukolumnowym.</w:t>
             </w:r>
           </w:p>
         </w:tc>
@@ -4581,7 +4445,7 @@
                 <w:color w:val="2A324B"/>
                 <w:sz w:val="20"/>
               </w:rPr>
-              <w:t>Uzasadnienie naboru, opis programu, inne możliwości wsparcia.</w:t>
+              <w:t>Rekomendowany program jako wyróżniony kafelek wraz z opisem; pod spodem pozostałe programy wsparcia.</w:t>
             </w:r>
           </w:p>
         </w:tc>
@@ -5354,95 +5218,6 @@
               <w:insideH w:val="single" w:sz="4" w:color="CCCCCC"/>
               <w:insideV w:val="single" w:sz="4" w:color="CCCCCC"/>
             </w:tcBorders>
-            <w:shd w:fill="ECECEC" w:val="clear"/>
-          </w:tcPr>
-          <w:p>
-            <w:pPr>
-              <w:jc w:val="left"/>
-              <w:spacing w:after="20" w:before="20"/>
-            </w:pPr>
-            <w:r>
-              <w:rPr>
-                <w:rFonts w:ascii="Roboto Condensed Light" w:hAnsi="Roboto Condensed Light"/>
-                <w:b/>
-                <w:color w:val="2A324B"/>
-                <w:sz w:val="20"/>
-              </w:rPr>
-              <w:t>Programy</w:t>
-            </w:r>
-          </w:p>
-        </w:tc>
-        <w:tc>
-          <w:tcPr>
-            <w:tcW w:type="dxa" w:w="2445"/>
-            <w:tcBorders>
-              <w:top w:val="single" w:sz="4" w:color="CCCCCC"/>
-              <w:left w:val="single" w:sz="4" w:color="CCCCCC"/>
-              <w:bottom w:val="single" w:sz="4" w:color="CCCCCC"/>
-              <w:right w:val="single" w:sz="4" w:color="CCCCCC"/>
-              <w:insideH w:val="single" w:sz="4" w:color="CCCCCC"/>
-              <w:insideV w:val="single" w:sz="4" w:color="CCCCCC"/>
-            </w:tcBorders>
-            <w:shd w:fill="ECECEC" w:val="clear"/>
-          </w:tcPr>
-          <w:p>
-            <w:pPr>
-              <w:jc w:val="both"/>
-              <w:spacing w:after="20" w:before="20"/>
-            </w:pPr>
-            <w:r>
-              <w:rPr>
-                <w:rFonts w:ascii="Roboto Condensed Light" w:hAnsi="Roboto Condensed Light"/>
-                <w:b w:val="0"/>
-                <w:color w:val="2A324B"/>
-                <w:sz w:val="20"/>
-              </w:rPr>
-              <w:t>/admin/programs</w:t>
-            </w:r>
-          </w:p>
-        </w:tc>
-        <w:tc>
-          <w:tcPr>
-            <w:tcW w:type="dxa" w:w="4703"/>
-            <w:tcBorders>
-              <w:top w:val="single" w:sz="4" w:color="CCCCCC"/>
-              <w:left w:val="single" w:sz="4" w:color="CCCCCC"/>
-              <w:bottom w:val="single" w:sz="4" w:color="CCCCCC"/>
-              <w:right w:val="single" w:sz="4" w:color="CCCCCC"/>
-              <w:insideH w:val="single" w:sz="4" w:color="CCCCCC"/>
-              <w:insideV w:val="single" w:sz="4" w:color="CCCCCC"/>
-            </w:tcBorders>
-            <w:shd w:fill="ECECEC" w:val="clear"/>
-          </w:tcPr>
-          <w:p>
-            <w:pPr>
-              <w:jc w:val="both"/>
-              <w:spacing w:after="20" w:before="20"/>
-            </w:pPr>
-            <w:r>
-              <w:rPr>
-                <w:rFonts w:ascii="Roboto Condensed Light" w:hAnsi="Roboto Condensed Light"/>
-                <w:b w:val="0"/>
-                <w:color w:val="2A324B"/>
-                <w:sz w:val="20"/>
-              </w:rPr>
-              <w:t>Katalog programów dotacyjnych.</w:t>
-            </w:r>
-          </w:p>
-        </w:tc>
-      </w:tr>
-      <w:tr>
-        <w:tc>
-          <w:tcPr>
-            <w:tcW w:type="dxa" w:w="2257"/>
-            <w:tcBorders>
-              <w:top w:val="single" w:sz="4" w:color="CCCCCC"/>
-              <w:left w:val="single" w:sz="4" w:color="CCCCCC"/>
-              <w:bottom w:val="single" w:sz="4" w:color="CCCCCC"/>
-              <w:right w:val="single" w:sz="4" w:color="CCCCCC"/>
-              <w:insideH w:val="single" w:sz="4" w:color="CCCCCC"/>
-              <w:insideV w:val="single" w:sz="4" w:color="CCCCCC"/>
-            </w:tcBorders>
           </w:tcPr>
           <w:p>
             <w:pPr>
@@ -5631,7 +5406,7 @@
                 <w:color w:val="2A324B"/>
                 <w:sz w:val="20"/>
               </w:rPr>
-              <w:t>Alternatywne programy</w:t>
+              <w:t>Programy wsparcia</w:t>
             </w:r>
           </w:p>
         </w:tc>
@@ -5687,7 +5462,7 @@
                 <w:color w:val="2A324B"/>
                 <w:sz w:val="20"/>
               </w:rPr>
-              <w:t>Biblioteka programów zapasowych.</w:t>
+              <w:t>Biblioteka programów wsparcia. Pozycja oznaczona jako rekomendowana trafia do sekcji 02 oferty. Zastąpiła dawny katalog „Programy”.</w:t>
             </w:r>
           </w:p>
         </w:tc>

</xml_diff>

<commit_message>
docs: aktualizacja README + instrukcji .docx po pilotazu UX (PR #75-#80) (#81)
README: sekcja "Model oferty i katalogow" (nowa struktura sekcji 01/02,
scalenie katalogow w biblioteke programow wsparcia, link case study,
kolejnosc pol = kolejnosc sekcji), status PR #1-#80, link do instrukcji .docx.

Instrukcja .docx (edycja tresci w miejscu, standard K2 nietkniety):
- 3.2 "Program dotacyjny" -> "Programy wsparcia" (lista + rekomendowany)
- 3.6 Tresc: 2-kolumnowa diagnoza (sek. 01), zalozenia, bez intro/footer/programReason
- Case study: opcjonalny link "Zobacz pelny opis projektu"
- Sekcje 01/02 klienta zaktualizowane; katalog "Programy" wygaszony
- Szybki start + wymagane pola dopasowane do nowego modelu

Co-authored-by: Claude Opus 4.8 <noreply@anthropic.com>
</commit_message>
<xml_diff>
--- a/docs/K2Biznes_Oferta_-_instrukcja_i_architektura.docx
+++ b/docs/K2Biznes_Oferta_-_instrukcja_i_architektura.docx
@@ -184,16 +184,7 @@
           <w:color w:val="2A324B"/>
           <w:sz w:val="22"/>
         </w:rPr>
-        <w:t xml:space="preserve">3. </w:t>
-      </w:r>
-      <w:r>
-        <w:rPr>
-          <w:rFonts w:ascii="Roboto Condensed Light" w:hAnsi="Roboto Condensed Light"/>
-          <w:b w:val="0"/>
-          <w:color w:val="2A324B"/>
-          <w:sz w:val="22"/>
-        </w:rPr>
-        <w:t>Uzupełnij dane klienta (nazwa firmy jest wymagana) i wybierz program (nazwa programu jest wymagana).</w:t>
+        <w:t>3. Uzupełnij dane klienta (nazwa firmy jest wymagana). W sekcji „Programy wsparcia” dodaj z biblioteki program, który rekomendujesz, i zaznacz go jako rekomendowany - trafi do sekcji 02 oferty.</w:t>
       </w:r>
     </w:p>
     <w:p>
@@ -308,16 +299,7 @@
           <w:color w:val="CE181A"/>
           <w:sz w:val="22"/>
         </w:rPr>
-        <w:t xml:space="preserve">Uwaga: </w:t>
-      </w:r>
-      <w:r>
-        <w:rPr>
-          <w:rFonts w:ascii="Roboto Condensed Light" w:hAnsi="Roboto Condensed Light"/>
-          <w:b w:val="0"/>
-          <w:color w:val="2A324B"/>
-          <w:sz w:val="22"/>
-        </w:rPr>
-        <w:t>Minimalny zestaw wymaganych pól to nazwa firmy, nazwa programu i wartość projektu. Resztę możesz zostawić na wartościach domyślnych.</w:t>
+        <w:t>Uwaga: Minimalny zestaw wymaganych pól to nazwa firmy, wartość projektu oraz jeden program wsparcia oznaczony jako rekomendowany. Pozostałe pola można uzupełnić później.</w:t>
       </w:r>
     </w:p>
     <w:p>
@@ -630,7 +612,7 @@
           <w:color w:val="2A324B"/>
           <w:sz w:val="22"/>
         </w:rPr>
-        <w:t>Formularz jest podzielony na sekcje wypełniane od góry do dołu. Pola oznaczone gwiazdką są wymagane, pozostałe są opcjonalne i mają wartości domyślne. W trybie tworzenia nowej oferty, jeśli istnieją zapisane szablony, u góry pojawia się pole Zacznij od szablonu, które wypełnia wszystko poza danymi klienta.</w:t>
+        <w:t>Formularz jest podzielony na sekcje wypełniane od góry do dołu; ich kolejność odpowiada kolejności sekcji w gotowej ofercie. Pola oznaczone gwiazdką są wymagane, reszta jest opcjonalna.</w:t>
       </w:r>
     </w:p>
     <w:p>
@@ -1294,7 +1276,7 @@
           <w:color w:val="2A324B"/>
           <w:sz w:val="28"/>
         </w:rPr>
-        <w:t>3.2 Program dotacyjny</w:t>
+        <w:t>3.2 Programy wsparcia</w:t>
       </w:r>
     </w:p>
     <w:tbl>
@@ -1423,7 +1405,179 @@
                 <w:color w:val="2A324B"/>
                 <w:sz w:val="20"/>
               </w:rPr>
-              <w:t>Wybierz z katalogu</w:t>
+              <w:t>Programy wsparcia (biblioteka)</w:t>
+            </w:r>
+          </w:p>
+        </w:tc>
+        <w:tc>
+          <w:tcPr>
+            <w:tcW w:type="dxa" w:w="1504"/>
+            <w:tcBorders>
+              <w:top w:val="single" w:sz="4" w:color="CCCCCC"/>
+              <w:left w:val="single" w:sz="4" w:color="CCCCCC"/>
+              <w:bottom w:val="single" w:sz="4" w:color="CCCCCC"/>
+              <w:right w:val="single" w:sz="4" w:color="CCCCCC"/>
+              <w:insideH w:val="single" w:sz="4" w:color="CCCCCC"/>
+              <w:insideV w:val="single" w:sz="4" w:color="CCCCCC"/>
+            </w:tcBorders>
+          </w:tcPr>
+          <w:p>
+            <w:pPr>
+              <w:jc w:val="both"/>
+              <w:spacing w:after="20" w:before="20"/>
+            </w:pPr>
+            <w:r>
+              <w:rPr>
+                <w:rFonts w:ascii="Roboto Condensed Light" w:hAnsi="Roboto Condensed Light"/>
+                <w:b w:val="0"/>
+                <w:color w:val="2A324B"/>
+                <w:sz w:val="20"/>
+              </w:rPr>
+              <w:t>Tak</w:t>
+            </w:r>
+          </w:p>
+        </w:tc>
+        <w:tc>
+          <w:tcPr>
+            <w:tcW w:type="dxa" w:w="5455"/>
+            <w:tcBorders>
+              <w:top w:val="single" w:sz="4" w:color="CCCCCC"/>
+              <w:left w:val="single" w:sz="4" w:color="CCCCCC"/>
+              <w:bottom w:val="single" w:sz="4" w:color="CCCCCC"/>
+              <w:right w:val="single" w:sz="4" w:color="CCCCCC"/>
+              <w:insideH w:val="single" w:sz="4" w:color="CCCCCC"/>
+              <w:insideV w:val="single" w:sz="4" w:color="CCCCCC"/>
+            </w:tcBorders>
+          </w:tcPr>
+          <w:p>
+            <w:pPr>
+              <w:jc w:val="both"/>
+              <w:spacing w:after="20" w:before="20"/>
+            </w:pPr>
+            <w:r>
+              <w:rPr>
+                <w:rFonts w:ascii="Roboto Condensed Light" w:hAnsi="Roboto Condensed Light"/>
+                <w:b w:val="0"/>
+                <w:color w:val="2A324B"/>
+                <w:sz w:val="20"/>
+              </w:rPr>
+              <w:t>Rozwijana lista z katalogu programów wsparcia. Dodane pozycje tworzą listę; każdą można usunąć.</w:t>
+            </w:r>
+          </w:p>
+        </w:tc>
+      </w:tr>
+      <w:tr>
+        <w:tc>
+          <w:tcPr>
+            <w:tcW w:type="dxa" w:w="2445"/>
+            <w:tcBorders>
+              <w:top w:val="single" w:sz="4" w:color="CCCCCC"/>
+              <w:left w:val="single" w:sz="4" w:color="CCCCCC"/>
+              <w:bottom w:val="single" w:sz="4" w:color="CCCCCC"/>
+              <w:right w:val="single" w:sz="4" w:color="CCCCCC"/>
+              <w:insideH w:val="single" w:sz="4" w:color="CCCCCC"/>
+              <w:insideV w:val="single" w:sz="4" w:color="CCCCCC"/>
+            </w:tcBorders>
+          </w:tcPr>
+          <w:p>
+            <w:pPr>
+              <w:jc w:val="left"/>
+              <w:spacing w:after="20" w:before="20"/>
+            </w:pPr>
+            <w:r>
+              <w:rPr>
+                <w:rFonts w:ascii="Roboto Condensed Light" w:hAnsi="Roboto Condensed Light"/>
+                <w:b/>
+                <w:color w:val="2A324B"/>
+                <w:sz w:val="20"/>
+              </w:rPr>
+              <w:t>Rekomendowany</w:t>
+            </w:r>
+          </w:p>
+        </w:tc>
+        <w:tc>
+          <w:tcPr>
+            <w:tcW w:type="dxa" w:w="1504"/>
+            <w:tcBorders>
+              <w:top w:val="single" w:sz="4" w:color="CCCCCC"/>
+              <w:left w:val="single" w:sz="4" w:color="CCCCCC"/>
+              <w:bottom w:val="single" w:sz="4" w:color="CCCCCC"/>
+              <w:right w:val="single" w:sz="4" w:color="CCCCCC"/>
+              <w:insideH w:val="single" w:sz="4" w:color="CCCCCC"/>
+              <w:insideV w:val="single" w:sz="4" w:color="CCCCCC"/>
+            </w:tcBorders>
+          </w:tcPr>
+          <w:p>
+            <w:pPr>
+              <w:jc w:val="both"/>
+              <w:spacing w:after="20" w:before="20"/>
+            </w:pPr>
+            <w:r>
+              <w:rPr>
+                <w:rFonts w:ascii="Roboto Condensed Light" w:hAnsi="Roboto Condensed Light"/>
+                <w:b w:val="0"/>
+                <w:color w:val="2A324B"/>
+                <w:sz w:val="20"/>
+              </w:rPr>
+              <w:t>Tak</w:t>
+            </w:r>
+          </w:p>
+        </w:tc>
+        <w:tc>
+          <w:tcPr>
+            <w:tcW w:type="dxa" w:w="5455"/>
+            <w:tcBorders>
+              <w:top w:val="single" w:sz="4" w:color="CCCCCC"/>
+              <w:left w:val="single" w:sz="4" w:color="CCCCCC"/>
+              <w:bottom w:val="single" w:sz="4" w:color="CCCCCC"/>
+              <w:right w:val="single" w:sz="4" w:color="CCCCCC"/>
+              <w:insideH w:val="single" w:sz="4" w:color="CCCCCC"/>
+              <w:insideV w:val="single" w:sz="4" w:color="CCCCCC"/>
+            </w:tcBorders>
+          </w:tcPr>
+          <w:p>
+            <w:pPr>
+              <w:jc w:val="both"/>
+              <w:spacing w:after="20" w:before="20"/>
+            </w:pPr>
+            <w:r>
+              <w:rPr>
+                <w:rFonts w:ascii="Roboto Condensed Light" w:hAnsi="Roboto Condensed Light"/>
+                <w:b w:val="0"/>
+                <w:color w:val="2A324B"/>
+                <w:sz w:val="20"/>
+              </w:rPr>
+              <w:t>Znacznik przy jednej pozycji. Rekomendowany program pojawia się w sekcji 02 jako wyróżniony kafelek. Wymagany co najmniej jeden.</w:t>
+            </w:r>
+          </w:p>
+        </w:tc>
+      </w:tr>
+      <w:tr>
+        <w:tc>
+          <w:tcPr>
+            <w:tcW w:type="dxa" w:w="2445"/>
+            <w:tcBorders>
+              <w:top w:val="single" w:sz="4" w:color="CCCCCC"/>
+              <w:left w:val="single" w:sz="4" w:color="CCCCCC"/>
+              <w:bottom w:val="single" w:sz="4" w:color="CCCCCC"/>
+              <w:right w:val="single" w:sz="4" w:color="CCCCCC"/>
+              <w:insideH w:val="single" w:sz="4" w:color="CCCCCC"/>
+              <w:insideV w:val="single" w:sz="4" w:color="CCCCCC"/>
+            </w:tcBorders>
+          </w:tcPr>
+          <w:p>
+            <w:pPr>
+              <w:jc w:val="left"/>
+              <w:spacing w:after="20" w:before="20"/>
+            </w:pPr>
+            <w:r>
+              <w:rPr>
+                <w:rFonts w:ascii="Roboto Condensed Light" w:hAnsi="Roboto Condensed Light"/>
+                <w:b/>
+                <w:color w:val="2A324B"/>
+                <w:sz w:val="20"/>
+              </w:rPr>
+              <w:t>Nazwa, termin, opis</w:t>
             </w:r>
           </w:p>
         </w:tc>
@@ -1479,179 +1633,7 @@
                 <w:color w:val="2A324B"/>
                 <w:sz w:val="20"/>
               </w:rPr>
-              <w:t>Lista programów pogrupowana tematycznie. Wybór uzupełnia automatycznie nazwę programu.</w:t>
-            </w:r>
-          </w:p>
-        </w:tc>
-      </w:tr>
-      <w:tr>
-        <w:tc>
-          <w:tcPr>
-            <w:tcW w:type="dxa" w:w="2445"/>
-            <w:tcBorders>
-              <w:top w:val="single" w:sz="4" w:color="CCCCCC"/>
-              <w:left w:val="single" w:sz="4" w:color="CCCCCC"/>
-              <w:bottom w:val="single" w:sz="4" w:color="CCCCCC"/>
-              <w:right w:val="single" w:sz="4" w:color="CCCCCC"/>
-              <w:insideH w:val="single" w:sz="4" w:color="CCCCCC"/>
-              <w:insideV w:val="single" w:sz="4" w:color="CCCCCC"/>
-            </w:tcBorders>
-          </w:tcPr>
-          <w:p>
-            <w:pPr>
-              <w:jc w:val="left"/>
-              <w:spacing w:after="20" w:before="20"/>
-            </w:pPr>
-            <w:r>
-              <w:rPr>
-                <w:rFonts w:ascii="Roboto Condensed Light" w:hAnsi="Roboto Condensed Light"/>
-                <w:b/>
-                <w:color w:val="2A324B"/>
-                <w:sz w:val="20"/>
-              </w:rPr>
-              <w:t>Nazwa programu</w:t>
-            </w:r>
-          </w:p>
-        </w:tc>
-        <w:tc>
-          <w:tcPr>
-            <w:tcW w:type="dxa" w:w="1504"/>
-            <w:tcBorders>
-              <w:top w:val="single" w:sz="4" w:color="CCCCCC"/>
-              <w:left w:val="single" w:sz="4" w:color="CCCCCC"/>
-              <w:bottom w:val="single" w:sz="4" w:color="CCCCCC"/>
-              <w:right w:val="single" w:sz="4" w:color="CCCCCC"/>
-              <w:insideH w:val="single" w:sz="4" w:color="CCCCCC"/>
-              <w:insideV w:val="single" w:sz="4" w:color="CCCCCC"/>
-            </w:tcBorders>
-          </w:tcPr>
-          <w:p>
-            <w:pPr>
-              <w:jc w:val="both"/>
-              <w:spacing w:after="20" w:before="20"/>
-            </w:pPr>
-            <w:r>
-              <w:rPr>
-                <w:rFonts w:ascii="Roboto Condensed Light" w:hAnsi="Roboto Condensed Light"/>
-                <w:b w:val="0"/>
-                <w:color w:val="2A324B"/>
-                <w:sz w:val="20"/>
-              </w:rPr>
-              <w:t>Tak</w:t>
-            </w:r>
-          </w:p>
-        </w:tc>
-        <w:tc>
-          <w:tcPr>
-            <w:tcW w:type="dxa" w:w="5455"/>
-            <w:tcBorders>
-              <w:top w:val="single" w:sz="4" w:color="CCCCCC"/>
-              <w:left w:val="single" w:sz="4" w:color="CCCCCC"/>
-              <w:bottom w:val="single" w:sz="4" w:color="CCCCCC"/>
-              <w:right w:val="single" w:sz="4" w:color="CCCCCC"/>
-              <w:insideH w:val="single" w:sz="4" w:color="CCCCCC"/>
-              <w:insideV w:val="single" w:sz="4" w:color="CCCCCC"/>
-            </w:tcBorders>
-          </w:tcPr>
-          <w:p>
-            <w:pPr>
-              <w:jc w:val="both"/>
-              <w:spacing w:after="20" w:before="20"/>
-            </w:pPr>
-            <w:r>
-              <w:rPr>
-                <w:rFonts w:ascii="Roboto Condensed Light" w:hAnsi="Roboto Condensed Light"/>
-                <w:b w:val="0"/>
-                <w:color w:val="2A324B"/>
-                <w:sz w:val="20"/>
-              </w:rPr>
-              <w:t>Etykieta programu widoczna w ofercie.</w:t>
-            </w:r>
-          </w:p>
-        </w:tc>
-      </w:tr>
-      <w:tr>
-        <w:tc>
-          <w:tcPr>
-            <w:tcW w:type="dxa" w:w="2445"/>
-            <w:tcBorders>
-              <w:top w:val="single" w:sz="4" w:color="CCCCCC"/>
-              <w:left w:val="single" w:sz="4" w:color="CCCCCC"/>
-              <w:bottom w:val="single" w:sz="4" w:color="CCCCCC"/>
-              <w:right w:val="single" w:sz="4" w:color="CCCCCC"/>
-              <w:insideH w:val="single" w:sz="4" w:color="CCCCCC"/>
-              <w:insideV w:val="single" w:sz="4" w:color="CCCCCC"/>
-            </w:tcBorders>
-          </w:tcPr>
-          <w:p>
-            <w:pPr>
-              <w:jc w:val="left"/>
-              <w:spacing w:after="20" w:before="20"/>
-            </w:pPr>
-            <w:r>
-              <w:rPr>
-                <w:rFonts w:ascii="Roboto Condensed Light" w:hAnsi="Roboto Condensed Light"/>
-                <w:b/>
-                <w:color w:val="2A324B"/>
-                <w:sz w:val="20"/>
-              </w:rPr>
-              <w:t>Nazwa własna (override)</w:t>
-            </w:r>
-          </w:p>
-        </w:tc>
-        <w:tc>
-          <w:tcPr>
-            <w:tcW w:type="dxa" w:w="1504"/>
-            <w:tcBorders>
-              <w:top w:val="single" w:sz="4" w:color="CCCCCC"/>
-              <w:left w:val="single" w:sz="4" w:color="CCCCCC"/>
-              <w:bottom w:val="single" w:sz="4" w:color="CCCCCC"/>
-              <w:right w:val="single" w:sz="4" w:color="CCCCCC"/>
-              <w:insideH w:val="single" w:sz="4" w:color="CCCCCC"/>
-              <w:insideV w:val="single" w:sz="4" w:color="CCCCCC"/>
-            </w:tcBorders>
-          </w:tcPr>
-          <w:p>
-            <w:pPr>
-              <w:jc w:val="both"/>
-              <w:spacing w:after="20" w:before="20"/>
-            </w:pPr>
-            <w:r>
-              <w:rPr>
-                <w:rFonts w:ascii="Roboto Condensed Light" w:hAnsi="Roboto Condensed Light"/>
-                <w:b w:val="0"/>
-                <w:color w:val="2A324B"/>
-                <w:sz w:val="20"/>
-              </w:rPr>
-              <w:t>Nie</w:t>
-            </w:r>
-          </w:p>
-        </w:tc>
-        <w:tc>
-          <w:tcPr>
-            <w:tcW w:type="dxa" w:w="5455"/>
-            <w:tcBorders>
-              <w:top w:val="single" w:sz="4" w:color="CCCCCC"/>
-              <w:left w:val="single" w:sz="4" w:color="CCCCCC"/>
-              <w:bottom w:val="single" w:sz="4" w:color="CCCCCC"/>
-              <w:right w:val="single" w:sz="4" w:color="CCCCCC"/>
-              <w:insideH w:val="single" w:sz="4" w:color="CCCCCC"/>
-              <w:insideV w:val="single" w:sz="4" w:color="CCCCCC"/>
-            </w:tcBorders>
-          </w:tcPr>
-          <w:p>
-            <w:pPr>
-              <w:jc w:val="both"/>
-              <w:spacing w:after="20" w:before="20"/>
-            </w:pPr>
-            <w:r>
-              <w:rPr>
-                <w:rFonts w:ascii="Roboto Condensed Light" w:hAnsi="Roboto Condensed Light"/>
-                <w:b w:val="0"/>
-                <w:color w:val="2A324B"/>
-                <w:sz w:val="20"/>
-              </w:rPr>
-              <w:t>Opcjonalne nadpisanie nazwy.</w:t>
+              <w:t>Dane każdej pozycji pobierane z biblioteki; służą do prezentacji programu w ofercie.</w:t>
             </w:r>
           </w:p>
         </w:tc>
@@ -3172,7 +3154,7 @@
                 <w:color w:val="2A324B"/>
                 <w:sz w:val="20"/>
               </w:rPr>
-              <w:t>Potrzeby klienta</w:t>
+              <w:t>Zdiagnozowane potrzeby (lewa kolumna)</w:t>
             </w:r>
           </w:p>
         </w:tc>
@@ -3200,7 +3182,7 @@
                 <w:color w:val="2A324B"/>
                 <w:sz w:val="20"/>
               </w:rPr>
-              <w:t>Punkty sekcji Wprowadzenie. Każdy punkt ma tytuł i opis.</w:t>
+              <w:t>Krótki opis realnie zdiagnozowanych potrzeb klienta. Sekcja 01 Wprowadzenie.</w:t>
             </w:r>
           </w:p>
         </w:tc>
@@ -3231,7 +3213,7 @@
                 <w:color w:val="2A324B"/>
                 <w:sz w:val="20"/>
               </w:rPr>
-              <w:t>Wstęp (intro)</w:t>
+              <w:t>Podstawa rekomendacji (prawa kolumna)</w:t>
             </w:r>
           </w:p>
         </w:tc>
@@ -3260,7 +3242,7 @@
                 <w:color w:val="2A324B"/>
                 <w:sz w:val="20"/>
               </w:rPr>
-              <w:t>Tekst nad cennikiem.</w:t>
+              <w:t>Merytoryczne uzasadnienie rekomendacji, do 1500 znaków. Sekcja 01, układ dwukolumnowy.</w:t>
             </w:r>
           </w:p>
         </w:tc>
@@ -3290,7 +3272,7 @@
                 <w:color w:val="2A324B"/>
                 <w:sz w:val="20"/>
               </w:rPr>
-              <w:t>Podsumowanie (footer)</w:t>
+              <w:t>Opis rekomendowanego programu</w:t>
             </w:r>
           </w:p>
         </w:tc>
@@ -3318,7 +3300,7 @@
                 <w:color w:val="2A324B"/>
                 <w:sz w:val="20"/>
               </w:rPr>
-              <w:t>Tekst pod cennikiem.</w:t>
+              <w:t>Edytor tekstu sformatowanego. Puste oznacza opis z biblioteki. Sekcja 02.</w:t>
             </w:r>
           </w:p>
         </w:tc>
@@ -3349,7 +3331,7 @@
                 <w:color w:val="2A324B"/>
                 <w:sz w:val="20"/>
               </w:rPr>
-              <w:t>Uwagi do wyceny</w:t>
+              <w:t>Założenia oferty (punktory)</w:t>
             </w:r>
           </w:p>
         </w:tc>
@@ -3378,7 +3360,7 @@
                 <w:color w:val="2A324B"/>
                 <w:sz w:val="20"/>
               </w:rPr>
-              <w:t>Wyróżniony box w sekcji wynagrodzenia, na przykład informacja o rabacie.</w:t>
+              <w:t>Lista punktów w kafelku sekcji 04 (Model wynagrodzenia).</w:t>
             </w:r>
           </w:p>
         </w:tc>
@@ -3408,7 +3390,7 @@
                 <w:color w:val="2A324B"/>
                 <w:sz w:val="20"/>
               </w:rPr>
-              <w:t>Dlaczego ten nabór</w:t>
+              <w:t>Uwagi do wyceny</w:t>
             </w:r>
           </w:p>
         </w:tc>
@@ -3436,125 +3418,7 @@
                 <w:color w:val="2A324B"/>
                 <w:sz w:val="20"/>
               </w:rPr>
-              <w:t>Uzasadnienie w sekcji Rekomendujemy.</w:t>
-            </w:r>
-          </w:p>
-        </w:tc>
-      </w:tr>
-      <w:tr>
-        <w:tc>
-          <w:tcPr>
-            <w:tcW w:type="dxa" w:w="3009"/>
-            <w:tcBorders>
-              <w:top w:val="single" w:sz="4" w:color="CCCCCC"/>
-              <w:left w:val="single" w:sz="4" w:color="CCCCCC"/>
-              <w:bottom w:val="single" w:sz="4" w:color="CCCCCC"/>
-              <w:right w:val="single" w:sz="4" w:color="CCCCCC"/>
-              <w:insideH w:val="single" w:sz="4" w:color="CCCCCC"/>
-              <w:insideV w:val="single" w:sz="4" w:color="CCCCCC"/>
-            </w:tcBorders>
-            <w:shd w:fill="ECECEC" w:val="clear"/>
-          </w:tcPr>
-          <w:p>
-            <w:pPr>
-              <w:jc w:val="left"/>
-              <w:spacing w:after="20" w:before="20"/>
-            </w:pPr>
-            <w:r>
-              <w:rPr>
-                <w:rFonts w:ascii="Roboto Condensed Light" w:hAnsi="Roboto Condensed Light"/>
-                <w:b/>
-                <w:color w:val="2A324B"/>
-                <w:sz w:val="20"/>
-              </w:rPr>
-              <w:t>Opis rekomendowanego programu</w:t>
-            </w:r>
-          </w:p>
-        </w:tc>
-        <w:tc>
-          <w:tcPr>
-            <w:tcW w:type="dxa" w:w="6396"/>
-            <w:tcBorders>
-              <w:top w:val="single" w:sz="4" w:color="CCCCCC"/>
-              <w:left w:val="single" w:sz="4" w:color="CCCCCC"/>
-              <w:bottom w:val="single" w:sz="4" w:color="CCCCCC"/>
-              <w:right w:val="single" w:sz="4" w:color="CCCCCC"/>
-              <w:insideH w:val="single" w:sz="4" w:color="CCCCCC"/>
-              <w:insideV w:val="single" w:sz="4" w:color="CCCCCC"/>
-            </w:tcBorders>
-            <w:shd w:fill="ECECEC" w:val="clear"/>
-          </w:tcPr>
-          <w:p>
-            <w:pPr>
-              <w:jc w:val="both"/>
-              <w:spacing w:after="20" w:before="20"/>
-            </w:pPr>
-            <w:r>
-              <w:rPr>
-                <w:rFonts w:ascii="Roboto Condensed Light" w:hAnsi="Roboto Condensed Light"/>
-                <w:b w:val="0"/>
-                <w:color w:val="2A324B"/>
-                <w:sz w:val="20"/>
-              </w:rPr>
-              <w:t>Edytor tekstu sformatowanego. Puste oznacza cztery domyślne punkty.</w:t>
-            </w:r>
-          </w:p>
-        </w:tc>
-      </w:tr>
-      <w:tr>
-        <w:tc>
-          <w:tcPr>
-            <w:tcW w:type="dxa" w:w="3009"/>
-            <w:tcBorders>
-              <w:top w:val="single" w:sz="4" w:color="CCCCCC"/>
-              <w:left w:val="single" w:sz="4" w:color="CCCCCC"/>
-              <w:bottom w:val="single" w:sz="4" w:color="CCCCCC"/>
-              <w:right w:val="single" w:sz="4" w:color="CCCCCC"/>
-              <w:insideH w:val="single" w:sz="4" w:color="CCCCCC"/>
-              <w:insideV w:val="single" w:sz="4" w:color="CCCCCC"/>
-            </w:tcBorders>
-          </w:tcPr>
-          <w:p>
-            <w:pPr>
-              <w:jc w:val="left"/>
-              <w:spacing w:after="20" w:before="20"/>
-            </w:pPr>
-            <w:r>
-              <w:rPr>
-                <w:rFonts w:ascii="Roboto Condensed Light" w:hAnsi="Roboto Condensed Light"/>
-                <w:b/>
-                <w:color w:val="2A324B"/>
-                <w:sz w:val="20"/>
-              </w:rPr>
-              <w:t>Alternatywne programy</w:t>
-            </w:r>
-          </w:p>
-        </w:tc>
-        <w:tc>
-          <w:tcPr>
-            <w:tcW w:type="dxa" w:w="6396"/>
-            <w:tcBorders>
-              <w:top w:val="single" w:sz="4" w:color="CCCCCC"/>
-              <w:left w:val="single" w:sz="4" w:color="CCCCCC"/>
-              <w:bottom w:val="single" w:sz="4" w:color="CCCCCC"/>
-              <w:right w:val="single" w:sz="4" w:color="CCCCCC"/>
-              <w:insideH w:val="single" w:sz="4" w:color="CCCCCC"/>
-              <w:insideV w:val="single" w:sz="4" w:color="CCCCCC"/>
-            </w:tcBorders>
-          </w:tcPr>
-          <w:p>
-            <w:pPr>
-              <w:jc w:val="both"/>
-              <w:spacing w:after="20" w:before="20"/>
-            </w:pPr>
-            <w:r>
-              <w:rPr>
-                <w:rFonts w:ascii="Roboto Condensed Light" w:hAnsi="Roboto Condensed Light"/>
-                <w:b w:val="0"/>
-                <w:color w:val="2A324B"/>
-                <w:sz w:val="20"/>
-              </w:rPr>
-              <w:t>Lista programów zapasowych. Puste oznacza cztery domyślne pozycje.</w:t>
+              <w:t>Wyróżniony box przy wynagrodzeniu wykonawczym.</w:t>
             </w:r>
           </w:p>
         </w:tc>
@@ -3763,7 +3627,7 @@
                 <w:color w:val="2A324B"/>
                 <w:sz w:val="20"/>
               </w:rPr>
-              <w:t>Wybór zrealizowanego projektu z katalogu, prezentowany klientowi jako dowód.</w:t>
+              <w:t>Wybór zrealizowanego projektu z katalogu, pokazywany w sekcji 06. Jeśli projekt ma zapisany link, w ofercie pojawia się odnośnik „Zobacz pełny opis projektu”.</w:t>
             </w:r>
           </w:p>
         </w:tc>
@@ -4521,7 +4385,7 @@
                 <w:color w:val="2A324B"/>
                 <w:sz w:val="20"/>
               </w:rPr>
-              <w:t>Powitanie i lista potrzeb klienta.</w:t>
+              <w:t>Zdiagnozowane potrzeby klienta i merytoryczna podstawa rekomendacji w układzie dwukolumnowym.</w:t>
             </w:r>
           </w:p>
         </w:tc>
@@ -4581,7 +4445,7 @@
                 <w:color w:val="2A324B"/>
                 <w:sz w:val="20"/>
               </w:rPr>
-              <w:t>Uzasadnienie naboru, opis programu, inne możliwości wsparcia.</w:t>
+              <w:t>Rekomendowany program jako wyróżniony kafelek wraz z opisem; pod spodem pozostałe programy wsparcia.</w:t>
             </w:r>
           </w:p>
         </w:tc>
@@ -5354,95 +5218,6 @@
               <w:insideH w:val="single" w:sz="4" w:color="CCCCCC"/>
               <w:insideV w:val="single" w:sz="4" w:color="CCCCCC"/>
             </w:tcBorders>
-            <w:shd w:fill="ECECEC" w:val="clear"/>
-          </w:tcPr>
-          <w:p>
-            <w:pPr>
-              <w:jc w:val="left"/>
-              <w:spacing w:after="20" w:before="20"/>
-            </w:pPr>
-            <w:r>
-              <w:rPr>
-                <w:rFonts w:ascii="Roboto Condensed Light" w:hAnsi="Roboto Condensed Light"/>
-                <w:b/>
-                <w:color w:val="2A324B"/>
-                <w:sz w:val="20"/>
-              </w:rPr>
-              <w:t>Programy</w:t>
-            </w:r>
-          </w:p>
-        </w:tc>
-        <w:tc>
-          <w:tcPr>
-            <w:tcW w:type="dxa" w:w="2445"/>
-            <w:tcBorders>
-              <w:top w:val="single" w:sz="4" w:color="CCCCCC"/>
-              <w:left w:val="single" w:sz="4" w:color="CCCCCC"/>
-              <w:bottom w:val="single" w:sz="4" w:color="CCCCCC"/>
-              <w:right w:val="single" w:sz="4" w:color="CCCCCC"/>
-              <w:insideH w:val="single" w:sz="4" w:color="CCCCCC"/>
-              <w:insideV w:val="single" w:sz="4" w:color="CCCCCC"/>
-            </w:tcBorders>
-            <w:shd w:fill="ECECEC" w:val="clear"/>
-          </w:tcPr>
-          <w:p>
-            <w:pPr>
-              <w:jc w:val="both"/>
-              <w:spacing w:after="20" w:before="20"/>
-            </w:pPr>
-            <w:r>
-              <w:rPr>
-                <w:rFonts w:ascii="Roboto Condensed Light" w:hAnsi="Roboto Condensed Light"/>
-                <w:b w:val="0"/>
-                <w:color w:val="2A324B"/>
-                <w:sz w:val="20"/>
-              </w:rPr>
-              <w:t>/admin/programs</w:t>
-            </w:r>
-          </w:p>
-        </w:tc>
-        <w:tc>
-          <w:tcPr>
-            <w:tcW w:type="dxa" w:w="4703"/>
-            <w:tcBorders>
-              <w:top w:val="single" w:sz="4" w:color="CCCCCC"/>
-              <w:left w:val="single" w:sz="4" w:color="CCCCCC"/>
-              <w:bottom w:val="single" w:sz="4" w:color="CCCCCC"/>
-              <w:right w:val="single" w:sz="4" w:color="CCCCCC"/>
-              <w:insideH w:val="single" w:sz="4" w:color="CCCCCC"/>
-              <w:insideV w:val="single" w:sz="4" w:color="CCCCCC"/>
-            </w:tcBorders>
-            <w:shd w:fill="ECECEC" w:val="clear"/>
-          </w:tcPr>
-          <w:p>
-            <w:pPr>
-              <w:jc w:val="both"/>
-              <w:spacing w:after="20" w:before="20"/>
-            </w:pPr>
-            <w:r>
-              <w:rPr>
-                <w:rFonts w:ascii="Roboto Condensed Light" w:hAnsi="Roboto Condensed Light"/>
-                <w:b w:val="0"/>
-                <w:color w:val="2A324B"/>
-                <w:sz w:val="20"/>
-              </w:rPr>
-              <w:t>Katalog programów dotacyjnych.</w:t>
-            </w:r>
-          </w:p>
-        </w:tc>
-      </w:tr>
-      <w:tr>
-        <w:tc>
-          <w:tcPr>
-            <w:tcW w:type="dxa" w:w="2257"/>
-            <w:tcBorders>
-              <w:top w:val="single" w:sz="4" w:color="CCCCCC"/>
-              <w:left w:val="single" w:sz="4" w:color="CCCCCC"/>
-              <w:bottom w:val="single" w:sz="4" w:color="CCCCCC"/>
-              <w:right w:val="single" w:sz="4" w:color="CCCCCC"/>
-              <w:insideH w:val="single" w:sz="4" w:color="CCCCCC"/>
-              <w:insideV w:val="single" w:sz="4" w:color="CCCCCC"/>
-            </w:tcBorders>
           </w:tcPr>
           <w:p>
             <w:pPr>
@@ -5631,7 +5406,7 @@
                 <w:color w:val="2A324B"/>
                 <w:sz w:val="20"/>
               </w:rPr>
-              <w:t>Alternatywne programy</w:t>
+              <w:t>Programy wsparcia</w:t>
             </w:r>
           </w:p>
         </w:tc>
@@ -5687,7 +5462,7 @@
                 <w:color w:val="2A324B"/>
                 <w:sz w:val="20"/>
               </w:rPr>
-              <w:t>Biblioteka programów zapasowych.</w:t>
+              <w:t>Biblioteka programów wsparcia. Pozycja oznaczona jako rekomendowana trafia do sekcji 02 oferty. Zastąpiła dawny katalog „Programy”.</w:t>
             </w:r>
           </w:p>
         </w:tc>

</xml_diff>

<commit_message>
docs: aktualizacja instrukcji .docx - pelny refresh + wypelnianie z transkrypcji (AI)
Odswiezenie podrecznika K2Biznes Oferta pod aktualny stan aplikacji (po PR #82):
- Czesc I: nowy punkt 3.8 "Wypelnianie z transkrypcji (AI)" + wzmianka w Szybkim
  starcie i w mapie panelu; opis podswietlania pol do sprawdzenia i zasad RODO.
- Czesc II: nowy punkt 9 (endpoint /api/admin/offer-draft, model Claude Haiku,
  parsowanie .docx/.txt, limity, ANTHROPIC_API_KEY, brak zapisu transkryptu)
  oraz wiersz w tabeli stacku.
- Mapa panelu jako lista modulow; katalog "Programy wsparcia" (alt_programs)
  zamiast dawnego "Programy"; model danych zaktualizowany.

Zachowany naglowek, stopka SVG K2, style, numerowanie i motyw oryginalu
(przebudowana wylacznie tresc word/document.xml). Standard dokumentow K2.

Co-Authored-By: Claude Opus 4.8 <noreply@anthropic.com>
Claude-Session: https://claude.ai/code/session_01LHrKKrXzQAJBSi3hKMK7PD
</commit_message>
<xml_diff>
--- a/docs/K2Biznes_Oferta_-_instrukcja_i_architektura.docx
+++ b/docs/K2Biznes_Oferta_-_instrukcja_i_architektura.docx
@@ -43,11 +43,6 @@
     </w:tbl>
     <w:p>
       <w:pPr>
-        <w:spacing w:after="120"/>
-      </w:pPr>
-    </w:p>
-    <w:p>
-      <w:pPr>
         <w:jc w:val="left"/>
         <w:spacing w:before="160" w:after="40"/>
       </w:pPr>
@@ -89,6 +84,21 @@
           <w:sz w:val="22"/>
         </w:rPr>
         <w:t>Dokument ma dwie warstwy. Część I to praktyczna instrukcja dla konsultantów i administratorów tworzących oferty - krok po kroku, prostym językiem. Część II opisuje architekturę systemu dla zespołu technicznego. Kanonem wiedzy technicznej pozostają pliki w repozytorium: docs/BACKEND_SPEC.md oraz docs/TECH_ADMIN_MANUAL.md.</w:t>
+      </w:r>
+    </w:p>
+    <w:p>
+      <w:pPr>
+        <w:jc w:val="both"/>
+        <w:spacing w:after="120" w:before="0"/>
+      </w:pPr>
+      <w:r>
+        <w:rPr>
+          <w:rFonts w:ascii="Roboto Condensed Light" w:hAnsi="Roboto Condensed Light"/>
+          <w:b w:val="0"/>
+          <w:color w:val="2A324B"/>
+          <w:sz w:val="22"/>
+        </w:rPr>
+        <w:t>Nowość w tej wersji: formularz oferty potrafi wstępnie uzupełnić się z transkrypcji spotkania (patrz punkt 3.8 w Części I oraz punkt 9 w Części II).</w:t>
       </w:r>
     </w:p>
     <w:p>
@@ -184,7 +194,16 @@
           <w:color w:val="2A324B"/>
           <w:sz w:val="22"/>
         </w:rPr>
-        <w:t>3. Uzupełnij dane klienta (nazwa firmy jest wymagana). W sekcji „Programy wsparcia” dodaj z biblioteki program, który rekomendujesz, i zaznacz go jako rekomendowany - trafi do sekcji 02 oferty.</w:t>
+        <w:t xml:space="preserve">3. </w:t>
+      </w:r>
+      <w:r>
+        <w:rPr>
+          <w:rFonts w:ascii="Roboto Condensed Light" w:hAnsi="Roboto Condensed Light"/>
+          <w:b w:val="0"/>
+          <w:color w:val="2A324B"/>
+          <w:sz w:val="22"/>
+        </w:rPr>
+        <w:t>Opcjonalnie kliknij Wypełnij z transkrypcji i wklej notatkę lub transkrypcję spotkania - system wstępnie zasili puste pola (patrz punkt 3.8).</w:t>
       </w:r>
     </w:p>
     <w:p>
@@ -209,7 +228,7 @@
           <w:color w:val="2A324B"/>
           <w:sz w:val="22"/>
         </w:rPr>
-        <w:t>Wpisz wartość projektu i ustaw intensywność. Cennik przeliczy się automatycznie. Zaznacz oferowane warianty i wskaż rekomendowany.</w:t>
+        <w:t>Uzupełnij dane klienta (nazwa firmy jest wymagana). W sekcji Programy wsparcia dodaj z biblioteki program, który rekomendujesz, i zaznacz go jako rekomendowany - trafi do sekcji 02 oferty.</w:t>
       </w:r>
     </w:p>
     <w:p>
@@ -234,7 +253,7 @@
           <w:color w:val="2A324B"/>
           <w:sz w:val="22"/>
         </w:rPr>
-        <w:t>Opcjonalnie dostosuj treści, wybierz osobę kontaktową i case study.</w:t>
+        <w:t>Wpisz wartość projektu i ustaw intensywność. Cennik przeliczy się automatycznie. Zaznacz oferowane warianty i wskaż rekomendowany.</w:t>
       </w:r>
     </w:p>
     <w:p>
@@ -259,13 +278,13 @@
           <w:color w:val="2A324B"/>
           <w:sz w:val="22"/>
         </w:rPr>
-        <w:t>Kliknij Stwórz ofertę. Powstanie wersja robocza. Sprawdź wygląd przyciskiem Podgląd.</w:t>
+        <w:t>Opcjonalnie dostosuj treści, wybierz osobę kontaktową i case study.</w:t>
       </w:r>
     </w:p>
     <w:p>
       <w:pPr>
         <w:jc w:val="both"/>
-        <w:spacing w:after="280" w:before="0"/>
+        <w:spacing w:after="80" w:before="0"/>
         <w:ind w:left="360" w:hanging="360"/>
       </w:pPr>
       <w:r>
@@ -276,6 +295,31 @@
           <w:sz w:val="22"/>
         </w:rPr>
         <w:t xml:space="preserve">7. </w:t>
+      </w:r>
+      <w:r>
+        <w:rPr>
+          <w:rFonts w:ascii="Roboto Condensed Light" w:hAnsi="Roboto Condensed Light"/>
+          <w:b w:val="0"/>
+          <w:color w:val="2A324B"/>
+          <w:sz w:val="22"/>
+        </w:rPr>
+        <w:t>Kliknij Stwórz ofertę. Powstanie wersja robocza. Sprawdź wygląd przyciskiem Podgląd.</w:t>
+      </w:r>
+    </w:p>
+    <w:p>
+      <w:pPr>
+        <w:jc w:val="both"/>
+        <w:spacing w:after="80" w:before="0"/>
+        <w:ind w:left="360" w:hanging="360"/>
+      </w:pPr>
+      <w:r>
+        <w:rPr>
+          <w:rFonts w:ascii="Roboto Condensed Light" w:hAnsi="Roboto Condensed Light"/>
+          <w:b w:val="0"/>
+          <w:color w:val="2A324B"/>
+          <w:sz w:val="22"/>
+        </w:rPr>
+        <w:t xml:space="preserve">8. </w:t>
       </w:r>
       <w:r>
         <w:rPr>
@@ -329,62 +373,188 @@
           <w:color w:val="2A324B"/>
           <w:sz w:val="22"/>
         </w:rPr>
-        <w:t>Diagram pokazuje, gdzie w panelu znajdziesz poszczególne funkcje. Moduły opisane jako super_admin są dostępne tylko dla właściciela systemu.</w:t>
+        <w:t>Poniższa lista pokazuje, gdzie w panelu znajdziesz poszczególne funkcje. Moduły opisane jako super_admin są dostępne tylko dla właściciela systemu.</w:t>
       </w:r>
     </w:p>
     <w:p>
       <w:pPr>
-        <w:jc w:val="center"/>
-        <w:spacing w:before="80" w:after="160"/>
+        <w:jc w:val="both"/>
+        <w:spacing w:after="80" w:before="0"/>
+        <w:ind w:left="360" w:hanging="360"/>
       </w:pPr>
       <w:r>
-        <w:drawing xmlns:a="http://schemas.openxmlformats.org/drawingml/2006/main" xmlns:pic="http://schemas.openxmlformats.org/drawingml/2006/picture">
-          <wp:inline distT="0" distB="0" distL="0" distR="0">
-            <wp:extent cx="5375529" cy="5440686"/>
-            <wp:effectExtent l="0" t="0" r="0" b="0"/>
-            <wp:docPr id="6995" name="StopkaK2"/>
-            <wp:cNvGraphicFramePr>
-              <a:graphicFrameLocks noChangeAspect="1"/>
-            </wp:cNvGraphicFramePr>
-            <a:graphic>
-              <a:graphicData uri="http://schemas.openxmlformats.org/drawingml/2006/picture">
-                <pic:pic>
-                  <pic:nvPicPr>
-                    <pic:cNvPr id="6995" name="StopkaK2"/>
-                    <pic:cNvPicPr/>
-                  </pic:nvPicPr>
-                  <pic:blipFill>
-                    <a:blip r:embed="rId9">
-                      <a:extLst>
-                        <a:ext uri="{96DAC541-7B7A-43D3-8B79-37D633B846F1}">
-                          <asvg:svgBlob xmlns:asvg="http://schemas.microsoft.com/office/drawing/2016/SVG/main" r:embed="rId9"/>
-                        </a:ext>
-                      </a:extLst>
-                    </a:blip>
-                    <a:stretch>
-                      <a:fillRect/>
-                    </a:stretch>
-                  </pic:blipFill>
-                  <pic:spPr>
-                    <a:xfrm>
-                      <a:off x="0" y="0"/>
-                      <a:ext cx="5375529" cy="5440686"/>
-                    </a:xfrm>
-                    <a:prstGeom prst="rect">
-                      <a:avLst/>
-                    </a:prstGeom>
-                  </pic:spPr>
-                </pic:pic>
-              </a:graphicData>
-            </a:graphic>
-          </wp:inline>
-        </w:drawing>
+        <w:rPr>
+          <w:rFonts w:ascii="Roboto Condensed Light" w:hAnsi="Roboto Condensed Light"/>
+          <w:b w:val="0"/>
+          <w:color w:val="2A324B"/>
+          <w:sz w:val="22"/>
+        </w:rPr>
+        <w:t xml:space="preserve">-  </w:t>
+      </w:r>
+      <w:r>
+        <w:rPr>
+          <w:rFonts w:ascii="Roboto Condensed Light" w:hAnsi="Roboto Condensed Light"/>
+          <w:b w:val="0"/>
+          <w:color w:val="2A324B"/>
+          <w:sz w:val="22"/>
+        </w:rPr>
+        <w:t>Oferty (/admin/offers) - lista ofert, Nowa oferta, edycja, Aktywność i Podgląd.</w:t>
+      </w:r>
+    </w:p>
+    <w:p>
+      <w:pPr>
+        <w:jc w:val="both"/>
+        <w:spacing w:after="80" w:before="0"/>
+        <w:ind w:left="360" w:hanging="360"/>
+      </w:pPr>
+      <w:r>
+        <w:rPr>
+          <w:rFonts w:ascii="Roboto Condensed Light" w:hAnsi="Roboto Condensed Light"/>
+          <w:b w:val="0"/>
+          <w:color w:val="2A324B"/>
+          <w:sz w:val="22"/>
+        </w:rPr>
+        <w:t xml:space="preserve">-  </w:t>
+      </w:r>
+      <w:r>
+        <w:rPr>
+          <w:rFonts w:ascii="Roboto Condensed Light" w:hAnsi="Roboto Condensed Light"/>
+          <w:b w:val="0"/>
+          <w:color w:val="2A324B"/>
+          <w:sz w:val="22"/>
+        </w:rPr>
+        <w:t>Pulpit (/admin) - wskaźniki sprzedaży: konwersja, wyniki per konsultant, prognoza, symulator. Rola admin i super_admin.</w:t>
+      </w:r>
+    </w:p>
+    <w:p>
+      <w:pPr>
+        <w:jc w:val="both"/>
+        <w:spacing w:after="80" w:before="0"/>
+        <w:ind w:left="360" w:hanging="360"/>
+      </w:pPr>
+      <w:r>
+        <w:rPr>
+          <w:rFonts w:ascii="Roboto Condensed Light" w:hAnsi="Roboto Condensed Light"/>
+          <w:b w:val="0"/>
+          <w:color w:val="2A324B"/>
+          <w:sz w:val="22"/>
+        </w:rPr>
+        <w:t xml:space="preserve">-  </w:t>
+      </w:r>
+      <w:r>
+        <w:rPr>
+          <w:rFonts w:ascii="Roboto Condensed Light" w:hAnsi="Roboto Condensed Light"/>
+          <w:b w:val="0"/>
+          <w:color w:val="2A324B"/>
+          <w:sz w:val="22"/>
+        </w:rPr>
+        <w:t>Programy wsparcia (/admin/alt-programs) - biblioteka programów, z której dodajesz pozycje do oferty.</w:t>
+      </w:r>
+    </w:p>
+    <w:p>
+      <w:pPr>
+        <w:jc w:val="both"/>
+        <w:spacing w:after="80" w:before="0"/>
+        <w:ind w:left="360" w:hanging="360"/>
+      </w:pPr>
+      <w:r>
+        <w:rPr>
+          <w:rFonts w:ascii="Roboto Condensed Light" w:hAnsi="Roboto Condensed Light"/>
+          <w:b w:val="0"/>
+          <w:color w:val="2A324B"/>
+          <w:sz w:val="22"/>
+        </w:rPr>
+        <w:t xml:space="preserve">-  </w:t>
+      </w:r>
+      <w:r>
+        <w:rPr>
+          <w:rFonts w:ascii="Roboto Condensed Light" w:hAnsi="Roboto Condensed Light"/>
+          <w:b w:val="0"/>
+          <w:color w:val="2A324B"/>
+          <w:sz w:val="22"/>
+        </w:rPr>
+        <w:t>Case studies (/admin/case-studies), Osoby kontaktowe (/admin/contact-persons), FAQ (/admin/faq), Szablony (/admin/templates) - katalogi wspólne dla wszystkich ofert.</w:t>
+      </w:r>
+    </w:p>
+    <w:p>
+      <w:pPr>
+        <w:jc w:val="both"/>
+        <w:spacing w:after="80" w:before="0"/>
+        <w:ind w:left="360" w:hanging="360"/>
+      </w:pPr>
+      <w:r>
+        <w:rPr>
+          <w:rFonts w:ascii="Roboto Condensed Light" w:hAnsi="Roboto Condensed Light"/>
+          <w:b w:val="0"/>
+          <w:color w:val="2A324B"/>
+          <w:sz w:val="22"/>
+        </w:rPr>
+        <w:t xml:space="preserve">-  </w:t>
+      </w:r>
+      <w:r>
+        <w:rPr>
+          <w:rFonts w:ascii="Roboto Condensed Light" w:hAnsi="Roboto Condensed Light"/>
+          <w:b w:val="0"/>
+          <w:color w:val="2A324B"/>
+          <w:sz w:val="22"/>
+        </w:rPr>
+        <w:t>Ustawienia firmowe (/admin/ustawienia) - statystyki firmowe i test wysyłki email. Rola super_admin.</w:t>
+      </w:r>
+    </w:p>
+    <w:p>
+      <w:pPr>
+        <w:jc w:val="both"/>
+        <w:spacing w:after="80" w:before="0"/>
+        <w:ind w:left="360" w:hanging="360"/>
+      </w:pPr>
+      <w:r>
+        <w:rPr>
+          <w:rFonts w:ascii="Roboto Condensed Light" w:hAnsi="Roboto Condensed Light"/>
+          <w:b w:val="0"/>
+          <w:color w:val="2A324B"/>
+          <w:sz w:val="22"/>
+        </w:rPr>
+        <w:t xml:space="preserve">-  </w:t>
+      </w:r>
+      <w:r>
+        <w:rPr>
+          <w:rFonts w:ascii="Roboto Condensed Light" w:hAnsi="Roboto Condensed Light"/>
+          <w:b w:val="0"/>
+          <w:color w:val="2A324B"/>
+          <w:sz w:val="22"/>
+        </w:rPr>
+        <w:t>Użytkownicy (/admin/users) - konta i role. Rola super_admin.</w:t>
+      </w:r>
+    </w:p>
+    <w:p>
+      <w:pPr>
+        <w:jc w:val="both"/>
+        <w:spacing w:after="80" w:before="0"/>
+        <w:ind w:left="360" w:hanging="360"/>
+      </w:pPr>
+      <w:r>
+        <w:rPr>
+          <w:rFonts w:ascii="Roboto Condensed Light" w:hAnsi="Roboto Condensed Light"/>
+          <w:b w:val="0"/>
+          <w:color w:val="2A324B"/>
+          <w:sz w:val="22"/>
+        </w:rPr>
+        <w:t xml:space="preserve">-  </w:t>
+      </w:r>
+      <w:r>
+        <w:rPr>
+          <w:rFonts w:ascii="Roboto Condensed Light" w:hAnsi="Roboto Condensed Light"/>
+          <w:b w:val="0"/>
+          <w:color w:val="2A324B"/>
+          <w:sz w:val="22"/>
+        </w:rPr>
+        <w:t>RODO (/admin/gdpr) - obsługa wniosków o usunięcie danych.</w:t>
       </w:r>
     </w:p>
     <w:p>
       <w:pPr>
         <w:jc w:val="left"/>
-        <w:spacing w:before="240" w:after="40"/>
+        <w:spacing w:before="240" w:after="80"/>
       </w:pPr>
       <w:r>
         <w:rPr>
@@ -494,7 +664,7 @@
     <w:p>
       <w:pPr>
         <w:jc w:val="both"/>
-        <w:spacing w:after="280" w:before="0"/>
+        <w:spacing w:after="80" w:before="0"/>
         <w:ind w:left="360" w:hanging="360"/>
       </w:pPr>
       <w:r>
@@ -528,16 +698,7 @@
           <w:color w:val="CE181A"/>
           <w:sz w:val="22"/>
         </w:rPr>
-        <w:t xml:space="preserve">Uwaga: </w:t>
-      </w:r>
-      <w:r>
-        <w:rPr>
-          <w:rFonts w:ascii="Roboto Condensed Light" w:hAnsi="Roboto Condensed Light"/>
-          <w:b w:val="0"/>
-          <w:color w:val="2A324B"/>
-          <w:sz w:val="22"/>
-        </w:rPr>
-        <w:t>Weryfikacja dwuetapowa (kod z aplikacji, TOTP) jest wymagana dla ról admin i super_admin - przy pierwszym logowaniu system poprowadzi Cię przez jej konfigurację. Dla roli consultant jest opcjonalna. Sesja administratora wygasa po 12 godzinach, konsultanta po 30 dniach.</w:t>
+        <w:t>Uwaga: Weryfikacja dwuetapowa (kod z aplikacji, TOTP) jest wymagana dla ról admin i super_admin - przy pierwszym logowaniu system poprowadzi Cię przez jej konfigurację. Dla roli consultant jest opcjonalna. Sesja administratora wygasa po 12 godzinach, konsultanta po 30 dniach.</w:t>
       </w:r>
     </w:p>
     <w:p>
@@ -612,14 +773,13 @@
           <w:color w:val="2A324B"/>
           <w:sz w:val="22"/>
         </w:rPr>
-        <w:t>Formularz jest podzielony na sekcje wypełniane od góry do dołu; ich kolejność odpowiada kolejności sekcji w gotowej ofercie. Pola oznaczone gwiazdką są wymagane, reszta jest opcjonalna.</w:t>
+        <w:t>Formularz jest podzielony na sekcje wypełniane od góry do dołu; ich kolejność odpowiada kolejności sekcji w gotowej ofercie. Pola oznaczone gwiazdką są wymagane, reszta jest opcjonalna. U góry formularza dostępny jest przycisk Wypełnij z transkrypcji, który wstępnie zasila puste pola (patrz punkt 3.8).</w:t>
       </w:r>
     </w:p>
     <w:p>
       <w:pPr>
         <w:jc w:val="left"/>
         <w:spacing w:before="120" w:after="40"/>
-        <w:keepNext/>
       </w:pPr>
       <w:r>
         <w:rPr>
@@ -641,7 +801,7 @@
       <w:tblGrid>
         <w:gridCol w:w="2445"/>
         <w:gridCol w:w="1504"/>
-        <w:gridCol w:w="5455"/>
+        <w:gridCol w:w="5457"/>
       </w:tblGrid>
       <w:tr>
         <w:tc>
@@ -704,7 +864,7 @@
         </w:tc>
         <w:tc>
           <w:tcPr>
-            <w:tcW w:type="dxa" w:w="5455"/>
+            <w:tcW w:type="dxa" w:w="5457"/>
             <w:shd w:fill="2A324B" w:val="clear"/>
             <w:tcBorders>
               <w:top w:val="single" w:sz="4" w:color="CCCCCC"/>
@@ -775,7 +935,7 @@
           </w:tcPr>
           <w:p>
             <w:pPr>
-              <w:jc w:val="both"/>
+              <w:jc w:val="left"/>
               <w:spacing w:after="20" w:before="20"/>
             </w:pPr>
             <w:r>
@@ -791,7 +951,7 @@
         </w:tc>
         <w:tc>
           <w:tcPr>
-            <w:tcW w:type="dxa" w:w="5455"/>
+            <w:tcW w:type="dxa" w:w="5457"/>
             <w:tcBorders>
               <w:top w:val="single" w:sz="4" w:color="CCCCCC"/>
               <w:left w:val="single" w:sz="4" w:color="CCCCCC"/>
@@ -803,7 +963,7 @@
           </w:tcPr>
           <w:p>
             <w:pPr>
-              <w:jc w:val="both"/>
+              <w:jc w:val="left"/>
               <w:spacing w:after="20" w:before="20"/>
             </w:pPr>
             <w:r>
@@ -822,6 +982,7 @@
         <w:tc>
           <w:tcPr>
             <w:tcW w:type="dxa" w:w="2445"/>
+            <w:shd w:fill="ECECEC" w:val="clear"/>
             <w:tcBorders>
               <w:top w:val="single" w:sz="4" w:color="CCCCCC"/>
               <w:left w:val="single" w:sz="4" w:color="CCCCCC"/>
@@ -830,7 +991,6 @@
               <w:insideH w:val="single" w:sz="4" w:color="CCCCCC"/>
               <w:insideV w:val="single" w:sz="4" w:color="CCCCCC"/>
             </w:tcBorders>
-            <w:shd w:fill="ECECEC" w:val="clear"/>
           </w:tcPr>
           <w:p>
             <w:pPr>
@@ -851,6 +1011,7 @@
         <w:tc>
           <w:tcPr>
             <w:tcW w:type="dxa" w:w="1504"/>
+            <w:shd w:fill="ECECEC" w:val="clear"/>
             <w:tcBorders>
               <w:top w:val="single" w:sz="4" w:color="CCCCCC"/>
               <w:left w:val="single" w:sz="4" w:color="CCCCCC"/>
@@ -859,11 +1020,10 @@
               <w:insideH w:val="single" w:sz="4" w:color="CCCCCC"/>
               <w:insideV w:val="single" w:sz="4" w:color="CCCCCC"/>
             </w:tcBorders>
-            <w:shd w:fill="ECECEC" w:val="clear"/>
           </w:tcPr>
           <w:p>
             <w:pPr>
-              <w:jc w:val="both"/>
+              <w:jc w:val="left"/>
               <w:spacing w:after="20" w:before="20"/>
             </w:pPr>
             <w:r>
@@ -879,7 +1039,8 @@
         </w:tc>
         <w:tc>
           <w:tcPr>
-            <w:tcW w:type="dxa" w:w="5455"/>
+            <w:tcW w:type="dxa" w:w="5457"/>
+            <w:shd w:fill="ECECEC" w:val="clear"/>
             <w:tcBorders>
               <w:top w:val="single" w:sz="4" w:color="CCCCCC"/>
               <w:left w:val="single" w:sz="4" w:color="CCCCCC"/>
@@ -888,11 +1049,10 @@
               <w:insideH w:val="single" w:sz="4" w:color="CCCCCC"/>
               <w:insideV w:val="single" w:sz="4" w:color="CCCCCC"/>
             </w:tcBorders>
-            <w:shd w:fill="ECECEC" w:val="clear"/>
           </w:tcPr>
           <w:p>
             <w:pPr>
-              <w:jc w:val="both"/>
+              <w:jc w:val="left"/>
               <w:spacing w:after="20" w:before="20"/>
             </w:pPr>
             <w:r>
@@ -950,7 +1110,7 @@
           </w:tcPr>
           <w:p>
             <w:pPr>
-              <w:jc w:val="both"/>
+              <w:jc w:val="left"/>
               <w:spacing w:after="20" w:before="20"/>
             </w:pPr>
             <w:r>
@@ -966,7 +1126,7 @@
         </w:tc>
         <w:tc>
           <w:tcPr>
-            <w:tcW w:type="dxa" w:w="5455"/>
+            <w:tcW w:type="dxa" w:w="5457"/>
             <w:tcBorders>
               <w:top w:val="single" w:sz="4" w:color="CCCCCC"/>
               <w:left w:val="single" w:sz="4" w:color="CCCCCC"/>
@@ -978,7 +1138,7 @@
           </w:tcPr>
           <w:p>
             <w:pPr>
-              <w:jc w:val="both"/>
+              <w:jc w:val="left"/>
               <w:spacing w:after="20" w:before="20"/>
             </w:pPr>
             <w:r>
@@ -997,6 +1157,7 @@
         <w:tc>
           <w:tcPr>
             <w:tcW w:type="dxa" w:w="2445"/>
+            <w:shd w:fill="ECECEC" w:val="clear"/>
             <w:tcBorders>
               <w:top w:val="single" w:sz="4" w:color="CCCCCC"/>
               <w:left w:val="single" w:sz="4" w:color="CCCCCC"/>
@@ -1005,7 +1166,6 @@
               <w:insideH w:val="single" w:sz="4" w:color="CCCCCC"/>
               <w:insideV w:val="single" w:sz="4" w:color="CCCCCC"/>
             </w:tcBorders>
-            <w:shd w:fill="ECECEC" w:val="clear"/>
           </w:tcPr>
           <w:p>
             <w:pPr>
@@ -1026,6 +1186,7 @@
         <w:tc>
           <w:tcPr>
             <w:tcW w:type="dxa" w:w="1504"/>
+            <w:shd w:fill="ECECEC" w:val="clear"/>
             <w:tcBorders>
               <w:top w:val="single" w:sz="4" w:color="CCCCCC"/>
               <w:left w:val="single" w:sz="4" w:color="CCCCCC"/>
@@ -1034,11 +1195,10 @@
               <w:insideH w:val="single" w:sz="4" w:color="CCCCCC"/>
               <w:insideV w:val="single" w:sz="4" w:color="CCCCCC"/>
             </w:tcBorders>
-            <w:shd w:fill="ECECEC" w:val="clear"/>
           </w:tcPr>
           <w:p>
             <w:pPr>
-              <w:jc w:val="both"/>
+              <w:jc w:val="left"/>
               <w:spacing w:after="20" w:before="20"/>
             </w:pPr>
             <w:r>
@@ -1054,7 +1214,8 @@
         </w:tc>
         <w:tc>
           <w:tcPr>
-            <w:tcW w:type="dxa" w:w="5455"/>
+            <w:tcW w:type="dxa" w:w="5457"/>
+            <w:shd w:fill="ECECEC" w:val="clear"/>
             <w:tcBorders>
               <w:top w:val="single" w:sz="4" w:color="CCCCCC"/>
               <w:left w:val="single" w:sz="4" w:color="CCCCCC"/>
@@ -1063,11 +1224,10 @@
               <w:insideH w:val="single" w:sz="4" w:color="CCCCCC"/>
               <w:insideV w:val="single" w:sz="4" w:color="CCCCCC"/>
             </w:tcBorders>
-            <w:shd w:fill="ECECEC" w:val="clear"/>
           </w:tcPr>
           <w:p>
             <w:pPr>
-              <w:jc w:val="both"/>
+              <w:jc w:val="left"/>
               <w:spacing w:after="20" w:before="20"/>
             </w:pPr>
             <w:r>
@@ -1125,7 +1285,7 @@
           </w:tcPr>
           <w:p>
             <w:pPr>
-              <w:jc w:val="both"/>
+              <w:jc w:val="left"/>
               <w:spacing w:after="20" w:before="20"/>
             </w:pPr>
             <w:r>
@@ -1141,7 +1301,7 @@
         </w:tc>
         <w:tc>
           <w:tcPr>
-            <w:tcW w:type="dxa" w:w="5455"/>
+            <w:tcW w:type="dxa" w:w="5457"/>
             <w:tcBorders>
               <w:top w:val="single" w:sz="4" w:color="CCCCCC"/>
               <w:left w:val="single" w:sz="4" w:color="CCCCCC"/>
@@ -1153,7 +1313,7 @@
           </w:tcPr>
           <w:p>
             <w:pPr>
-              <w:jc w:val="both"/>
+              <w:jc w:val="left"/>
               <w:spacing w:after="20" w:before="20"/>
             </w:pPr>
             <w:r>
@@ -1172,6 +1332,7 @@
         <w:tc>
           <w:tcPr>
             <w:tcW w:type="dxa" w:w="2445"/>
+            <w:shd w:fill="ECECEC" w:val="clear"/>
             <w:tcBorders>
               <w:top w:val="single" w:sz="4" w:color="CCCCCC"/>
               <w:left w:val="single" w:sz="4" w:color="CCCCCC"/>
@@ -1180,7 +1341,6 @@
               <w:insideH w:val="single" w:sz="4" w:color="CCCCCC"/>
               <w:insideV w:val="single" w:sz="4" w:color="CCCCCC"/>
             </w:tcBorders>
-            <w:shd w:fill="ECECEC" w:val="clear"/>
           </w:tcPr>
           <w:p>
             <w:pPr>
@@ -1201,6 +1361,7 @@
         <w:tc>
           <w:tcPr>
             <w:tcW w:type="dxa" w:w="1504"/>
+            <w:shd w:fill="ECECEC" w:val="clear"/>
             <w:tcBorders>
               <w:top w:val="single" w:sz="4" w:color="CCCCCC"/>
               <w:left w:val="single" w:sz="4" w:color="CCCCCC"/>
@@ -1209,11 +1370,10 @@
               <w:insideH w:val="single" w:sz="4" w:color="CCCCCC"/>
               <w:insideV w:val="single" w:sz="4" w:color="CCCCCC"/>
             </w:tcBorders>
-            <w:shd w:fill="ECECEC" w:val="clear"/>
           </w:tcPr>
           <w:p>
             <w:pPr>
-              <w:jc w:val="both"/>
+              <w:jc w:val="left"/>
               <w:spacing w:after="20" w:before="20"/>
             </w:pPr>
             <w:r>
@@ -1229,7 +1389,8 @@
         </w:tc>
         <w:tc>
           <w:tcPr>
-            <w:tcW w:type="dxa" w:w="5455"/>
+            <w:tcW w:type="dxa" w:w="5457"/>
+            <w:shd w:fill="ECECEC" w:val="clear"/>
             <w:tcBorders>
               <w:top w:val="single" w:sz="4" w:color="CCCCCC"/>
               <w:left w:val="single" w:sz="4" w:color="CCCCCC"/>
@@ -1238,11 +1399,10 @@
               <w:insideH w:val="single" w:sz="4" w:color="CCCCCC"/>
               <w:insideV w:val="single" w:sz="4" w:color="CCCCCC"/>
             </w:tcBorders>
-            <w:shd w:fill="ECECEC" w:val="clear"/>
           </w:tcPr>
           <w:p>
             <w:pPr>
-              <w:jc w:val="both"/>
+              <w:jc w:val="left"/>
               <w:spacing w:after="20" w:before="20"/>
             </w:pPr>
             <w:r>
@@ -1260,14 +1420,8 @@
     </w:tbl>
     <w:p>
       <w:pPr>
-        <w:spacing w:after="80"/>
-      </w:pPr>
-    </w:p>
-    <w:p>
-      <w:pPr>
         <w:jc w:val="left"/>
         <w:spacing w:before="120" w:after="40"/>
-        <w:keepNext/>
       </w:pPr>
       <w:r>
         <w:rPr>
@@ -1289,7 +1443,7 @@
       <w:tblGrid>
         <w:gridCol w:w="2445"/>
         <w:gridCol w:w="1504"/>
-        <w:gridCol w:w="5455"/>
+        <w:gridCol w:w="5457"/>
       </w:tblGrid>
       <w:tr>
         <w:tc>
@@ -1352,7 +1506,7 @@
         </w:tc>
         <w:tc>
           <w:tcPr>
-            <w:tcW w:type="dxa" w:w="5455"/>
+            <w:tcW w:type="dxa" w:w="5457"/>
             <w:shd w:fill="2A324B" w:val="clear"/>
             <w:tcBorders>
               <w:top w:val="single" w:sz="4" w:color="CCCCCC"/>
@@ -1423,7 +1577,7 @@
           </w:tcPr>
           <w:p>
             <w:pPr>
-              <w:jc w:val="both"/>
+              <w:jc w:val="left"/>
               <w:spacing w:after="20" w:before="20"/>
             </w:pPr>
             <w:r>
@@ -1439,7 +1593,7 @@
         </w:tc>
         <w:tc>
           <w:tcPr>
-            <w:tcW w:type="dxa" w:w="5455"/>
+            <w:tcW w:type="dxa" w:w="5457"/>
             <w:tcBorders>
               <w:top w:val="single" w:sz="4" w:color="CCCCCC"/>
               <w:left w:val="single" w:sz="4" w:color="CCCCCC"/>
@@ -1451,7 +1605,7 @@
           </w:tcPr>
           <w:p>
             <w:pPr>
-              <w:jc w:val="both"/>
+              <w:jc w:val="left"/>
               <w:spacing w:after="20" w:before="20"/>
             </w:pPr>
             <w:r>
@@ -1470,6 +1624,7 @@
         <w:tc>
           <w:tcPr>
             <w:tcW w:type="dxa" w:w="2445"/>
+            <w:shd w:fill="ECECEC" w:val="clear"/>
             <w:tcBorders>
               <w:top w:val="single" w:sz="4" w:color="CCCCCC"/>
               <w:left w:val="single" w:sz="4" w:color="CCCCCC"/>
@@ -1498,6 +1653,7 @@
         <w:tc>
           <w:tcPr>
             <w:tcW w:type="dxa" w:w="1504"/>
+            <w:shd w:fill="ECECEC" w:val="clear"/>
             <w:tcBorders>
               <w:top w:val="single" w:sz="4" w:color="CCCCCC"/>
               <w:left w:val="single" w:sz="4" w:color="CCCCCC"/>
@@ -1509,7 +1665,7 @@
           </w:tcPr>
           <w:p>
             <w:pPr>
-              <w:jc w:val="both"/>
+              <w:jc w:val="left"/>
               <w:spacing w:after="20" w:before="20"/>
             </w:pPr>
             <w:r>
@@ -1525,7 +1681,8 @@
         </w:tc>
         <w:tc>
           <w:tcPr>
-            <w:tcW w:type="dxa" w:w="5455"/>
+            <w:tcW w:type="dxa" w:w="5457"/>
+            <w:shd w:fill="ECECEC" w:val="clear"/>
             <w:tcBorders>
               <w:top w:val="single" w:sz="4" w:color="CCCCCC"/>
               <w:left w:val="single" w:sz="4" w:color="CCCCCC"/>
@@ -1537,7 +1694,7 @@
           </w:tcPr>
           <w:p>
             <w:pPr>
-              <w:jc w:val="both"/>
+              <w:jc w:val="left"/>
               <w:spacing w:after="20" w:before="20"/>
             </w:pPr>
             <w:r>
@@ -1595,7 +1752,7 @@
           </w:tcPr>
           <w:p>
             <w:pPr>
-              <w:jc w:val="both"/>
+              <w:jc w:val="left"/>
               <w:spacing w:after="20" w:before="20"/>
             </w:pPr>
             <w:r>
@@ -1611,7 +1768,7 @@
         </w:tc>
         <w:tc>
           <w:tcPr>
-            <w:tcW w:type="dxa" w:w="5455"/>
+            <w:tcW w:type="dxa" w:w="5457"/>
             <w:tcBorders>
               <w:top w:val="single" w:sz="4" w:color="CCCCCC"/>
               <w:left w:val="single" w:sz="4" w:color="CCCCCC"/>
@@ -1623,7 +1780,7 @@
           </w:tcPr>
           <w:p>
             <w:pPr>
-              <w:jc w:val="both"/>
+              <w:jc w:val="left"/>
               <w:spacing w:after="20" w:before="20"/>
             </w:pPr>
             <w:r>
@@ -1641,14 +1798,8 @@
     </w:tbl>
     <w:p>
       <w:pPr>
-        <w:spacing w:after="80"/>
-      </w:pPr>
-    </w:p>
-    <w:p>
-      <w:pPr>
         <w:jc w:val="left"/>
         <w:spacing w:before="120" w:after="40"/>
-        <w:keepNext/>
       </w:pPr>
       <w:r>
         <w:rPr>
@@ -1670,7 +1821,7 @@
       <w:tblGrid>
         <w:gridCol w:w="2445"/>
         <w:gridCol w:w="1504"/>
-        <w:gridCol w:w="5455"/>
+        <w:gridCol w:w="5457"/>
       </w:tblGrid>
       <w:tr>
         <w:tc>
@@ -1733,7 +1884,7 @@
         </w:tc>
         <w:tc>
           <w:tcPr>
-            <w:tcW w:type="dxa" w:w="5455"/>
+            <w:tcW w:type="dxa" w:w="5457"/>
             <w:shd w:fill="2A324B" w:val="clear"/>
             <w:tcBorders>
               <w:top w:val="single" w:sz="4" w:color="CCCCCC"/>
@@ -1804,7 +1955,7 @@
           </w:tcPr>
           <w:p>
             <w:pPr>
-              <w:jc w:val="both"/>
+              <w:jc w:val="left"/>
               <w:spacing w:after="20" w:before="20"/>
             </w:pPr>
             <w:r>
@@ -1820,7 +1971,7 @@
         </w:tc>
         <w:tc>
           <w:tcPr>
-            <w:tcW w:type="dxa" w:w="5455"/>
+            <w:tcW w:type="dxa" w:w="5457"/>
             <w:tcBorders>
               <w:top w:val="single" w:sz="4" w:color="CCCCCC"/>
               <w:left w:val="single" w:sz="4" w:color="CCCCCC"/>
@@ -1832,7 +1983,7 @@
           </w:tcPr>
           <w:p>
             <w:pPr>
-              <w:jc w:val="both"/>
+              <w:jc w:val="left"/>
               <w:spacing w:after="20" w:before="20"/>
             </w:pPr>
             <w:r>
@@ -1851,6 +2002,7 @@
         <w:tc>
           <w:tcPr>
             <w:tcW w:type="dxa" w:w="2445"/>
+            <w:shd w:fill="ECECEC" w:val="clear"/>
             <w:tcBorders>
               <w:top w:val="single" w:sz="4" w:color="CCCCCC"/>
               <w:left w:val="single" w:sz="4" w:color="CCCCCC"/>
@@ -1879,6 +2031,7 @@
         <w:tc>
           <w:tcPr>
             <w:tcW w:type="dxa" w:w="1504"/>
+            <w:shd w:fill="ECECEC" w:val="clear"/>
             <w:tcBorders>
               <w:top w:val="single" w:sz="4" w:color="CCCCCC"/>
               <w:left w:val="single" w:sz="4" w:color="CCCCCC"/>
@@ -1890,7 +2043,7 @@
           </w:tcPr>
           <w:p>
             <w:pPr>
-              <w:jc w:val="both"/>
+              <w:jc w:val="left"/>
               <w:spacing w:after="20" w:before="20"/>
             </w:pPr>
             <w:r>
@@ -1906,7 +2059,8 @@
         </w:tc>
         <w:tc>
           <w:tcPr>
-            <w:tcW w:type="dxa" w:w="5455"/>
+            <w:tcW w:type="dxa" w:w="5457"/>
+            <w:shd w:fill="ECECEC" w:val="clear"/>
             <w:tcBorders>
               <w:top w:val="single" w:sz="4" w:color="CCCCCC"/>
               <w:left w:val="single" w:sz="4" w:color="CCCCCC"/>
@@ -1918,7 +2072,7 @@
           </w:tcPr>
           <w:p>
             <w:pPr>
-              <w:jc w:val="both"/>
+              <w:jc w:val="left"/>
               <w:spacing w:after="20" w:before="20"/>
             </w:pPr>
             <w:r>
@@ -1976,7 +2130,7 @@
           </w:tcPr>
           <w:p>
             <w:pPr>
-              <w:jc w:val="both"/>
+              <w:jc w:val="left"/>
               <w:spacing w:after="20" w:before="20"/>
             </w:pPr>
             <w:r>
@@ -1992,7 +2146,7 @@
         </w:tc>
         <w:tc>
           <w:tcPr>
-            <w:tcW w:type="dxa" w:w="5455"/>
+            <w:tcW w:type="dxa" w:w="5457"/>
             <w:tcBorders>
               <w:top w:val="single" w:sz="4" w:color="CCCCCC"/>
               <w:left w:val="single" w:sz="4" w:color="CCCCCC"/>
@@ -2004,7 +2158,7 @@
           </w:tcPr>
           <w:p>
             <w:pPr>
-              <w:jc w:val="both"/>
+              <w:jc w:val="left"/>
               <w:spacing w:after="20" w:before="20"/>
             </w:pPr>
             <w:r>
@@ -2023,6 +2177,7 @@
         <w:tc>
           <w:tcPr>
             <w:tcW w:type="dxa" w:w="2445"/>
+            <w:shd w:fill="ECECEC" w:val="clear"/>
             <w:tcBorders>
               <w:top w:val="single" w:sz="4" w:color="CCCCCC"/>
               <w:left w:val="single" w:sz="4" w:color="CCCCCC"/>
@@ -2051,6 +2206,7 @@
         <w:tc>
           <w:tcPr>
             <w:tcW w:type="dxa" w:w="1504"/>
+            <w:shd w:fill="ECECEC" w:val="clear"/>
             <w:tcBorders>
               <w:top w:val="single" w:sz="4" w:color="CCCCCC"/>
               <w:left w:val="single" w:sz="4" w:color="CCCCCC"/>
@@ -2062,7 +2218,7 @@
           </w:tcPr>
           <w:p>
             <w:pPr>
-              <w:jc w:val="both"/>
+              <w:jc w:val="left"/>
               <w:spacing w:after="20" w:before="20"/>
             </w:pPr>
             <w:r>
@@ -2078,7 +2234,8 @@
         </w:tc>
         <w:tc>
           <w:tcPr>
-            <w:tcW w:type="dxa" w:w="5455"/>
+            <w:tcW w:type="dxa" w:w="5457"/>
+            <w:shd w:fill="ECECEC" w:val="clear"/>
             <w:tcBorders>
               <w:top w:val="single" w:sz="4" w:color="CCCCCC"/>
               <w:left w:val="single" w:sz="4" w:color="CCCCCC"/>
@@ -2090,7 +2247,7 @@
           </w:tcPr>
           <w:p>
             <w:pPr>
-              <w:jc w:val="both"/>
+              <w:jc w:val="left"/>
               <w:spacing w:after="20" w:before="20"/>
             </w:pPr>
             <w:r>
@@ -2108,11 +2265,6 @@
     </w:tbl>
     <w:p>
       <w:pPr>
-        <w:spacing w:after="80"/>
-      </w:pPr>
-    </w:p>
-    <w:p>
-      <w:pPr>
         <w:jc w:val="both"/>
         <w:spacing w:after="120" w:before="0"/>
       </w:pPr>
@@ -2123,23 +2275,13 @@
           <w:color w:val="CE181A"/>
           <w:sz w:val="22"/>
         </w:rPr>
-        <w:t xml:space="preserve">Uwaga: </w:t>
-      </w:r>
-      <w:r>
-        <w:rPr>
-          <w:rFonts w:ascii="Roboto Condensed Light" w:hAnsi="Roboto Condensed Light"/>
-          <w:b w:val="0"/>
-          <w:color w:val="2A324B"/>
-          <w:sz w:val="22"/>
-        </w:rPr>
-        <w:t>Każda zmiana finansów uruchamia podgląd cennika na żywo, aktualizowany po krótkiej chwili od ostatniej edycji.</w:t>
+        <w:t>Uwaga: Każda zmiana finansów uruchamia podgląd cennika na żywo, aktualizowany po krótkiej chwili od ostatniej edycji.</w:t>
       </w:r>
     </w:p>
     <w:p>
       <w:pPr>
         <w:jc w:val="left"/>
         <w:spacing w:before="120" w:after="40"/>
-        <w:keepNext/>
       </w:pPr>
       <w:r>
         <w:rPr>
@@ -2189,13 +2331,13 @@
         <w:tblLayout w:type="fixed"/>
       </w:tblPr>
       <w:tblGrid>
-        <w:gridCol w:w="3009"/>
-        <w:gridCol w:w="6396"/>
+        <w:gridCol w:w="2600"/>
+        <w:gridCol w:w="6806"/>
       </w:tblGrid>
       <w:tr>
         <w:tc>
           <w:tcPr>
-            <w:tcW w:type="dxa" w:w="3009"/>
+            <w:tcW w:type="dxa" w:w="2600"/>
             <w:shd w:fill="2A324B" w:val="clear"/>
             <w:tcBorders>
               <w:top w:val="single" w:sz="4" w:color="CCCCCC"/>
@@ -2224,7 +2366,7 @@
         </w:tc>
         <w:tc>
           <w:tcPr>
-            <w:tcW w:type="dxa" w:w="6396"/>
+            <w:tcW w:type="dxa" w:w="6806"/>
             <w:shd w:fill="2A324B" w:val="clear"/>
             <w:tcBorders>
               <w:top w:val="single" w:sz="4" w:color="CCCCCC"/>
@@ -2255,7 +2397,7 @@
       <w:tr>
         <w:tc>
           <w:tcPr>
-            <w:tcW w:type="dxa" w:w="3009"/>
+            <w:tcW w:type="dxa" w:w="2600"/>
             <w:tcBorders>
               <w:top w:val="single" w:sz="4" w:color="CCCCCC"/>
               <w:left w:val="single" w:sz="4" w:color="CCCCCC"/>
@@ -2283,7 +2425,7 @@
         </w:tc>
         <w:tc>
           <w:tcPr>
-            <w:tcW w:type="dxa" w:w="6396"/>
+            <w:tcW w:type="dxa" w:w="6806"/>
             <w:tcBorders>
               <w:top w:val="single" w:sz="4" w:color="CCCCCC"/>
               <w:left w:val="single" w:sz="4" w:color="CCCCCC"/>
@@ -2295,7 +2437,7 @@
           </w:tcPr>
           <w:p>
             <w:pPr>
-              <w:jc w:val="both"/>
+              <w:jc w:val="left"/>
               <w:spacing w:after="20" w:before="20"/>
             </w:pPr>
             <w:r>
@@ -2313,7 +2455,8 @@
       <w:tr>
         <w:tc>
           <w:tcPr>
-            <w:tcW w:type="dxa" w:w="3009"/>
+            <w:tcW w:type="dxa" w:w="2600"/>
+            <w:shd w:fill="ECECEC" w:val="clear"/>
             <w:tcBorders>
               <w:top w:val="single" w:sz="4" w:color="CCCCCC"/>
               <w:left w:val="single" w:sz="4" w:color="CCCCCC"/>
@@ -2322,7 +2465,6 @@
               <w:insideH w:val="single" w:sz="4" w:color="CCCCCC"/>
               <w:insideV w:val="single" w:sz="4" w:color="CCCCCC"/>
             </w:tcBorders>
-            <w:shd w:fill="ECECEC" w:val="clear"/>
           </w:tcPr>
           <w:p>
             <w:pPr>
@@ -2342,7 +2484,8 @@
         </w:tc>
         <w:tc>
           <w:tcPr>
-            <w:tcW w:type="dxa" w:w="6396"/>
+            <w:tcW w:type="dxa" w:w="6806"/>
+            <w:shd w:fill="ECECEC" w:val="clear"/>
             <w:tcBorders>
               <w:top w:val="single" w:sz="4" w:color="CCCCCC"/>
               <w:left w:val="single" w:sz="4" w:color="CCCCCC"/>
@@ -2351,11 +2494,10 @@
               <w:insideH w:val="single" w:sz="4" w:color="CCCCCC"/>
               <w:insideV w:val="single" w:sz="4" w:color="CCCCCC"/>
             </w:tcBorders>
-            <w:shd w:fill="ECECEC" w:val="clear"/>
           </w:tcPr>
           <w:p>
             <w:pPr>
-              <w:jc w:val="both"/>
+              <w:jc w:val="left"/>
               <w:spacing w:after="20" w:before="20"/>
             </w:pPr>
             <w:r>
@@ -2373,7 +2515,7 @@
       <w:tr>
         <w:tc>
           <w:tcPr>
-            <w:tcW w:type="dxa" w:w="3009"/>
+            <w:tcW w:type="dxa" w:w="2600"/>
             <w:tcBorders>
               <w:top w:val="single" w:sz="4" w:color="CCCCCC"/>
               <w:left w:val="single" w:sz="4" w:color="CCCCCC"/>
@@ -2401,7 +2543,7 @@
         </w:tc>
         <w:tc>
           <w:tcPr>
-            <w:tcW w:type="dxa" w:w="6396"/>
+            <w:tcW w:type="dxa" w:w="6806"/>
             <w:tcBorders>
               <w:top w:val="single" w:sz="4" w:color="CCCCCC"/>
               <w:left w:val="single" w:sz="4" w:color="CCCCCC"/>
@@ -2413,7 +2555,7 @@
           </w:tcPr>
           <w:p>
             <w:pPr>
-              <w:jc w:val="both"/>
+              <w:jc w:val="left"/>
               <w:spacing w:after="20" w:before="20"/>
             </w:pPr>
             <w:r>
@@ -2431,7 +2573,8 @@
       <w:tr>
         <w:tc>
           <w:tcPr>
-            <w:tcW w:type="dxa" w:w="3009"/>
+            <w:tcW w:type="dxa" w:w="2600"/>
+            <w:shd w:fill="ECECEC" w:val="clear"/>
             <w:tcBorders>
               <w:top w:val="single" w:sz="4" w:color="CCCCCC"/>
               <w:left w:val="single" w:sz="4" w:color="CCCCCC"/>
@@ -2440,7 +2583,6 @@
               <w:insideH w:val="single" w:sz="4" w:color="CCCCCC"/>
               <w:insideV w:val="single" w:sz="4" w:color="CCCCCC"/>
             </w:tcBorders>
-            <w:shd w:fill="ECECEC" w:val="clear"/>
           </w:tcPr>
           <w:p>
             <w:pPr>
@@ -2460,7 +2602,8 @@
         </w:tc>
         <w:tc>
           <w:tcPr>
-            <w:tcW w:type="dxa" w:w="6396"/>
+            <w:tcW w:type="dxa" w:w="6806"/>
+            <w:shd w:fill="ECECEC" w:val="clear"/>
             <w:tcBorders>
               <w:top w:val="single" w:sz="4" w:color="CCCCCC"/>
               <w:left w:val="single" w:sz="4" w:color="CCCCCC"/>
@@ -2469,11 +2612,10 @@
               <w:insideH w:val="single" w:sz="4" w:color="CCCCCC"/>
               <w:insideV w:val="single" w:sz="4" w:color="CCCCCC"/>
             </w:tcBorders>
-            <w:shd w:fill="ECECEC" w:val="clear"/>
           </w:tcPr>
           <w:p>
             <w:pPr>
-              <w:jc w:val="both"/>
+              <w:jc w:val="left"/>
               <w:spacing w:after="20" w:before="20"/>
             </w:pPr>
             <w:r>
@@ -2491,7 +2633,7 @@
       <w:tr>
         <w:tc>
           <w:tcPr>
-            <w:tcW w:type="dxa" w:w="3009"/>
+            <w:tcW w:type="dxa" w:w="2600"/>
             <w:tcBorders>
               <w:top w:val="single" w:sz="4" w:color="CCCCCC"/>
               <w:left w:val="single" w:sz="4" w:color="CCCCCC"/>
@@ -2519,7 +2661,7 @@
         </w:tc>
         <w:tc>
           <w:tcPr>
-            <w:tcW w:type="dxa" w:w="6396"/>
+            <w:tcW w:type="dxa" w:w="6806"/>
             <w:tcBorders>
               <w:top w:val="single" w:sz="4" w:color="CCCCCC"/>
               <w:left w:val="single" w:sz="4" w:color="CCCCCC"/>
@@ -2531,7 +2673,7 @@
           </w:tcPr>
           <w:p>
             <w:pPr>
-              <w:jc w:val="both"/>
+              <w:jc w:val="left"/>
               <w:spacing w:after="20" w:before="20"/>
             </w:pPr>
             <w:r>
@@ -2549,7 +2691,8 @@
       <w:tr>
         <w:tc>
           <w:tcPr>
-            <w:tcW w:type="dxa" w:w="3009"/>
+            <w:tcW w:type="dxa" w:w="2600"/>
+            <w:shd w:fill="ECECEC" w:val="clear"/>
             <w:tcBorders>
               <w:top w:val="single" w:sz="4" w:color="CCCCCC"/>
               <w:left w:val="single" w:sz="4" w:color="CCCCCC"/>
@@ -2558,7 +2701,6 @@
               <w:insideH w:val="single" w:sz="4" w:color="CCCCCC"/>
               <w:insideV w:val="single" w:sz="4" w:color="CCCCCC"/>
             </w:tcBorders>
-            <w:shd w:fill="ECECEC" w:val="clear"/>
           </w:tcPr>
           <w:p>
             <w:pPr>
@@ -2578,7 +2720,8 @@
         </w:tc>
         <w:tc>
           <w:tcPr>
-            <w:tcW w:type="dxa" w:w="6396"/>
+            <w:tcW w:type="dxa" w:w="6806"/>
+            <w:shd w:fill="ECECEC" w:val="clear"/>
             <w:tcBorders>
               <w:top w:val="single" w:sz="4" w:color="CCCCCC"/>
               <w:left w:val="single" w:sz="4" w:color="CCCCCC"/>
@@ -2587,11 +2730,10 @@
               <w:insideH w:val="single" w:sz="4" w:color="CCCCCC"/>
               <w:insideV w:val="single" w:sz="4" w:color="CCCCCC"/>
             </w:tcBorders>
-            <w:shd w:fill="ECECEC" w:val="clear"/>
           </w:tcPr>
           <w:p>
             <w:pPr>
-              <w:jc w:val="both"/>
+              <w:jc w:val="left"/>
               <w:spacing w:after="20" w:before="20"/>
             </w:pPr>
             <w:r>
@@ -2607,11 +2749,6 @@
         </w:tc>
       </w:tr>
     </w:tbl>
-    <w:p>
-      <w:pPr>
-        <w:spacing w:after="80"/>
-      </w:pPr>
-    </w:p>
     <w:p>
       <w:pPr>
         <w:jc w:val="both"/>
@@ -2665,7 +2802,7 @@
     <w:p>
       <w:pPr>
         <w:jc w:val="both"/>
-        <w:spacing w:after="280" w:before="0"/>
+        <w:spacing w:after="80" w:before="0"/>
         <w:ind w:left="360" w:hanging="360"/>
       </w:pPr>
       <w:r>
@@ -2691,7 +2828,6 @@
       <w:pPr>
         <w:jc w:val="left"/>
         <w:spacing w:before="120" w:after="40"/>
-        <w:keepNext/>
       </w:pPr>
       <w:r>
         <w:rPr>
@@ -2726,13 +2862,13 @@
         <w:tblLayout w:type="fixed"/>
       </w:tblPr>
       <w:tblGrid>
-        <w:gridCol w:w="3009"/>
-        <w:gridCol w:w="6396"/>
+        <w:gridCol w:w="2600"/>
+        <w:gridCol w:w="6806"/>
       </w:tblGrid>
       <w:tr>
         <w:tc>
           <w:tcPr>
-            <w:tcW w:type="dxa" w:w="3009"/>
+            <w:tcW w:type="dxa" w:w="2600"/>
             <w:shd w:fill="2A324B" w:val="clear"/>
             <w:tcBorders>
               <w:top w:val="single" w:sz="4" w:color="CCCCCC"/>
@@ -2761,7 +2897,7 @@
         </w:tc>
         <w:tc>
           <w:tcPr>
-            <w:tcW w:type="dxa" w:w="6396"/>
+            <w:tcW w:type="dxa" w:w="6806"/>
             <w:shd w:fill="2A324B" w:val="clear"/>
             <w:tcBorders>
               <w:top w:val="single" w:sz="4" w:color="CCCCCC"/>
@@ -2792,7 +2928,7 @@
       <w:tr>
         <w:tc>
           <w:tcPr>
-            <w:tcW w:type="dxa" w:w="3009"/>
+            <w:tcW w:type="dxa" w:w="2600"/>
             <w:tcBorders>
               <w:top w:val="single" w:sz="4" w:color="CCCCCC"/>
               <w:left w:val="single" w:sz="4" w:color="CCCCCC"/>
@@ -2820,7 +2956,7 @@
         </w:tc>
         <w:tc>
           <w:tcPr>
-            <w:tcW w:type="dxa" w:w="6396"/>
+            <w:tcW w:type="dxa" w:w="6806"/>
             <w:tcBorders>
               <w:top w:val="single" w:sz="4" w:color="CCCCCC"/>
               <w:left w:val="single" w:sz="4" w:color="CCCCCC"/>
@@ -2832,7 +2968,7 @@
           </w:tcPr>
           <w:p>
             <w:pPr>
-              <w:jc w:val="both"/>
+              <w:jc w:val="left"/>
               <w:spacing w:after="20" w:before="20"/>
             </w:pPr>
             <w:r>
@@ -2850,7 +2986,8 @@
       <w:tr>
         <w:tc>
           <w:tcPr>
-            <w:tcW w:type="dxa" w:w="3009"/>
+            <w:tcW w:type="dxa" w:w="2600"/>
+            <w:shd w:fill="ECECEC" w:val="clear"/>
             <w:tcBorders>
               <w:top w:val="single" w:sz="4" w:color="CCCCCC"/>
               <w:left w:val="single" w:sz="4" w:color="CCCCCC"/>
@@ -2878,7 +3015,8 @@
         </w:tc>
         <w:tc>
           <w:tcPr>
-            <w:tcW w:type="dxa" w:w="6396"/>
+            <w:tcW w:type="dxa" w:w="6806"/>
+            <w:shd w:fill="ECECEC" w:val="clear"/>
             <w:tcBorders>
               <w:top w:val="single" w:sz="4" w:color="CCCCCC"/>
               <w:left w:val="single" w:sz="4" w:color="CCCCCC"/>
@@ -2890,7 +3028,7 @@
           </w:tcPr>
           <w:p>
             <w:pPr>
-              <w:jc w:val="both"/>
+              <w:jc w:val="left"/>
               <w:spacing w:after="20" w:before="20"/>
             </w:pPr>
             <w:r>
@@ -2908,7 +3046,7 @@
       <w:tr>
         <w:tc>
           <w:tcPr>
-            <w:tcW w:type="dxa" w:w="3009"/>
+            <w:tcW w:type="dxa" w:w="2600"/>
             <w:tcBorders>
               <w:top w:val="single" w:sz="4" w:color="CCCCCC"/>
               <w:left w:val="single" w:sz="4" w:color="CCCCCC"/>
@@ -2936,7 +3074,7 @@
         </w:tc>
         <w:tc>
           <w:tcPr>
-            <w:tcW w:type="dxa" w:w="6396"/>
+            <w:tcW w:type="dxa" w:w="6806"/>
             <w:tcBorders>
               <w:top w:val="single" w:sz="4" w:color="CCCCCC"/>
               <w:left w:val="single" w:sz="4" w:color="CCCCCC"/>
@@ -2948,7 +3086,7 @@
           </w:tcPr>
           <w:p>
             <w:pPr>
-              <w:jc w:val="both"/>
+              <w:jc w:val="left"/>
               <w:spacing w:after="20" w:before="20"/>
             </w:pPr>
             <w:r>
@@ -2966,7 +3104,8 @@
       <w:tr>
         <w:tc>
           <w:tcPr>
-            <w:tcW w:type="dxa" w:w="3009"/>
+            <w:tcW w:type="dxa" w:w="2600"/>
+            <w:shd w:fill="ECECEC" w:val="clear"/>
             <w:tcBorders>
               <w:top w:val="single" w:sz="4" w:color="CCCCCC"/>
               <w:left w:val="single" w:sz="4" w:color="CCCCCC"/>
@@ -2994,7 +3133,8 @@
         </w:tc>
         <w:tc>
           <w:tcPr>
-            <w:tcW w:type="dxa" w:w="6396"/>
+            <w:tcW w:type="dxa" w:w="6806"/>
+            <w:shd w:fill="ECECEC" w:val="clear"/>
             <w:tcBorders>
               <w:top w:val="single" w:sz="4" w:color="CCCCCC"/>
               <w:left w:val="single" w:sz="4" w:color="CCCCCC"/>
@@ -3006,7 +3146,7 @@
           </w:tcPr>
           <w:p>
             <w:pPr>
-              <w:jc w:val="both"/>
+              <w:jc w:val="left"/>
               <w:spacing w:after="20" w:before="20"/>
             </w:pPr>
             <w:r>
@@ -3024,14 +3164,8 @@
     </w:tbl>
     <w:p>
       <w:pPr>
-        <w:spacing w:after="80"/>
-      </w:pPr>
-    </w:p>
-    <w:p>
-      <w:pPr>
         <w:jc w:val="left"/>
         <w:spacing w:before="120" w:after="40"/>
-        <w:keepNext/>
       </w:pPr>
       <w:r>
         <w:rPr>
@@ -3066,13 +3200,13 @@
         <w:tblLayout w:type="fixed"/>
       </w:tblPr>
       <w:tblGrid>
-        <w:gridCol w:w="3009"/>
-        <w:gridCol w:w="6396"/>
+        <w:gridCol w:w="2900"/>
+        <w:gridCol w:w="6506"/>
       </w:tblGrid>
       <w:tr>
         <w:tc>
           <w:tcPr>
-            <w:tcW w:type="dxa" w:w="3009"/>
+            <w:tcW w:type="dxa" w:w="2900"/>
             <w:shd w:fill="2A324B" w:val="clear"/>
             <w:tcBorders>
               <w:top w:val="single" w:sz="4" w:color="CCCCCC"/>
@@ -3101,7 +3235,7 @@
         </w:tc>
         <w:tc>
           <w:tcPr>
-            <w:tcW w:type="dxa" w:w="6396"/>
+            <w:tcW w:type="dxa" w:w="6506"/>
             <w:shd w:fill="2A324B" w:val="clear"/>
             <w:tcBorders>
               <w:top w:val="single" w:sz="4" w:color="CCCCCC"/>
@@ -3132,7 +3266,7 @@
       <w:tr>
         <w:tc>
           <w:tcPr>
-            <w:tcW w:type="dxa" w:w="3009"/>
+            <w:tcW w:type="dxa" w:w="2900"/>
             <w:tcBorders>
               <w:top w:val="single" w:sz="4" w:color="CCCCCC"/>
               <w:left w:val="single" w:sz="4" w:color="CCCCCC"/>
@@ -3160,7 +3294,7 @@
         </w:tc>
         <w:tc>
           <w:tcPr>
-            <w:tcW w:type="dxa" w:w="6396"/>
+            <w:tcW w:type="dxa" w:w="6506"/>
             <w:tcBorders>
               <w:top w:val="single" w:sz="4" w:color="CCCCCC"/>
               <w:left w:val="single" w:sz="4" w:color="CCCCCC"/>
@@ -3172,7 +3306,7 @@
           </w:tcPr>
           <w:p>
             <w:pPr>
-              <w:jc w:val="both"/>
+              <w:jc w:val="left"/>
               <w:spacing w:after="20" w:before="20"/>
             </w:pPr>
             <w:r>
@@ -3190,7 +3324,8 @@
       <w:tr>
         <w:tc>
           <w:tcPr>
-            <w:tcW w:type="dxa" w:w="3009"/>
+            <w:tcW w:type="dxa" w:w="2900"/>
+            <w:shd w:fill="ECECEC" w:val="clear"/>
             <w:tcBorders>
               <w:top w:val="single" w:sz="4" w:color="CCCCCC"/>
               <w:left w:val="single" w:sz="4" w:color="CCCCCC"/>
@@ -3199,7 +3334,6 @@
               <w:insideH w:val="single" w:sz="4" w:color="CCCCCC"/>
               <w:insideV w:val="single" w:sz="4" w:color="CCCCCC"/>
             </w:tcBorders>
-            <w:shd w:fill="ECECEC" w:val="clear"/>
           </w:tcPr>
           <w:p>
             <w:pPr>
@@ -3219,7 +3353,8 @@
         </w:tc>
         <w:tc>
           <w:tcPr>
-            <w:tcW w:type="dxa" w:w="6396"/>
+            <w:tcW w:type="dxa" w:w="6506"/>
+            <w:shd w:fill="ECECEC" w:val="clear"/>
             <w:tcBorders>
               <w:top w:val="single" w:sz="4" w:color="CCCCCC"/>
               <w:left w:val="single" w:sz="4" w:color="CCCCCC"/>
@@ -3228,11 +3363,10 @@
               <w:insideH w:val="single" w:sz="4" w:color="CCCCCC"/>
               <w:insideV w:val="single" w:sz="4" w:color="CCCCCC"/>
             </w:tcBorders>
-            <w:shd w:fill="ECECEC" w:val="clear"/>
           </w:tcPr>
           <w:p>
             <w:pPr>
-              <w:jc w:val="both"/>
+              <w:jc w:val="left"/>
               <w:spacing w:after="20" w:before="20"/>
             </w:pPr>
             <w:r>
@@ -3250,7 +3384,7 @@
       <w:tr>
         <w:tc>
           <w:tcPr>
-            <w:tcW w:type="dxa" w:w="3009"/>
+            <w:tcW w:type="dxa" w:w="2900"/>
             <w:tcBorders>
               <w:top w:val="single" w:sz="4" w:color="CCCCCC"/>
               <w:left w:val="single" w:sz="4" w:color="CCCCCC"/>
@@ -3278,7 +3412,7 @@
         </w:tc>
         <w:tc>
           <w:tcPr>
-            <w:tcW w:type="dxa" w:w="6396"/>
+            <w:tcW w:type="dxa" w:w="6506"/>
             <w:tcBorders>
               <w:top w:val="single" w:sz="4" w:color="CCCCCC"/>
               <w:left w:val="single" w:sz="4" w:color="CCCCCC"/>
@@ -3290,7 +3424,7 @@
           </w:tcPr>
           <w:p>
             <w:pPr>
-              <w:jc w:val="both"/>
+              <w:jc w:val="left"/>
               <w:spacing w:after="20" w:before="20"/>
             </w:pPr>
             <w:r>
@@ -3308,7 +3442,8 @@
       <w:tr>
         <w:tc>
           <w:tcPr>
-            <w:tcW w:type="dxa" w:w="3009"/>
+            <w:tcW w:type="dxa" w:w="2900"/>
+            <w:shd w:fill="ECECEC" w:val="clear"/>
             <w:tcBorders>
               <w:top w:val="single" w:sz="4" w:color="CCCCCC"/>
               <w:left w:val="single" w:sz="4" w:color="CCCCCC"/>
@@ -3317,7 +3452,6 @@
               <w:insideH w:val="single" w:sz="4" w:color="CCCCCC"/>
               <w:insideV w:val="single" w:sz="4" w:color="CCCCCC"/>
             </w:tcBorders>
-            <w:shd w:fill="ECECEC" w:val="clear"/>
           </w:tcPr>
           <w:p>
             <w:pPr>
@@ -3337,7 +3471,8 @@
         </w:tc>
         <w:tc>
           <w:tcPr>
-            <w:tcW w:type="dxa" w:w="6396"/>
+            <w:tcW w:type="dxa" w:w="6506"/>
+            <w:shd w:fill="ECECEC" w:val="clear"/>
             <w:tcBorders>
               <w:top w:val="single" w:sz="4" w:color="CCCCCC"/>
               <w:left w:val="single" w:sz="4" w:color="CCCCCC"/>
@@ -3346,11 +3481,10 @@
               <w:insideH w:val="single" w:sz="4" w:color="CCCCCC"/>
               <w:insideV w:val="single" w:sz="4" w:color="CCCCCC"/>
             </w:tcBorders>
-            <w:shd w:fill="ECECEC" w:val="clear"/>
           </w:tcPr>
           <w:p>
             <w:pPr>
-              <w:jc w:val="both"/>
+              <w:jc w:val="left"/>
               <w:spacing w:after="20" w:before="20"/>
             </w:pPr>
             <w:r>
@@ -3368,7 +3502,7 @@
       <w:tr>
         <w:tc>
           <w:tcPr>
-            <w:tcW w:type="dxa" w:w="3009"/>
+            <w:tcW w:type="dxa" w:w="2900"/>
             <w:tcBorders>
               <w:top w:val="single" w:sz="4" w:color="CCCCCC"/>
               <w:left w:val="single" w:sz="4" w:color="CCCCCC"/>
@@ -3396,7 +3530,7 @@
         </w:tc>
         <w:tc>
           <w:tcPr>
-            <w:tcW w:type="dxa" w:w="6396"/>
+            <w:tcW w:type="dxa" w:w="6506"/>
             <w:tcBorders>
               <w:top w:val="single" w:sz="4" w:color="CCCCCC"/>
               <w:left w:val="single" w:sz="4" w:color="CCCCCC"/>
@@ -3408,7 +3542,7 @@
           </w:tcPr>
           <w:p>
             <w:pPr>
-              <w:jc w:val="both"/>
+              <w:jc w:val="left"/>
               <w:spacing w:after="20" w:before="20"/>
             </w:pPr>
             <w:r>
@@ -3426,14 +3560,8 @@
     </w:tbl>
     <w:p>
       <w:pPr>
-        <w:spacing w:after="80"/>
-      </w:pPr>
-    </w:p>
-    <w:p>
-      <w:pPr>
         <w:jc w:val="left"/>
         <w:spacing w:before="120" w:after="40"/>
-        <w:keepNext/>
       </w:pPr>
       <w:r>
         <w:rPr>
@@ -3453,13 +3581,13 @@
         <w:tblLayout w:type="fixed"/>
       </w:tblPr>
       <w:tblGrid>
-        <w:gridCol w:w="3009"/>
-        <w:gridCol w:w="6396"/>
+        <w:gridCol w:w="2900"/>
+        <w:gridCol w:w="6506"/>
       </w:tblGrid>
       <w:tr>
         <w:tc>
           <w:tcPr>
-            <w:tcW w:type="dxa" w:w="3009"/>
+            <w:tcW w:type="dxa" w:w="2900"/>
             <w:shd w:fill="2A324B" w:val="clear"/>
             <w:tcBorders>
               <w:top w:val="single" w:sz="4" w:color="CCCCCC"/>
@@ -3488,7 +3616,7 @@
         </w:tc>
         <w:tc>
           <w:tcPr>
-            <w:tcW w:type="dxa" w:w="6396"/>
+            <w:tcW w:type="dxa" w:w="6506"/>
             <w:shd w:fill="2A324B" w:val="clear"/>
             <w:tcBorders>
               <w:top w:val="single" w:sz="4" w:color="CCCCCC"/>
@@ -3519,7 +3647,7 @@
       <w:tr>
         <w:tc>
           <w:tcPr>
-            <w:tcW w:type="dxa" w:w="3009"/>
+            <w:tcW w:type="dxa" w:w="2900"/>
             <w:tcBorders>
               <w:top w:val="single" w:sz="4" w:color="CCCCCC"/>
               <w:left w:val="single" w:sz="4" w:color="CCCCCC"/>
@@ -3547,7 +3675,7 @@
         </w:tc>
         <w:tc>
           <w:tcPr>
-            <w:tcW w:type="dxa" w:w="6396"/>
+            <w:tcW w:type="dxa" w:w="6506"/>
             <w:tcBorders>
               <w:top w:val="single" w:sz="4" w:color="CCCCCC"/>
               <w:left w:val="single" w:sz="4" w:color="CCCCCC"/>
@@ -3559,7 +3687,7 @@
           </w:tcPr>
           <w:p>
             <w:pPr>
-              <w:jc w:val="both"/>
+              <w:jc w:val="left"/>
               <w:spacing w:after="20" w:before="20"/>
             </w:pPr>
             <w:r>
@@ -3577,7 +3705,8 @@
       <w:tr>
         <w:tc>
           <w:tcPr>
-            <w:tcW w:type="dxa" w:w="3009"/>
+            <w:tcW w:type="dxa" w:w="2900"/>
+            <w:shd w:fill="ECECEC" w:val="clear"/>
             <w:tcBorders>
               <w:top w:val="single" w:sz="4" w:color="CCCCCC"/>
               <w:left w:val="single" w:sz="4" w:color="CCCCCC"/>
@@ -3605,7 +3734,8 @@
         </w:tc>
         <w:tc>
           <w:tcPr>
-            <w:tcW w:type="dxa" w:w="6396"/>
+            <w:tcW w:type="dxa" w:w="6506"/>
+            <w:shd w:fill="ECECEC" w:val="clear"/>
             <w:tcBorders>
               <w:top w:val="single" w:sz="4" w:color="CCCCCC"/>
               <w:left w:val="single" w:sz="4" w:color="CCCCCC"/>
@@ -3617,7 +3747,7 @@
           </w:tcPr>
           <w:p>
             <w:pPr>
-              <w:jc w:val="both"/>
+              <w:jc w:val="left"/>
               <w:spacing w:after="20" w:before="20"/>
             </w:pPr>
             <w:r>
@@ -3627,7 +3757,7 @@
                 <w:color w:val="2A324B"/>
                 <w:sz w:val="20"/>
               </w:rPr>
-              <w:t>Wybór zrealizowanego projektu z katalogu, pokazywany w sekcji 06. Jeśli projekt ma zapisany link, w ofercie pojawia się odnośnik „Zobacz pełny opis projektu”.</w:t>
+              <w:t>Wybór zrealizowanego projektu z katalogu, pokazywany w sekcji 06. Jeśli projekt ma zapisany link, w ofercie pojawia się odnośnik Zobacz pełny opis projektu.</w:t>
             </w:r>
           </w:p>
         </w:tc>
@@ -3635,7 +3765,7 @@
       <w:tr>
         <w:tc>
           <w:tcPr>
-            <w:tcW w:type="dxa" w:w="3009"/>
+            <w:tcW w:type="dxa" w:w="2900"/>
             <w:tcBorders>
               <w:top w:val="single" w:sz="4" w:color="CCCCCC"/>
               <w:left w:val="single" w:sz="4" w:color="CCCCCC"/>
@@ -3663,7 +3793,7 @@
         </w:tc>
         <w:tc>
           <w:tcPr>
-            <w:tcW w:type="dxa" w:w="6396"/>
+            <w:tcW w:type="dxa" w:w="6506"/>
             <w:tcBorders>
               <w:top w:val="single" w:sz="4" w:color="CCCCCC"/>
               <w:left w:val="single" w:sz="4" w:color="CCCCCC"/>
@@ -3675,7 +3805,7 @@
           </w:tcPr>
           <w:p>
             <w:pPr>
-              <w:jc w:val="both"/>
+              <w:jc w:val="left"/>
               <w:spacing w:after="20" w:before="20"/>
             </w:pPr>
             <w:r>
@@ -3693,8 +3823,63 @@
     </w:tbl>
     <w:p>
       <w:pPr>
-        <w:spacing w:after="80"/>
+        <w:jc w:val="left"/>
+        <w:spacing w:before="120" w:after="40"/>
       </w:pPr>
+      <w:r>
+        <w:rPr>
+          <w:rFonts w:ascii="Roboto Condensed" w:hAnsi="Roboto Condensed"/>
+          <w:b w:val="0"/>
+          <w:color w:val="2A324B"/>
+          <w:sz w:val="28"/>
+        </w:rPr>
+        <w:t>3.8 Wypełnianie z transkrypcji (AI)</w:t>
+      </w:r>
+    </w:p>
+    <w:p>
+      <w:pPr>
+        <w:jc w:val="both"/>
+        <w:spacing w:after="120" w:before="0"/>
+      </w:pPr>
+      <w:r>
+        <w:rPr>
+          <w:rFonts w:ascii="Roboto Condensed Light" w:hAnsi="Roboto Condensed Light"/>
+          <w:b w:val="0"/>
+          <w:color w:val="2A324B"/>
+          <w:sz w:val="22"/>
+        </w:rPr>
+        <w:t>U góry formularza oferty znajduje się przycisk Wypełnij z transkrypcji. Otwiera panel, do którego możesz wkleić tekst notatki lub transkrypcji spotkania albo wgrać plik .docx lub .txt. PDF wklej jako tekst. Po analizie system wstępnie uzupełnia tylko puste pola: nazwę firmy, NIP, branżę, wielkość firmy, województwo oraz opis zdiagnozowanych potrzeb i podstawę rekomendacji (sekcja 01). Jeśli w rozmowie padła kwota, proponuje też wartość projektu do ręcznego potwierdzenia, a jeśli któryś program z biblioteki pasuje - podpowiada go.</w:t>
+      </w:r>
+    </w:p>
+    <w:p>
+      <w:pPr>
+        <w:jc w:val="both"/>
+        <w:spacing w:after="120" w:before="0"/>
+      </w:pPr>
+      <w:r>
+        <w:rPr>
+          <w:rFonts w:ascii="Roboto Condensed Light" w:hAnsi="Roboto Condensed Light"/>
+          <w:b w:val="0"/>
+          <w:color w:val="2A324B"/>
+          <w:sz w:val="22"/>
+        </w:rPr>
+        <w:t>Pola uzupełnione przez AI są podświetlone na żółto - to znak sprawdź i potwierdź. Panel pokazuje krótkie podsumowanie tego, co udało się wyciągnąć, wraz z ostrzeżeniami (czego nie ustalono, co wymaga weryfikacji). Nic nie jest zapisywane ani wysyłane automatycznie: transkrypcji nie przechowujemy, a dane utrwala dopiero Twój świadomy zapis oferty. Do analizy potrzeba co najmniej kilkunastu znaków tekstu; bardzo długie transkrypcje są skracane do fragmentu początkowego.</w:t>
+      </w:r>
+    </w:p>
+    <w:p>
+      <w:pPr>
+        <w:jc w:val="both"/>
+        <w:spacing w:after="120" w:before="0"/>
+      </w:pPr>
+      <w:r>
+        <w:rPr>
+          <w:rFonts w:ascii="Roboto Condensed" w:hAnsi="Roboto Condensed"/>
+          <w:b/>
+          <w:color w:val="CE181A"/>
+          <w:sz w:val="22"/>
+        </w:rPr>
+        <w:t>Uwaga: AI bywa omylne - traktuj wynik jak szkic do weryfikacji, nie jak gotowe dane. Zawsze sprawdź kwoty, nazwy i rekomendację przed wysłaniem oferty. Funkcja działa tylko wtedy, gdy w środowisku skonfigurowano klucz dostępu do modelu; w przeciwnym razie przycisk zwróci komunikat o niedostępności.</w:t>
+      </w:r>
     </w:p>
     <w:p>
       <w:pPr>
@@ -3739,7 +3924,7 @@
     <w:p>
       <w:pPr>
         <w:jc w:val="both"/>
-        <w:spacing w:after="280" w:before="0"/>
+        <w:spacing w:after="80" w:before="0"/>
         <w:ind w:left="360" w:hanging="360"/>
       </w:pPr>
       <w:r>
@@ -3773,16 +3958,7 @@
           <w:color w:val="CE181A"/>
           <w:sz w:val="22"/>
         </w:rPr>
-        <w:t xml:space="preserve">Uwaga: </w:t>
-      </w:r>
-      <w:r>
-        <w:rPr>
-          <w:rFonts w:ascii="Roboto Condensed Light" w:hAnsi="Roboto Condensed Light"/>
-          <w:b w:val="0"/>
-          <w:color w:val="2A324B"/>
-          <w:sz w:val="22"/>
-        </w:rPr>
-        <w:t>Edycja oferty już wysłanej pokaże ostrzeżenie - zmiana finansów wymusi ponowne przeliczenie cennika i odświeżenie pliku PDF.</w:t>
+        <w:t>Uwaga: Edycja oferty już wysłanej pokaże ostrzeżenie - zmiana finansów wymusi ponowne przeliczenie cennika i odświeżenie pliku PDF.</w:t>
       </w:r>
     </w:p>
     <w:p>
@@ -3808,13 +3984,13 @@
         <w:tblLayout w:type="fixed"/>
       </w:tblPr>
       <w:tblGrid>
-        <w:gridCol w:w="3009"/>
-        <w:gridCol w:w="6396"/>
+        <w:gridCol w:w="2900"/>
+        <w:gridCol w:w="6506"/>
       </w:tblGrid>
       <w:tr>
         <w:tc>
           <w:tcPr>
-            <w:tcW w:type="dxa" w:w="3009"/>
+            <w:tcW w:type="dxa" w:w="2900"/>
             <w:shd w:fill="2A324B" w:val="clear"/>
             <w:tcBorders>
               <w:top w:val="single" w:sz="4" w:color="CCCCCC"/>
@@ -3843,7 +4019,7 @@
         </w:tc>
         <w:tc>
           <w:tcPr>
-            <w:tcW w:type="dxa" w:w="6396"/>
+            <w:tcW w:type="dxa" w:w="6506"/>
             <w:shd w:fill="2A324B" w:val="clear"/>
             <w:tcBorders>
               <w:top w:val="single" w:sz="4" w:color="CCCCCC"/>
@@ -3874,7 +4050,7 @@
       <w:tr>
         <w:tc>
           <w:tcPr>
-            <w:tcW w:type="dxa" w:w="3009"/>
+            <w:tcW w:type="dxa" w:w="2900"/>
             <w:tcBorders>
               <w:top w:val="single" w:sz="4" w:color="CCCCCC"/>
               <w:left w:val="single" w:sz="4" w:color="CCCCCC"/>
@@ -3902,7 +4078,7 @@
         </w:tc>
         <w:tc>
           <w:tcPr>
-            <w:tcW w:type="dxa" w:w="6396"/>
+            <w:tcW w:type="dxa" w:w="6506"/>
             <w:tcBorders>
               <w:top w:val="single" w:sz="4" w:color="CCCCCC"/>
               <w:left w:val="single" w:sz="4" w:color="CCCCCC"/>
@@ -3914,7 +4090,7 @@
           </w:tcPr>
           <w:p>
             <w:pPr>
-              <w:jc w:val="both"/>
+              <w:jc w:val="left"/>
               <w:spacing w:after="20" w:before="20"/>
             </w:pPr>
             <w:r>
@@ -3932,7 +4108,8 @@
       <w:tr>
         <w:tc>
           <w:tcPr>
-            <w:tcW w:type="dxa" w:w="3009"/>
+            <w:tcW w:type="dxa" w:w="2900"/>
+            <w:shd w:fill="ECECEC" w:val="clear"/>
             <w:tcBorders>
               <w:top w:val="single" w:sz="4" w:color="CCCCCC"/>
               <w:left w:val="single" w:sz="4" w:color="CCCCCC"/>
@@ -3941,7 +4118,6 @@
               <w:insideH w:val="single" w:sz="4" w:color="CCCCCC"/>
               <w:insideV w:val="single" w:sz="4" w:color="CCCCCC"/>
             </w:tcBorders>
-            <w:shd w:fill="ECECEC" w:val="clear"/>
           </w:tcPr>
           <w:p>
             <w:pPr>
@@ -3961,7 +4137,8 @@
         </w:tc>
         <w:tc>
           <w:tcPr>
-            <w:tcW w:type="dxa" w:w="6396"/>
+            <w:tcW w:type="dxa" w:w="6506"/>
+            <w:shd w:fill="ECECEC" w:val="clear"/>
             <w:tcBorders>
               <w:top w:val="single" w:sz="4" w:color="CCCCCC"/>
               <w:left w:val="single" w:sz="4" w:color="CCCCCC"/>
@@ -3970,11 +4147,10 @@
               <w:insideH w:val="single" w:sz="4" w:color="CCCCCC"/>
               <w:insideV w:val="single" w:sz="4" w:color="CCCCCC"/>
             </w:tcBorders>
-            <w:shd w:fill="ECECEC" w:val="clear"/>
           </w:tcPr>
           <w:p>
             <w:pPr>
-              <w:jc w:val="both"/>
+              <w:jc w:val="left"/>
               <w:spacing w:after="20" w:before="20"/>
             </w:pPr>
             <w:r>
@@ -3992,7 +4168,7 @@
       <w:tr>
         <w:tc>
           <w:tcPr>
-            <w:tcW w:type="dxa" w:w="3009"/>
+            <w:tcW w:type="dxa" w:w="2900"/>
             <w:tcBorders>
               <w:top w:val="single" w:sz="4" w:color="CCCCCC"/>
               <w:left w:val="single" w:sz="4" w:color="CCCCCC"/>
@@ -4020,7 +4196,7 @@
         </w:tc>
         <w:tc>
           <w:tcPr>
-            <w:tcW w:type="dxa" w:w="6396"/>
+            <w:tcW w:type="dxa" w:w="6506"/>
             <w:tcBorders>
               <w:top w:val="single" w:sz="4" w:color="CCCCCC"/>
               <w:left w:val="single" w:sz="4" w:color="CCCCCC"/>
@@ -4032,7 +4208,7 @@
           </w:tcPr>
           <w:p>
             <w:pPr>
-              <w:jc w:val="both"/>
+              <w:jc w:val="left"/>
               <w:spacing w:after="20" w:before="20"/>
             </w:pPr>
             <w:r>
@@ -4050,7 +4226,8 @@
       <w:tr>
         <w:tc>
           <w:tcPr>
-            <w:tcW w:type="dxa" w:w="3009"/>
+            <w:tcW w:type="dxa" w:w="2900"/>
+            <w:shd w:fill="ECECEC" w:val="clear"/>
             <w:tcBorders>
               <w:top w:val="single" w:sz="4" w:color="CCCCCC"/>
               <w:left w:val="single" w:sz="4" w:color="CCCCCC"/>
@@ -4059,7 +4236,6 @@
               <w:insideH w:val="single" w:sz="4" w:color="CCCCCC"/>
               <w:insideV w:val="single" w:sz="4" w:color="CCCCCC"/>
             </w:tcBorders>
-            <w:shd w:fill="ECECEC" w:val="clear"/>
           </w:tcPr>
           <w:p>
             <w:pPr>
@@ -4079,7 +4255,8 @@
         </w:tc>
         <w:tc>
           <w:tcPr>
-            <w:tcW w:type="dxa" w:w="6396"/>
+            <w:tcW w:type="dxa" w:w="6506"/>
+            <w:shd w:fill="ECECEC" w:val="clear"/>
             <w:tcBorders>
               <w:top w:val="single" w:sz="4" w:color="CCCCCC"/>
               <w:left w:val="single" w:sz="4" w:color="CCCCCC"/>
@@ -4088,11 +4265,10 @@
               <w:insideH w:val="single" w:sz="4" w:color="CCCCCC"/>
               <w:insideV w:val="single" w:sz="4" w:color="CCCCCC"/>
             </w:tcBorders>
-            <w:shd w:fill="ECECEC" w:val="clear"/>
           </w:tcPr>
           <w:p>
             <w:pPr>
-              <w:jc w:val="both"/>
+              <w:jc w:val="left"/>
               <w:spacing w:after="20" w:before="20"/>
             </w:pPr>
             <w:r>
@@ -4110,7 +4286,7 @@
       <w:tr>
         <w:tc>
           <w:tcPr>
-            <w:tcW w:type="dxa" w:w="3009"/>
+            <w:tcW w:type="dxa" w:w="2900"/>
             <w:tcBorders>
               <w:top w:val="single" w:sz="4" w:color="CCCCCC"/>
               <w:left w:val="single" w:sz="4" w:color="CCCCCC"/>
@@ -4138,7 +4314,7 @@
         </w:tc>
         <w:tc>
           <w:tcPr>
-            <w:tcW w:type="dxa" w:w="6396"/>
+            <w:tcW w:type="dxa" w:w="6506"/>
             <w:tcBorders>
               <w:top w:val="single" w:sz="4" w:color="CCCCCC"/>
               <w:left w:val="single" w:sz="4" w:color="CCCCCC"/>
@@ -4150,7 +4326,7 @@
           </w:tcPr>
           <w:p>
             <w:pPr>
-              <w:jc w:val="both"/>
+              <w:jc w:val="left"/>
               <w:spacing w:after="20" w:before="20"/>
             </w:pPr>
             <w:r>
@@ -4168,7 +4344,8 @@
       <w:tr>
         <w:tc>
           <w:tcPr>
-            <w:tcW w:type="dxa" w:w="3009"/>
+            <w:tcW w:type="dxa" w:w="2900"/>
+            <w:shd w:fill="ECECEC" w:val="clear"/>
             <w:tcBorders>
               <w:top w:val="single" w:sz="4" w:color="CCCCCC"/>
               <w:left w:val="single" w:sz="4" w:color="CCCCCC"/>
@@ -4177,7 +4354,6 @@
               <w:insideH w:val="single" w:sz="4" w:color="CCCCCC"/>
               <w:insideV w:val="single" w:sz="4" w:color="CCCCCC"/>
             </w:tcBorders>
-            <w:shd w:fill="ECECEC" w:val="clear"/>
           </w:tcPr>
           <w:p>
             <w:pPr>
@@ -4197,7 +4373,8 @@
         </w:tc>
         <w:tc>
           <w:tcPr>
-            <w:tcW w:type="dxa" w:w="6396"/>
+            <w:tcW w:type="dxa" w:w="6506"/>
+            <w:shd w:fill="ECECEC" w:val="clear"/>
             <w:tcBorders>
               <w:top w:val="single" w:sz="4" w:color="CCCCCC"/>
               <w:left w:val="single" w:sz="4" w:color="CCCCCC"/>
@@ -4206,11 +4383,10 @@
               <w:insideH w:val="single" w:sz="4" w:color="CCCCCC"/>
               <w:insideV w:val="single" w:sz="4" w:color="CCCCCC"/>
             </w:tcBorders>
-            <w:shd w:fill="ECECEC" w:val="clear"/>
           </w:tcPr>
           <w:p>
             <w:pPr>
-              <w:jc w:val="both"/>
+              <w:jc w:val="left"/>
               <w:spacing w:after="20" w:before="20"/>
             </w:pPr>
             <w:r>
@@ -4226,11 +4402,6 @@
         </w:tc>
       </w:tr>
     </w:tbl>
-    <w:p>
-      <w:pPr>
-        <w:spacing w:after="80"/>
-      </w:pPr>
-    </w:p>
     <w:p>
       <w:pPr>
         <w:jc w:val="left"/>
@@ -4269,13 +4440,13 @@
         <w:tblLayout w:type="fixed"/>
       </w:tblPr>
       <w:tblGrid>
-        <w:gridCol w:w="2821"/>
-        <w:gridCol w:w="6584"/>
+        <w:gridCol w:w="2600"/>
+        <w:gridCol w:w="6806"/>
       </w:tblGrid>
       <w:tr>
         <w:tc>
           <w:tcPr>
-            <w:tcW w:type="dxa" w:w="2821"/>
+            <w:tcW w:type="dxa" w:w="2600"/>
             <w:shd w:fill="2A324B" w:val="clear"/>
             <w:tcBorders>
               <w:top w:val="single" w:sz="4" w:color="CCCCCC"/>
@@ -4304,7 +4475,7 @@
         </w:tc>
         <w:tc>
           <w:tcPr>
-            <w:tcW w:type="dxa" w:w="6584"/>
+            <w:tcW w:type="dxa" w:w="6806"/>
             <w:shd w:fill="2A324B" w:val="clear"/>
             <w:tcBorders>
               <w:top w:val="single" w:sz="4" w:color="CCCCCC"/>
@@ -4335,7 +4506,7 @@
       <w:tr>
         <w:tc>
           <w:tcPr>
-            <w:tcW w:type="dxa" w:w="2821"/>
+            <w:tcW w:type="dxa" w:w="2600"/>
             <w:tcBorders>
               <w:top w:val="single" w:sz="4" w:color="CCCCCC"/>
               <w:left w:val="single" w:sz="4" w:color="CCCCCC"/>
@@ -4363,7 +4534,7 @@
         </w:tc>
         <w:tc>
           <w:tcPr>
-            <w:tcW w:type="dxa" w:w="6584"/>
+            <w:tcW w:type="dxa" w:w="6806"/>
             <w:tcBorders>
               <w:top w:val="single" w:sz="4" w:color="CCCCCC"/>
               <w:left w:val="single" w:sz="4" w:color="CCCCCC"/>
@@ -4375,7 +4546,7 @@
           </w:tcPr>
           <w:p>
             <w:pPr>
-              <w:jc w:val="both"/>
+              <w:jc w:val="left"/>
               <w:spacing w:after="20" w:before="20"/>
             </w:pPr>
             <w:r>
@@ -4393,7 +4564,8 @@
       <w:tr>
         <w:tc>
           <w:tcPr>
-            <w:tcW w:type="dxa" w:w="2821"/>
+            <w:tcW w:type="dxa" w:w="2600"/>
+            <w:shd w:fill="ECECEC" w:val="clear"/>
             <w:tcBorders>
               <w:top w:val="single" w:sz="4" w:color="CCCCCC"/>
               <w:left w:val="single" w:sz="4" w:color="CCCCCC"/>
@@ -4402,7 +4574,6 @@
               <w:insideH w:val="single" w:sz="4" w:color="CCCCCC"/>
               <w:insideV w:val="single" w:sz="4" w:color="CCCCCC"/>
             </w:tcBorders>
-            <w:shd w:fill="ECECEC" w:val="clear"/>
           </w:tcPr>
           <w:p>
             <w:pPr>
@@ -4422,7 +4593,8 @@
         </w:tc>
         <w:tc>
           <w:tcPr>
-            <w:tcW w:type="dxa" w:w="6584"/>
+            <w:tcW w:type="dxa" w:w="6806"/>
+            <w:shd w:fill="ECECEC" w:val="clear"/>
             <w:tcBorders>
               <w:top w:val="single" w:sz="4" w:color="CCCCCC"/>
               <w:left w:val="single" w:sz="4" w:color="CCCCCC"/>
@@ -4431,11 +4603,10 @@
               <w:insideH w:val="single" w:sz="4" w:color="CCCCCC"/>
               <w:insideV w:val="single" w:sz="4" w:color="CCCCCC"/>
             </w:tcBorders>
-            <w:shd w:fill="ECECEC" w:val="clear"/>
           </w:tcPr>
           <w:p>
             <w:pPr>
-              <w:jc w:val="both"/>
+              <w:jc w:val="left"/>
               <w:spacing w:after="20" w:before="20"/>
             </w:pPr>
             <w:r>
@@ -4453,7 +4624,7 @@
       <w:tr>
         <w:tc>
           <w:tcPr>
-            <w:tcW w:type="dxa" w:w="2821"/>
+            <w:tcW w:type="dxa" w:w="2600"/>
             <w:tcBorders>
               <w:top w:val="single" w:sz="4" w:color="CCCCCC"/>
               <w:left w:val="single" w:sz="4" w:color="CCCCCC"/>
@@ -4481,7 +4652,7 @@
         </w:tc>
         <w:tc>
           <w:tcPr>
-            <w:tcW w:type="dxa" w:w="6584"/>
+            <w:tcW w:type="dxa" w:w="6806"/>
             <w:tcBorders>
               <w:top w:val="single" w:sz="4" w:color="CCCCCC"/>
               <w:left w:val="single" w:sz="4" w:color="CCCCCC"/>
@@ -4493,7 +4664,7 @@
           </w:tcPr>
           <w:p>
             <w:pPr>
-              <w:jc w:val="both"/>
+              <w:jc w:val="left"/>
               <w:spacing w:after="20" w:before="20"/>
             </w:pPr>
             <w:r>
@@ -4511,7 +4682,8 @@
       <w:tr>
         <w:tc>
           <w:tcPr>
-            <w:tcW w:type="dxa" w:w="2821"/>
+            <w:tcW w:type="dxa" w:w="2600"/>
+            <w:shd w:fill="ECECEC" w:val="clear"/>
             <w:tcBorders>
               <w:top w:val="single" w:sz="4" w:color="CCCCCC"/>
               <w:left w:val="single" w:sz="4" w:color="CCCCCC"/>
@@ -4520,7 +4692,6 @@
               <w:insideH w:val="single" w:sz="4" w:color="CCCCCC"/>
               <w:insideV w:val="single" w:sz="4" w:color="CCCCCC"/>
             </w:tcBorders>
-            <w:shd w:fill="ECECEC" w:val="clear"/>
           </w:tcPr>
           <w:p>
             <w:pPr>
@@ -4540,7 +4711,8 @@
         </w:tc>
         <w:tc>
           <w:tcPr>
-            <w:tcW w:type="dxa" w:w="6584"/>
+            <w:tcW w:type="dxa" w:w="6806"/>
+            <w:shd w:fill="ECECEC" w:val="clear"/>
             <w:tcBorders>
               <w:top w:val="single" w:sz="4" w:color="CCCCCC"/>
               <w:left w:val="single" w:sz="4" w:color="CCCCCC"/>
@@ -4549,11 +4721,10 @@
               <w:insideH w:val="single" w:sz="4" w:color="CCCCCC"/>
               <w:insideV w:val="single" w:sz="4" w:color="CCCCCC"/>
             </w:tcBorders>
-            <w:shd w:fill="ECECEC" w:val="clear"/>
           </w:tcPr>
           <w:p>
             <w:pPr>
-              <w:jc w:val="both"/>
+              <w:jc w:val="left"/>
               <w:spacing w:after="20" w:before="20"/>
             </w:pPr>
             <w:r>
@@ -4571,7 +4742,7 @@
       <w:tr>
         <w:tc>
           <w:tcPr>
-            <w:tcW w:type="dxa" w:w="2821"/>
+            <w:tcW w:type="dxa" w:w="2600"/>
             <w:tcBorders>
               <w:top w:val="single" w:sz="4" w:color="CCCCCC"/>
               <w:left w:val="single" w:sz="4" w:color="CCCCCC"/>
@@ -4599,7 +4770,7 @@
         </w:tc>
         <w:tc>
           <w:tcPr>
-            <w:tcW w:type="dxa" w:w="6584"/>
+            <w:tcW w:type="dxa" w:w="6806"/>
             <w:tcBorders>
               <w:top w:val="single" w:sz="4" w:color="CCCCCC"/>
               <w:left w:val="single" w:sz="4" w:color="CCCCCC"/>
@@ -4611,7 +4782,7 @@
           </w:tcPr>
           <w:p>
             <w:pPr>
-              <w:jc w:val="both"/>
+              <w:jc w:val="left"/>
               <w:spacing w:after="20" w:before="20"/>
             </w:pPr>
             <w:r>
@@ -4629,7 +4800,8 @@
       <w:tr>
         <w:tc>
           <w:tcPr>
-            <w:tcW w:type="dxa" w:w="2821"/>
+            <w:tcW w:type="dxa" w:w="2600"/>
+            <w:shd w:fill="ECECEC" w:val="clear"/>
             <w:tcBorders>
               <w:top w:val="single" w:sz="4" w:color="CCCCCC"/>
               <w:left w:val="single" w:sz="4" w:color="CCCCCC"/>
@@ -4638,7 +4810,6 @@
               <w:insideH w:val="single" w:sz="4" w:color="CCCCCC"/>
               <w:insideV w:val="single" w:sz="4" w:color="CCCCCC"/>
             </w:tcBorders>
-            <w:shd w:fill="ECECEC" w:val="clear"/>
           </w:tcPr>
           <w:p>
             <w:pPr>
@@ -4658,7 +4829,8 @@
         </w:tc>
         <w:tc>
           <w:tcPr>
-            <w:tcW w:type="dxa" w:w="6584"/>
+            <w:tcW w:type="dxa" w:w="6806"/>
+            <w:shd w:fill="ECECEC" w:val="clear"/>
             <w:tcBorders>
               <w:top w:val="single" w:sz="4" w:color="CCCCCC"/>
               <w:left w:val="single" w:sz="4" w:color="CCCCCC"/>
@@ -4667,11 +4839,10 @@
               <w:insideH w:val="single" w:sz="4" w:color="CCCCCC"/>
               <w:insideV w:val="single" w:sz="4" w:color="CCCCCC"/>
             </w:tcBorders>
-            <w:shd w:fill="ECECEC" w:val="clear"/>
           </w:tcPr>
           <w:p>
             <w:pPr>
-              <w:jc w:val="both"/>
+              <w:jc w:val="left"/>
               <w:spacing w:after="20" w:before="20"/>
             </w:pPr>
             <w:r>
@@ -4689,7 +4860,7 @@
       <w:tr>
         <w:tc>
           <w:tcPr>
-            <w:tcW w:type="dxa" w:w="2821"/>
+            <w:tcW w:type="dxa" w:w="2600"/>
             <w:tcBorders>
               <w:top w:val="single" w:sz="4" w:color="CCCCCC"/>
               <w:left w:val="single" w:sz="4" w:color="CCCCCC"/>
@@ -4717,7 +4888,7 @@
         </w:tc>
         <w:tc>
           <w:tcPr>
-            <w:tcW w:type="dxa" w:w="6584"/>
+            <w:tcW w:type="dxa" w:w="6806"/>
             <w:tcBorders>
               <w:top w:val="single" w:sz="4" w:color="CCCCCC"/>
               <w:left w:val="single" w:sz="4" w:color="CCCCCC"/>
@@ -4729,7 +4900,7 @@
           </w:tcPr>
           <w:p>
             <w:pPr>
-              <w:jc w:val="both"/>
+              <w:jc w:val="left"/>
               <w:spacing w:after="20" w:before="20"/>
             </w:pPr>
             <w:r>
@@ -4747,7 +4918,8 @@
       <w:tr>
         <w:tc>
           <w:tcPr>
-            <w:tcW w:type="dxa" w:w="2821"/>
+            <w:tcW w:type="dxa" w:w="2600"/>
+            <w:shd w:fill="ECECEC" w:val="clear"/>
             <w:tcBorders>
               <w:top w:val="single" w:sz="4" w:color="CCCCCC"/>
               <w:left w:val="single" w:sz="4" w:color="CCCCCC"/>
@@ -4756,7 +4928,6 @@
               <w:insideH w:val="single" w:sz="4" w:color="CCCCCC"/>
               <w:insideV w:val="single" w:sz="4" w:color="CCCCCC"/>
             </w:tcBorders>
-            <w:shd w:fill="ECECEC" w:val="clear"/>
           </w:tcPr>
           <w:p>
             <w:pPr>
@@ -4776,7 +4947,8 @@
         </w:tc>
         <w:tc>
           <w:tcPr>
-            <w:tcW w:type="dxa" w:w="6584"/>
+            <w:tcW w:type="dxa" w:w="6806"/>
+            <w:shd w:fill="ECECEC" w:val="clear"/>
             <w:tcBorders>
               <w:top w:val="single" w:sz="4" w:color="CCCCCC"/>
               <w:left w:val="single" w:sz="4" w:color="CCCCCC"/>
@@ -4785,11 +4957,10 @@
               <w:insideH w:val="single" w:sz="4" w:color="CCCCCC"/>
               <w:insideV w:val="single" w:sz="4" w:color="CCCCCC"/>
             </w:tcBorders>
-            <w:shd w:fill="ECECEC" w:val="clear"/>
           </w:tcPr>
           <w:p>
             <w:pPr>
-              <w:jc w:val="both"/>
+              <w:jc w:val="left"/>
               <w:spacing w:after="20" w:before="20"/>
             </w:pPr>
             <w:r>
@@ -4807,11 +4978,6 @@
     </w:tbl>
     <w:p>
       <w:pPr>
-        <w:spacing w:after="80"/>
-      </w:pPr>
-    </w:p>
-    <w:p>
-      <w:pPr>
         <w:jc w:val="both"/>
         <w:spacing w:after="120" w:before="0"/>
       </w:pPr>
@@ -4822,16 +4988,7 @@
           <w:color w:val="CE181A"/>
           <w:sz w:val="22"/>
         </w:rPr>
-        <w:t xml:space="preserve">Uwaga: </w:t>
-      </w:r>
-      <w:r>
-        <w:rPr>
-          <w:rFonts w:ascii="Roboto Condensed Light" w:hAnsi="Roboto Condensed Light"/>
-          <w:b w:val="0"/>
-          <w:color w:val="2A324B"/>
-          <w:sz w:val="22"/>
-        </w:rPr>
-        <w:t>Klient akceptuje lub odrzuca ofertę wprost na stronie. Zgoda RODO przy akceptacji jest obowiązkowa. Po decyzji na górze pojawia się baner ze statusem oferty.</w:t>
+        <w:t>Uwaga: Klient akceptuje lub odrzuca ofertę wprost na stronie. Zgoda RODO przy akceptacji jest obowiązkowa. Po decyzji na górze pojawia się baner ze statusem oferty.</w:t>
       </w:r>
     </w:p>
     <w:p>
@@ -4967,7 +5124,7 @@
     <w:p>
       <w:pPr>
         <w:jc w:val="both"/>
-        <w:spacing w:after="280" w:before="0"/>
+        <w:spacing w:after="80" w:before="0"/>
         <w:ind w:left="360" w:hanging="360"/>
       </w:pPr>
       <w:r>
@@ -5027,14 +5184,14 @@
         <w:tblLayout w:type="fixed"/>
       </w:tblPr>
       <w:tblGrid>
-        <w:gridCol w:w="2257"/>
-        <w:gridCol w:w="2445"/>
-        <w:gridCol w:w="4703"/>
+        <w:gridCol w:w="2500"/>
+        <w:gridCol w:w="2200"/>
+        <w:gridCol w:w="4706"/>
       </w:tblGrid>
       <w:tr>
         <w:tc>
           <w:tcPr>
-            <w:tcW w:type="dxa" w:w="2257"/>
+            <w:tcW w:type="dxa" w:w="2500"/>
             <w:shd w:fill="2A324B" w:val="clear"/>
             <w:tcBorders>
               <w:top w:val="single" w:sz="4" w:color="CCCCCC"/>
@@ -5063,7 +5220,7 @@
         </w:tc>
         <w:tc>
           <w:tcPr>
-            <w:tcW w:type="dxa" w:w="2445"/>
+            <w:tcW w:type="dxa" w:w="2200"/>
             <w:shd w:fill="2A324B" w:val="clear"/>
             <w:tcBorders>
               <w:top w:val="single" w:sz="4" w:color="CCCCCC"/>
@@ -5092,7 +5249,7 @@
         </w:tc>
         <w:tc>
           <w:tcPr>
-            <w:tcW w:type="dxa" w:w="4703"/>
+            <w:tcW w:type="dxa" w:w="4706"/>
             <w:shd w:fill="2A324B" w:val="clear"/>
             <w:tcBorders>
               <w:top w:val="single" w:sz="4" w:color="CCCCCC"/>
@@ -5123,7 +5280,7 @@
       <w:tr>
         <w:tc>
           <w:tcPr>
-            <w:tcW w:type="dxa" w:w="2257"/>
+            <w:tcW w:type="dxa" w:w="2500"/>
             <w:tcBorders>
               <w:top w:val="single" w:sz="4" w:color="CCCCCC"/>
               <w:left w:val="single" w:sz="4" w:color="CCCCCC"/>
@@ -5151,7 +5308,7 @@
         </w:tc>
         <w:tc>
           <w:tcPr>
-            <w:tcW w:type="dxa" w:w="2445"/>
+            <w:tcW w:type="dxa" w:w="2200"/>
             <w:tcBorders>
               <w:top w:val="single" w:sz="4" w:color="CCCCCC"/>
               <w:left w:val="single" w:sz="4" w:color="CCCCCC"/>
@@ -5163,7 +5320,7 @@
           </w:tcPr>
           <w:p>
             <w:pPr>
-              <w:jc w:val="both"/>
+              <w:jc w:val="left"/>
               <w:spacing w:after="20" w:before="20"/>
             </w:pPr>
             <w:r>
@@ -5179,7 +5336,7 @@
         </w:tc>
         <w:tc>
           <w:tcPr>
-            <w:tcW w:type="dxa" w:w="4703"/>
+            <w:tcW w:type="dxa" w:w="4706"/>
             <w:tcBorders>
               <w:top w:val="single" w:sz="4" w:color="CCCCCC"/>
               <w:left w:val="single" w:sz="4" w:color="CCCCCC"/>
@@ -5191,7 +5348,7 @@
           </w:tcPr>
           <w:p>
             <w:pPr>
-              <w:jc w:val="both"/>
+              <w:jc w:val="left"/>
               <w:spacing w:after="20" w:before="20"/>
             </w:pPr>
             <w:r>
@@ -5209,7 +5366,8 @@
       <w:tr>
         <w:tc>
           <w:tcPr>
-            <w:tcW w:type="dxa" w:w="2257"/>
+            <w:tcW w:type="dxa" w:w="2500"/>
+            <w:shd w:fill="ECECEC" w:val="clear"/>
             <w:tcBorders>
               <w:top w:val="single" w:sz="4" w:color="CCCCCC"/>
               <w:left w:val="single" w:sz="4" w:color="CCCCCC"/>
@@ -5237,7 +5395,8 @@
         </w:tc>
         <w:tc>
           <w:tcPr>
-            <w:tcW w:type="dxa" w:w="2445"/>
+            <w:tcW w:type="dxa" w:w="2200"/>
+            <w:shd w:fill="ECECEC" w:val="clear"/>
             <w:tcBorders>
               <w:top w:val="single" w:sz="4" w:color="CCCCCC"/>
               <w:left w:val="single" w:sz="4" w:color="CCCCCC"/>
@@ -5249,7 +5408,7 @@
           </w:tcPr>
           <w:p>
             <w:pPr>
-              <w:jc w:val="both"/>
+              <w:jc w:val="left"/>
               <w:spacing w:after="20" w:before="20"/>
             </w:pPr>
             <w:r>
@@ -5265,7 +5424,8 @@
         </w:tc>
         <w:tc>
           <w:tcPr>
-            <w:tcW w:type="dxa" w:w="4703"/>
+            <w:tcW w:type="dxa" w:w="4706"/>
+            <w:shd w:fill="ECECEC" w:val="clear"/>
             <w:tcBorders>
               <w:top w:val="single" w:sz="4" w:color="CCCCCC"/>
               <w:left w:val="single" w:sz="4" w:color="CCCCCC"/>
@@ -5277,7 +5437,7 @@
           </w:tcPr>
           <w:p>
             <w:pPr>
-              <w:jc w:val="both"/>
+              <w:jc w:val="left"/>
               <w:spacing w:after="20" w:before="20"/>
             </w:pPr>
             <w:r>
@@ -5295,7 +5455,7 @@
       <w:tr>
         <w:tc>
           <w:tcPr>
-            <w:tcW w:type="dxa" w:w="2257"/>
+            <w:tcW w:type="dxa" w:w="2500"/>
             <w:tcBorders>
               <w:top w:val="single" w:sz="4" w:color="CCCCCC"/>
               <w:left w:val="single" w:sz="4" w:color="CCCCCC"/>
@@ -5304,7 +5464,6 @@
               <w:insideH w:val="single" w:sz="4" w:color="CCCCCC"/>
               <w:insideV w:val="single" w:sz="4" w:color="CCCCCC"/>
             </w:tcBorders>
-            <w:shd w:fill="ECECEC" w:val="clear"/>
           </w:tcPr>
           <w:p>
             <w:pPr>
@@ -5324,7 +5483,7 @@
         </w:tc>
         <w:tc>
           <w:tcPr>
-            <w:tcW w:type="dxa" w:w="2445"/>
+            <w:tcW w:type="dxa" w:w="2200"/>
             <w:tcBorders>
               <w:top w:val="single" w:sz="4" w:color="CCCCCC"/>
               <w:left w:val="single" w:sz="4" w:color="CCCCCC"/>
@@ -5333,11 +5492,10 @@
               <w:insideH w:val="single" w:sz="4" w:color="CCCCCC"/>
               <w:insideV w:val="single" w:sz="4" w:color="CCCCCC"/>
             </w:tcBorders>
-            <w:shd w:fill="ECECEC" w:val="clear"/>
           </w:tcPr>
           <w:p>
             <w:pPr>
-              <w:jc w:val="both"/>
+              <w:jc w:val="left"/>
               <w:spacing w:after="20" w:before="20"/>
             </w:pPr>
             <w:r>
@@ -5353,7 +5511,7 @@
         </w:tc>
         <w:tc>
           <w:tcPr>
-            <w:tcW w:type="dxa" w:w="4703"/>
+            <w:tcW w:type="dxa" w:w="4706"/>
             <w:tcBorders>
               <w:top w:val="single" w:sz="4" w:color="CCCCCC"/>
               <w:left w:val="single" w:sz="4" w:color="CCCCCC"/>
@@ -5362,11 +5520,10 @@
               <w:insideH w:val="single" w:sz="4" w:color="CCCCCC"/>
               <w:insideV w:val="single" w:sz="4" w:color="CCCCCC"/>
             </w:tcBorders>
-            <w:shd w:fill="ECECEC" w:val="clear"/>
           </w:tcPr>
           <w:p>
             <w:pPr>
-              <w:jc w:val="both"/>
+              <w:jc w:val="left"/>
               <w:spacing w:after="20" w:before="20"/>
             </w:pPr>
             <w:r>
@@ -5384,7 +5541,8 @@
       <w:tr>
         <w:tc>
           <w:tcPr>
-            <w:tcW w:type="dxa" w:w="2257"/>
+            <w:tcW w:type="dxa" w:w="2500"/>
+            <w:shd w:fill="ECECEC" w:val="clear"/>
             <w:tcBorders>
               <w:top w:val="single" w:sz="4" w:color="CCCCCC"/>
               <w:left w:val="single" w:sz="4" w:color="CCCCCC"/>
@@ -5412,7 +5570,8 @@
         </w:tc>
         <w:tc>
           <w:tcPr>
-            <w:tcW w:type="dxa" w:w="2445"/>
+            <w:tcW w:type="dxa" w:w="2200"/>
+            <w:shd w:fill="ECECEC" w:val="clear"/>
             <w:tcBorders>
               <w:top w:val="single" w:sz="4" w:color="CCCCCC"/>
               <w:left w:val="single" w:sz="4" w:color="CCCCCC"/>
@@ -5424,7 +5583,7 @@
           </w:tcPr>
           <w:p>
             <w:pPr>
-              <w:jc w:val="both"/>
+              <w:jc w:val="left"/>
               <w:spacing w:after="20" w:before="20"/>
             </w:pPr>
             <w:r>
@@ -5440,7 +5599,8 @@
         </w:tc>
         <w:tc>
           <w:tcPr>
-            <w:tcW w:type="dxa" w:w="4703"/>
+            <w:tcW w:type="dxa" w:w="4706"/>
+            <w:shd w:fill="ECECEC" w:val="clear"/>
             <w:tcBorders>
               <w:top w:val="single" w:sz="4" w:color="CCCCCC"/>
               <w:left w:val="single" w:sz="4" w:color="CCCCCC"/>
@@ -5452,7 +5612,7 @@
           </w:tcPr>
           <w:p>
             <w:pPr>
-              <w:jc w:val="both"/>
+              <w:jc w:val="left"/>
               <w:spacing w:after="20" w:before="20"/>
             </w:pPr>
             <w:r>
@@ -5462,7 +5622,7 @@
                 <w:color w:val="2A324B"/>
                 <w:sz w:val="20"/>
               </w:rPr>
-              <w:t>Biblioteka programów wsparcia. Pozycja oznaczona jako rekomendowana trafia do sekcji 02 oferty. Zastąpiła dawny katalog „Programy”.</w:t>
+              <w:t>Biblioteka programów wsparcia. Pozycja oznaczona jako rekomendowana trafia do sekcji 02 oferty. Zastąpiła dawny katalog Programy.</w:t>
             </w:r>
           </w:p>
         </w:tc>
@@ -5470,7 +5630,7 @@
       <w:tr>
         <w:tc>
           <w:tcPr>
-            <w:tcW w:type="dxa" w:w="2257"/>
+            <w:tcW w:type="dxa" w:w="2500"/>
             <w:tcBorders>
               <w:top w:val="single" w:sz="4" w:color="CCCCCC"/>
               <w:left w:val="single" w:sz="4" w:color="CCCCCC"/>
@@ -5479,7 +5639,6 @@
               <w:insideH w:val="single" w:sz="4" w:color="CCCCCC"/>
               <w:insideV w:val="single" w:sz="4" w:color="CCCCCC"/>
             </w:tcBorders>
-            <w:shd w:fill="ECECEC" w:val="clear"/>
           </w:tcPr>
           <w:p>
             <w:pPr>
@@ -5499,7 +5658,7 @@
         </w:tc>
         <w:tc>
           <w:tcPr>
-            <w:tcW w:type="dxa" w:w="2445"/>
+            <w:tcW w:type="dxa" w:w="2200"/>
             <w:tcBorders>
               <w:top w:val="single" w:sz="4" w:color="CCCCCC"/>
               <w:left w:val="single" w:sz="4" w:color="CCCCCC"/>
@@ -5508,11 +5667,10 @@
               <w:insideH w:val="single" w:sz="4" w:color="CCCCCC"/>
               <w:insideV w:val="single" w:sz="4" w:color="CCCCCC"/>
             </w:tcBorders>
-            <w:shd w:fill="ECECEC" w:val="clear"/>
           </w:tcPr>
           <w:p>
             <w:pPr>
-              <w:jc w:val="both"/>
+              <w:jc w:val="left"/>
               <w:spacing w:after="20" w:before="20"/>
             </w:pPr>
             <w:r>
@@ -5528,7 +5686,7 @@
         </w:tc>
         <w:tc>
           <w:tcPr>
-            <w:tcW w:type="dxa" w:w="4703"/>
+            <w:tcW w:type="dxa" w:w="4706"/>
             <w:tcBorders>
               <w:top w:val="single" w:sz="4" w:color="CCCCCC"/>
               <w:left w:val="single" w:sz="4" w:color="CCCCCC"/>
@@ -5537,11 +5695,10 @@
               <w:insideH w:val="single" w:sz="4" w:color="CCCCCC"/>
               <w:insideV w:val="single" w:sz="4" w:color="CCCCCC"/>
             </w:tcBorders>
-            <w:shd w:fill="ECECEC" w:val="clear"/>
           </w:tcPr>
           <w:p>
             <w:pPr>
-              <w:jc w:val="both"/>
+              <w:jc w:val="left"/>
               <w:spacing w:after="20" w:before="20"/>
             </w:pPr>
             <w:r>
@@ -5559,7 +5716,8 @@
       <w:tr>
         <w:tc>
           <w:tcPr>
-            <w:tcW w:type="dxa" w:w="2257"/>
+            <w:tcW w:type="dxa" w:w="2500"/>
+            <w:shd w:fill="ECECEC" w:val="clear"/>
             <w:tcBorders>
               <w:top w:val="single" w:sz="4" w:color="CCCCCC"/>
               <w:left w:val="single" w:sz="4" w:color="CCCCCC"/>
@@ -5587,7 +5745,8 @@
         </w:tc>
         <w:tc>
           <w:tcPr>
-            <w:tcW w:type="dxa" w:w="2445"/>
+            <w:tcW w:type="dxa" w:w="2200"/>
+            <w:shd w:fill="ECECEC" w:val="clear"/>
             <w:tcBorders>
               <w:top w:val="single" w:sz="4" w:color="CCCCCC"/>
               <w:left w:val="single" w:sz="4" w:color="CCCCCC"/>
@@ -5599,7 +5758,7 @@
           </w:tcPr>
           <w:p>
             <w:pPr>
-              <w:jc w:val="both"/>
+              <w:jc w:val="left"/>
               <w:spacing w:after="20" w:before="20"/>
             </w:pPr>
             <w:r>
@@ -5615,7 +5774,8 @@
         </w:tc>
         <w:tc>
           <w:tcPr>
-            <w:tcW w:type="dxa" w:w="4703"/>
+            <w:tcW w:type="dxa" w:w="4706"/>
+            <w:shd w:fill="ECECEC" w:val="clear"/>
             <w:tcBorders>
               <w:top w:val="single" w:sz="4" w:color="CCCCCC"/>
               <w:left w:val="single" w:sz="4" w:color="CCCCCC"/>
@@ -5627,7 +5787,7 @@
           </w:tcPr>
           <w:p>
             <w:pPr>
-              <w:jc w:val="both"/>
+              <w:jc w:val="left"/>
               <w:spacing w:after="20" w:before="20"/>
             </w:pPr>
             <w:r>
@@ -5645,7 +5805,7 @@
       <w:tr>
         <w:tc>
           <w:tcPr>
-            <w:tcW w:type="dxa" w:w="2257"/>
+            <w:tcW w:type="dxa" w:w="2500"/>
             <w:tcBorders>
               <w:top w:val="single" w:sz="4" w:color="CCCCCC"/>
               <w:left w:val="single" w:sz="4" w:color="CCCCCC"/>
@@ -5654,7 +5814,6 @@
               <w:insideH w:val="single" w:sz="4" w:color="CCCCCC"/>
               <w:insideV w:val="single" w:sz="4" w:color="CCCCCC"/>
             </w:tcBorders>
-            <w:shd w:fill="ECECEC" w:val="clear"/>
           </w:tcPr>
           <w:p>
             <w:pPr>
@@ -5674,7 +5833,7 @@
         </w:tc>
         <w:tc>
           <w:tcPr>
-            <w:tcW w:type="dxa" w:w="2445"/>
+            <w:tcW w:type="dxa" w:w="2200"/>
             <w:tcBorders>
               <w:top w:val="single" w:sz="4" w:color="CCCCCC"/>
               <w:left w:val="single" w:sz="4" w:color="CCCCCC"/>
@@ -5683,11 +5842,10 @@
               <w:insideH w:val="single" w:sz="4" w:color="CCCCCC"/>
               <w:insideV w:val="single" w:sz="4" w:color="CCCCCC"/>
             </w:tcBorders>
-            <w:shd w:fill="ECECEC" w:val="clear"/>
           </w:tcPr>
           <w:p>
             <w:pPr>
-              <w:jc w:val="both"/>
+              <w:jc w:val="left"/>
               <w:spacing w:after="20" w:before="20"/>
             </w:pPr>
             <w:r>
@@ -5703,7 +5861,7 @@
         </w:tc>
         <w:tc>
           <w:tcPr>
-            <w:tcW w:type="dxa" w:w="4703"/>
+            <w:tcW w:type="dxa" w:w="4706"/>
             <w:tcBorders>
               <w:top w:val="single" w:sz="4" w:color="CCCCCC"/>
               <w:left w:val="single" w:sz="4" w:color="CCCCCC"/>
@@ -5712,11 +5870,10 @@
               <w:insideH w:val="single" w:sz="4" w:color="CCCCCC"/>
               <w:insideV w:val="single" w:sz="4" w:color="CCCCCC"/>
             </w:tcBorders>
-            <w:shd w:fill="ECECEC" w:val="clear"/>
           </w:tcPr>
           <w:p>
             <w:pPr>
-              <w:jc w:val="both"/>
+              <w:jc w:val="left"/>
               <w:spacing w:after="20" w:before="20"/>
             </w:pPr>
             <w:r>
@@ -5734,13 +5891,8 @@
     </w:tbl>
     <w:p>
       <w:pPr>
-        <w:spacing w:after="80"/>
-      </w:pPr>
-    </w:p>
-    <w:p>
-      <w:pPr>
         <w:jc w:val="left"/>
-        <w:spacing w:before="240" w:after="40"/>
+        <w:spacing w:before="240" w:after="80"/>
       </w:pPr>
       <w:r>
         <w:rPr>
@@ -5775,13 +5927,13 @@
         <w:tblLayout w:type="fixed"/>
       </w:tblPr>
       <w:tblGrid>
-        <w:gridCol w:w="2633"/>
-        <w:gridCol w:w="6772"/>
+        <w:gridCol w:w="2600"/>
+        <w:gridCol w:w="6806"/>
       </w:tblGrid>
       <w:tr>
         <w:tc>
           <w:tcPr>
-            <w:tcW w:type="dxa" w:w="2633"/>
+            <w:tcW w:type="dxa" w:w="2600"/>
             <w:shd w:fill="2A324B" w:val="clear"/>
             <w:tcBorders>
               <w:top w:val="single" w:sz="4" w:color="CCCCCC"/>
@@ -5810,7 +5962,7 @@
         </w:tc>
         <w:tc>
           <w:tcPr>
-            <w:tcW w:type="dxa" w:w="6772"/>
+            <w:tcW w:type="dxa" w:w="6806"/>
             <w:shd w:fill="2A324B" w:val="clear"/>
             <w:tcBorders>
               <w:top w:val="single" w:sz="4" w:color="CCCCCC"/>
@@ -5841,7 +5993,7 @@
       <w:tr>
         <w:tc>
           <w:tcPr>
-            <w:tcW w:type="dxa" w:w="2633"/>
+            <w:tcW w:type="dxa" w:w="2600"/>
             <w:tcBorders>
               <w:top w:val="single" w:sz="4" w:color="CCCCCC"/>
               <w:left w:val="single" w:sz="4" w:color="CCCCCC"/>
@@ -5869,7 +6021,7 @@
         </w:tc>
         <w:tc>
           <w:tcPr>
-            <w:tcW w:type="dxa" w:w="6772"/>
+            <w:tcW w:type="dxa" w:w="6806"/>
             <w:tcBorders>
               <w:top w:val="single" w:sz="4" w:color="CCCCCC"/>
               <w:left w:val="single" w:sz="4" w:color="CCCCCC"/>
@@ -5881,7 +6033,7 @@
           </w:tcPr>
           <w:p>
             <w:pPr>
-              <w:jc w:val="both"/>
+              <w:jc w:val="left"/>
               <w:spacing w:after="20" w:before="20"/>
             </w:pPr>
             <w:r>
@@ -5899,7 +6051,8 @@
       <w:tr>
         <w:tc>
           <w:tcPr>
-            <w:tcW w:type="dxa" w:w="2633"/>
+            <w:tcW w:type="dxa" w:w="2600"/>
+            <w:shd w:fill="ECECEC" w:val="clear"/>
             <w:tcBorders>
               <w:top w:val="single" w:sz="4" w:color="CCCCCC"/>
               <w:left w:val="single" w:sz="4" w:color="CCCCCC"/>
@@ -5908,7 +6061,6 @@
               <w:insideH w:val="single" w:sz="4" w:color="CCCCCC"/>
               <w:insideV w:val="single" w:sz="4" w:color="CCCCCC"/>
             </w:tcBorders>
-            <w:shd w:fill="ECECEC" w:val="clear"/>
           </w:tcPr>
           <w:p>
             <w:pPr>
@@ -5928,7 +6080,8 @@
         </w:tc>
         <w:tc>
           <w:tcPr>
-            <w:tcW w:type="dxa" w:w="6772"/>
+            <w:tcW w:type="dxa" w:w="6806"/>
+            <w:shd w:fill="ECECEC" w:val="clear"/>
             <w:tcBorders>
               <w:top w:val="single" w:sz="4" w:color="CCCCCC"/>
               <w:left w:val="single" w:sz="4" w:color="CCCCCC"/>
@@ -5937,11 +6090,10 @@
               <w:insideH w:val="single" w:sz="4" w:color="CCCCCC"/>
               <w:insideV w:val="single" w:sz="4" w:color="CCCCCC"/>
             </w:tcBorders>
-            <w:shd w:fill="ECECEC" w:val="clear"/>
           </w:tcPr>
           <w:p>
             <w:pPr>
-              <w:jc w:val="both"/>
+              <w:jc w:val="left"/>
               <w:spacing w:after="20" w:before="20"/>
             </w:pPr>
             <w:r>
@@ -5959,7 +6111,7 @@
       <w:tr>
         <w:tc>
           <w:tcPr>
-            <w:tcW w:type="dxa" w:w="2633"/>
+            <w:tcW w:type="dxa" w:w="2600"/>
             <w:tcBorders>
               <w:top w:val="single" w:sz="4" w:color="CCCCCC"/>
               <w:left w:val="single" w:sz="4" w:color="CCCCCC"/>
@@ -5987,7 +6139,7 @@
         </w:tc>
         <w:tc>
           <w:tcPr>
-            <w:tcW w:type="dxa" w:w="6772"/>
+            <w:tcW w:type="dxa" w:w="6806"/>
             <w:tcBorders>
               <w:top w:val="single" w:sz="4" w:color="CCCCCC"/>
               <w:left w:val="single" w:sz="4" w:color="CCCCCC"/>
@@ -5999,7 +6151,7 @@
           </w:tcPr>
           <w:p>
             <w:pPr>
-              <w:jc w:val="both"/>
+              <w:jc w:val="left"/>
               <w:spacing w:after="20" w:before="20"/>
             </w:pPr>
             <w:r>
@@ -6017,7 +6169,8 @@
       <w:tr>
         <w:tc>
           <w:tcPr>
-            <w:tcW w:type="dxa" w:w="2633"/>
+            <w:tcW w:type="dxa" w:w="2600"/>
+            <w:shd w:fill="ECECEC" w:val="clear"/>
             <w:tcBorders>
               <w:top w:val="single" w:sz="4" w:color="CCCCCC"/>
               <w:left w:val="single" w:sz="4" w:color="CCCCCC"/>
@@ -6026,7 +6179,6 @@
               <w:insideH w:val="single" w:sz="4" w:color="CCCCCC"/>
               <w:insideV w:val="single" w:sz="4" w:color="CCCCCC"/>
             </w:tcBorders>
-            <w:shd w:fill="ECECEC" w:val="clear"/>
           </w:tcPr>
           <w:p>
             <w:pPr>
@@ -6046,7 +6198,8 @@
         </w:tc>
         <w:tc>
           <w:tcPr>
-            <w:tcW w:type="dxa" w:w="6772"/>
+            <w:tcW w:type="dxa" w:w="6806"/>
+            <w:shd w:fill="ECECEC" w:val="clear"/>
             <w:tcBorders>
               <w:top w:val="single" w:sz="4" w:color="CCCCCC"/>
               <w:left w:val="single" w:sz="4" w:color="CCCCCC"/>
@@ -6055,11 +6208,10 @@
               <w:insideH w:val="single" w:sz="4" w:color="CCCCCC"/>
               <w:insideV w:val="single" w:sz="4" w:color="CCCCCC"/>
             </w:tcBorders>
-            <w:shd w:fill="ECECEC" w:val="clear"/>
           </w:tcPr>
           <w:p>
             <w:pPr>
-              <w:jc w:val="both"/>
+              <w:jc w:val="left"/>
               <w:spacing w:after="20" w:before="20"/>
             </w:pPr>
             <w:r>
@@ -6077,7 +6229,7 @@
       <w:tr>
         <w:tc>
           <w:tcPr>
-            <w:tcW w:type="dxa" w:w="2633"/>
+            <w:tcW w:type="dxa" w:w="2600"/>
             <w:tcBorders>
               <w:top w:val="single" w:sz="4" w:color="CCCCCC"/>
               <w:left w:val="single" w:sz="4" w:color="CCCCCC"/>
@@ -6105,7 +6257,7 @@
         </w:tc>
         <w:tc>
           <w:tcPr>
-            <w:tcW w:type="dxa" w:w="6772"/>
+            <w:tcW w:type="dxa" w:w="6806"/>
             <w:tcBorders>
               <w:top w:val="single" w:sz="4" w:color="CCCCCC"/>
               <w:left w:val="single" w:sz="4" w:color="CCCCCC"/>
@@ -6117,7 +6269,7 @@
           </w:tcPr>
           <w:p>
             <w:pPr>
-              <w:jc w:val="both"/>
+              <w:jc w:val="left"/>
               <w:spacing w:after="20" w:before="20"/>
             </w:pPr>
             <w:r>
@@ -6135,7 +6287,8 @@
       <w:tr>
         <w:tc>
           <w:tcPr>
-            <w:tcW w:type="dxa" w:w="2633"/>
+            <w:tcW w:type="dxa" w:w="2600"/>
+            <w:shd w:fill="ECECEC" w:val="clear"/>
             <w:tcBorders>
               <w:top w:val="single" w:sz="4" w:color="CCCCCC"/>
               <w:left w:val="single" w:sz="4" w:color="CCCCCC"/>
@@ -6144,7 +6297,6 @@
               <w:insideH w:val="single" w:sz="4" w:color="CCCCCC"/>
               <w:insideV w:val="single" w:sz="4" w:color="CCCCCC"/>
             </w:tcBorders>
-            <w:shd w:fill="ECECEC" w:val="clear"/>
           </w:tcPr>
           <w:p>
             <w:pPr>
@@ -6164,7 +6316,8 @@
         </w:tc>
         <w:tc>
           <w:tcPr>
-            <w:tcW w:type="dxa" w:w="6772"/>
+            <w:tcW w:type="dxa" w:w="6806"/>
+            <w:shd w:fill="ECECEC" w:val="clear"/>
             <w:tcBorders>
               <w:top w:val="single" w:sz="4" w:color="CCCCCC"/>
               <w:left w:val="single" w:sz="4" w:color="CCCCCC"/>
@@ -6173,11 +6326,10 @@
               <w:insideH w:val="single" w:sz="4" w:color="CCCCCC"/>
               <w:insideV w:val="single" w:sz="4" w:color="CCCCCC"/>
             </w:tcBorders>
-            <w:shd w:fill="ECECEC" w:val="clear"/>
           </w:tcPr>
           <w:p>
             <w:pPr>
-              <w:jc w:val="both"/>
+              <w:jc w:val="left"/>
               <w:spacing w:after="20" w:before="20"/>
             </w:pPr>
             <w:r>
@@ -6192,12 +6344,65 @@
           </w:p>
         </w:tc>
       </w:tr>
+      <w:tr>
+        <w:tc>
+          <w:tcPr>
+            <w:tcW w:type="dxa" w:w="2600"/>
+            <w:tcBorders>
+              <w:top w:val="single" w:sz="4" w:color="CCCCCC"/>
+              <w:left w:val="single" w:sz="4" w:color="CCCCCC"/>
+              <w:bottom w:val="single" w:sz="4" w:color="CCCCCC"/>
+              <w:right w:val="single" w:sz="4" w:color="CCCCCC"/>
+              <w:insideH w:val="single" w:sz="4" w:color="CCCCCC"/>
+              <w:insideV w:val="single" w:sz="4" w:color="CCCCCC"/>
+            </w:tcBorders>
+          </w:tcPr>
+          <w:p>
+            <w:pPr>
+              <w:jc w:val="left"/>
+              <w:spacing w:after="20" w:before="20"/>
+            </w:pPr>
+            <w:r>
+              <w:rPr>
+                <w:rFonts w:ascii="Roboto Condensed Light" w:hAnsi="Roboto Condensed Light"/>
+                <w:b/>
+                <w:color w:val="2A324B"/>
+                <w:sz w:val="20"/>
+              </w:rPr>
+              <w:t>Wypełnianie z transkrypcji</w:t>
+            </w:r>
+          </w:p>
+        </w:tc>
+        <w:tc>
+          <w:tcPr>
+            <w:tcW w:type="dxa" w:w="6806"/>
+            <w:tcBorders>
+              <w:top w:val="single" w:sz="4" w:color="CCCCCC"/>
+              <w:left w:val="single" w:sz="4" w:color="CCCCCC"/>
+              <w:bottom w:val="single" w:sz="4" w:color="CCCCCC"/>
+              <w:right w:val="single" w:sz="4" w:color="CCCCCC"/>
+              <w:insideH w:val="single" w:sz="4" w:color="CCCCCC"/>
+              <w:insideV w:val="single" w:sz="4" w:color="CCCCCC"/>
+            </w:tcBorders>
+          </w:tcPr>
+          <w:p>
+            <w:pPr>
+              <w:jc w:val="left"/>
+              <w:spacing w:after="20" w:before="20"/>
+            </w:pPr>
+            <w:r>
+              <w:rPr>
+                <w:rFonts w:ascii="Roboto Condensed Light" w:hAnsi="Roboto Condensed Light"/>
+                <w:b w:val="0"/>
+                <w:color w:val="2A324B"/>
+                <w:sz w:val="20"/>
+              </w:rPr>
+              <w:t>Model Claude (Anthropic SDK) wywoływany przez endpoint /api/admin/offer-draft; parsowanie .docx przez mammoth. Wymaga klucza ANTHROPIC_API_KEY; bez niego funkcja jest wyłączona (503).</w:t>
+            </w:r>
+          </w:p>
+        </w:tc>
+      </w:tr>
     </w:tbl>
-    <w:p>
-      <w:pPr>
-        <w:spacing w:after="80"/>
-      </w:pPr>
-    </w:p>
     <w:p>
       <w:pPr>
         <w:jc w:val="left"/>
@@ -6236,13 +6441,13 @@
         <w:tblLayout w:type="fixed"/>
       </w:tblPr>
       <w:tblGrid>
-        <w:gridCol w:w="3198"/>
-        <w:gridCol w:w="6207"/>
+        <w:gridCol w:w="2600"/>
+        <w:gridCol w:w="6806"/>
       </w:tblGrid>
       <w:tr>
         <w:tc>
           <w:tcPr>
-            <w:tcW w:type="dxa" w:w="3198"/>
+            <w:tcW w:type="dxa" w:w="2600"/>
             <w:shd w:fill="2A324B" w:val="clear"/>
             <w:tcBorders>
               <w:top w:val="single" w:sz="4" w:color="CCCCCC"/>
@@ -6271,7 +6476,7 @@
         </w:tc>
         <w:tc>
           <w:tcPr>
-            <w:tcW w:type="dxa" w:w="6207"/>
+            <w:tcW w:type="dxa" w:w="6806"/>
             <w:shd w:fill="2A324B" w:val="clear"/>
             <w:tcBorders>
               <w:top w:val="single" w:sz="4" w:color="CCCCCC"/>
@@ -6302,7 +6507,7 @@
       <w:tr>
         <w:tc>
           <w:tcPr>
-            <w:tcW w:type="dxa" w:w="3198"/>
+            <w:tcW w:type="dxa" w:w="2600"/>
             <w:tcBorders>
               <w:top w:val="single" w:sz="4" w:color="CCCCCC"/>
               <w:left w:val="single" w:sz="4" w:color="CCCCCC"/>
@@ -6330,7 +6535,7 @@
         </w:tc>
         <w:tc>
           <w:tcPr>
-            <w:tcW w:type="dxa" w:w="6207"/>
+            <w:tcW w:type="dxa" w:w="6806"/>
             <w:tcBorders>
               <w:top w:val="single" w:sz="4" w:color="CCCCCC"/>
               <w:left w:val="single" w:sz="4" w:color="CCCCCC"/>
@@ -6342,7 +6547,7 @@
           </w:tcPr>
           <w:p>
             <w:pPr>
-              <w:jc w:val="both"/>
+              <w:jc w:val="left"/>
               <w:spacing w:after="20" w:before="20"/>
             </w:pPr>
             <w:r>
@@ -6360,7 +6565,8 @@
       <w:tr>
         <w:tc>
           <w:tcPr>
-            <w:tcW w:type="dxa" w:w="3198"/>
+            <w:tcW w:type="dxa" w:w="2600"/>
+            <w:shd w:fill="ECECEC" w:val="clear"/>
             <w:tcBorders>
               <w:top w:val="single" w:sz="4" w:color="CCCCCC"/>
               <w:left w:val="single" w:sz="4" w:color="CCCCCC"/>
@@ -6369,7 +6575,6 @@
               <w:insideH w:val="single" w:sz="4" w:color="CCCCCC"/>
               <w:insideV w:val="single" w:sz="4" w:color="CCCCCC"/>
             </w:tcBorders>
-            <w:shd w:fill="ECECEC" w:val="clear"/>
           </w:tcPr>
           <w:p>
             <w:pPr>
@@ -6389,7 +6594,8 @@
         </w:tc>
         <w:tc>
           <w:tcPr>
-            <w:tcW w:type="dxa" w:w="6207"/>
+            <w:tcW w:type="dxa" w:w="6806"/>
+            <w:shd w:fill="ECECEC" w:val="clear"/>
             <w:tcBorders>
               <w:top w:val="single" w:sz="4" w:color="CCCCCC"/>
               <w:left w:val="single" w:sz="4" w:color="CCCCCC"/>
@@ -6398,11 +6604,10 @@
               <w:insideH w:val="single" w:sz="4" w:color="CCCCCC"/>
               <w:insideV w:val="single" w:sz="4" w:color="CCCCCC"/>
             </w:tcBorders>
-            <w:shd w:fill="ECECEC" w:val="clear"/>
           </w:tcPr>
           <w:p>
             <w:pPr>
-              <w:jc w:val="both"/>
+              <w:jc w:val="left"/>
               <w:spacing w:after="20" w:before="20"/>
             </w:pPr>
             <w:r>
@@ -6420,7 +6625,7 @@
       <w:tr>
         <w:tc>
           <w:tcPr>
-            <w:tcW w:type="dxa" w:w="3198"/>
+            <w:tcW w:type="dxa" w:w="2600"/>
             <w:tcBorders>
               <w:top w:val="single" w:sz="4" w:color="CCCCCC"/>
               <w:left w:val="single" w:sz="4" w:color="CCCCCC"/>
@@ -6448,7 +6653,7 @@
         </w:tc>
         <w:tc>
           <w:tcPr>
-            <w:tcW w:type="dxa" w:w="6207"/>
+            <w:tcW w:type="dxa" w:w="6806"/>
             <w:tcBorders>
               <w:top w:val="single" w:sz="4" w:color="CCCCCC"/>
               <w:left w:val="single" w:sz="4" w:color="CCCCCC"/>
@@ -6460,7 +6665,7 @@
           </w:tcPr>
           <w:p>
             <w:pPr>
-              <w:jc w:val="both"/>
+              <w:jc w:val="left"/>
               <w:spacing w:after="20" w:before="20"/>
             </w:pPr>
             <w:r>
@@ -6478,7 +6683,8 @@
       <w:tr>
         <w:tc>
           <w:tcPr>
-            <w:tcW w:type="dxa" w:w="3198"/>
+            <w:tcW w:type="dxa" w:w="2600"/>
+            <w:shd w:fill="ECECEC" w:val="clear"/>
             <w:tcBorders>
               <w:top w:val="single" w:sz="4" w:color="CCCCCC"/>
               <w:left w:val="single" w:sz="4" w:color="CCCCCC"/>
@@ -6487,7 +6693,6 @@
               <w:insideH w:val="single" w:sz="4" w:color="CCCCCC"/>
               <w:insideV w:val="single" w:sz="4" w:color="CCCCCC"/>
             </w:tcBorders>
-            <w:shd w:fill="ECECEC" w:val="clear"/>
           </w:tcPr>
           <w:p>
             <w:pPr>
@@ -6501,13 +6706,14 @@
                 <w:color w:val="2A324B"/>
                 <w:sz w:val="20"/>
               </w:rPr>
-              <w:t>programs, case_studies, contact_persons</w:t>
+              <w:t>alt_programs, case_studies, contact_persons</w:t>
             </w:r>
           </w:p>
         </w:tc>
         <w:tc>
           <w:tcPr>
-            <w:tcW w:type="dxa" w:w="6207"/>
+            <w:tcW w:type="dxa" w:w="6806"/>
+            <w:shd w:fill="ECECEC" w:val="clear"/>
             <w:tcBorders>
               <w:top w:val="single" w:sz="4" w:color="CCCCCC"/>
               <w:left w:val="single" w:sz="4" w:color="CCCCCC"/>
@@ -6516,11 +6722,10 @@
               <w:insideH w:val="single" w:sz="4" w:color="CCCCCC"/>
               <w:insideV w:val="single" w:sz="4" w:color="CCCCCC"/>
             </w:tcBorders>
-            <w:shd w:fill="ECECEC" w:val="clear"/>
           </w:tcPr>
           <w:p>
             <w:pPr>
-              <w:jc w:val="both"/>
+              <w:jc w:val="left"/>
               <w:spacing w:after="20" w:before="20"/>
             </w:pPr>
             <w:r>
@@ -6530,7 +6735,7 @@
                 <w:color w:val="2A324B"/>
                 <w:sz w:val="20"/>
               </w:rPr>
-              <w:t>Katalogi słownikowe wykorzystywane w ofertach.</w:t>
+              <w:t>Katalogi słownikowe wykorzystywane w ofertach (m.in. biblioteka programów wsparcia).</w:t>
             </w:r>
           </w:p>
         </w:tc>
@@ -6538,7 +6743,7 @@
       <w:tr>
         <w:tc>
           <w:tcPr>
-            <w:tcW w:type="dxa" w:w="3198"/>
+            <w:tcW w:type="dxa" w:w="2600"/>
             <w:tcBorders>
               <w:top w:val="single" w:sz="4" w:color="CCCCCC"/>
               <w:left w:val="single" w:sz="4" w:color="CCCCCC"/>
@@ -6566,7 +6771,7 @@
         </w:tc>
         <w:tc>
           <w:tcPr>
-            <w:tcW w:type="dxa" w:w="6207"/>
+            <w:tcW w:type="dxa" w:w="6806"/>
             <w:tcBorders>
               <w:top w:val="single" w:sz="4" w:color="CCCCCC"/>
               <w:left w:val="single" w:sz="4" w:color="CCCCCC"/>
@@ -6578,7 +6783,7 @@
           </w:tcPr>
           <w:p>
             <w:pPr>
-              <w:jc w:val="both"/>
+              <w:jc w:val="left"/>
               <w:spacing w:after="20" w:before="20"/>
             </w:pPr>
             <w:r>
@@ -6596,7 +6801,8 @@
       <w:tr>
         <w:tc>
           <w:tcPr>
-            <w:tcW w:type="dxa" w:w="3198"/>
+            <w:tcW w:type="dxa" w:w="2600"/>
+            <w:shd w:fill="ECECEC" w:val="clear"/>
             <w:tcBorders>
               <w:top w:val="single" w:sz="4" w:color="CCCCCC"/>
               <w:left w:val="single" w:sz="4" w:color="CCCCCC"/>
@@ -6605,7 +6811,6 @@
               <w:insideH w:val="single" w:sz="4" w:color="CCCCCC"/>
               <w:insideV w:val="single" w:sz="4" w:color="CCCCCC"/>
             </w:tcBorders>
-            <w:shd w:fill="ECECEC" w:val="clear"/>
           </w:tcPr>
           <w:p>
             <w:pPr>
@@ -6619,13 +6824,14 @@
                 <w:color w:val="2A324B"/>
                 <w:sz w:val="20"/>
               </w:rPr>
-              <w:t>alt_programs, offer_templates, app_settings</w:t>
+              <w:t>offer_templates, app_settings</w:t>
             </w:r>
           </w:p>
         </w:tc>
         <w:tc>
           <w:tcPr>
-            <w:tcW w:type="dxa" w:w="6207"/>
+            <w:tcW w:type="dxa" w:w="6806"/>
+            <w:shd w:fill="ECECEC" w:val="clear"/>
             <w:tcBorders>
               <w:top w:val="single" w:sz="4" w:color="CCCCCC"/>
               <w:left w:val="single" w:sz="4" w:color="CCCCCC"/>
@@ -6634,11 +6840,10 @@
               <w:insideH w:val="single" w:sz="4" w:color="CCCCCC"/>
               <w:insideV w:val="single" w:sz="4" w:color="CCCCCC"/>
             </w:tcBorders>
-            <w:shd w:fill="ECECEC" w:val="clear"/>
           </w:tcPr>
           <w:p>
             <w:pPr>
-              <w:jc w:val="both"/>
+              <w:jc w:val="left"/>
               <w:spacing w:after="20" w:before="20"/>
             </w:pPr>
             <w:r>
@@ -6648,7 +6853,7 @@
                 <w:color w:val="2A324B"/>
                 <w:sz w:val="20"/>
               </w:rPr>
-              <w:t>Programy zapasowe, szablony ofert i ustawienia firmowe (klucz-wartość).</w:t>
+              <w:t>Szablony ofert i ustawienia firmowe (klucz-wartość).</w:t>
             </w:r>
           </w:p>
         </w:tc>
@@ -6656,7 +6861,7 @@
       <w:tr>
         <w:tc>
           <w:tcPr>
-            <w:tcW w:type="dxa" w:w="3198"/>
+            <w:tcW w:type="dxa" w:w="2600"/>
             <w:tcBorders>
               <w:top w:val="single" w:sz="4" w:color="CCCCCC"/>
               <w:left w:val="single" w:sz="4" w:color="CCCCCC"/>
@@ -6684,7 +6889,7 @@
         </w:tc>
         <w:tc>
           <w:tcPr>
-            <w:tcW w:type="dxa" w:w="6207"/>
+            <w:tcW w:type="dxa" w:w="6806"/>
             <w:tcBorders>
               <w:top w:val="single" w:sz="4" w:color="CCCCCC"/>
               <w:left w:val="single" w:sz="4" w:color="CCCCCC"/>
@@ -6696,7 +6901,7 @@
           </w:tcPr>
           <w:p>
             <w:pPr>
-              <w:jc w:val="both"/>
+              <w:jc w:val="left"/>
               <w:spacing w:after="20" w:before="20"/>
             </w:pPr>
             <w:r>
@@ -6714,7 +6919,8 @@
       <w:tr>
         <w:tc>
           <w:tcPr>
-            <w:tcW w:type="dxa" w:w="3198"/>
+            <w:tcW w:type="dxa" w:w="2600"/>
+            <w:shd w:fill="ECECEC" w:val="clear"/>
             <w:tcBorders>
               <w:top w:val="single" w:sz="4" w:color="CCCCCC"/>
               <w:left w:val="single" w:sz="4" w:color="CCCCCC"/>
@@ -6723,7 +6929,6 @@
               <w:insideH w:val="single" w:sz="4" w:color="CCCCCC"/>
               <w:insideV w:val="single" w:sz="4" w:color="CCCCCC"/>
             </w:tcBorders>
-            <w:shd w:fill="ECECEC" w:val="clear"/>
           </w:tcPr>
           <w:p>
             <w:pPr>
@@ -6743,7 +6948,8 @@
         </w:tc>
         <w:tc>
           <w:tcPr>
-            <w:tcW w:type="dxa" w:w="6207"/>
+            <w:tcW w:type="dxa" w:w="6806"/>
+            <w:shd w:fill="ECECEC" w:val="clear"/>
             <w:tcBorders>
               <w:top w:val="single" w:sz="4" w:color="CCCCCC"/>
               <w:left w:val="single" w:sz="4" w:color="CCCCCC"/>
@@ -6752,11 +6958,10 @@
               <w:insideH w:val="single" w:sz="4" w:color="CCCCCC"/>
               <w:insideV w:val="single" w:sz="4" w:color="CCCCCC"/>
             </w:tcBorders>
-            <w:shd w:fill="ECECEC" w:val="clear"/>
           </w:tcPr>
           <w:p>
             <w:pPr>
-              <w:jc w:val="both"/>
+              <w:jc w:val="left"/>
               <w:spacing w:after="20" w:before="20"/>
             </w:pPr>
             <w:r>
@@ -6772,11 +6977,6 @@
         </w:tc>
       </w:tr>
     </w:tbl>
-    <w:p>
-      <w:pPr>
-        <w:spacing w:after="80"/>
-      </w:pPr>
-    </w:p>
     <w:p>
       <w:pPr>
         <w:jc w:val="left"/>
@@ -6870,7 +7070,7 @@
     <w:p>
       <w:pPr>
         <w:jc w:val="both"/>
-        <w:spacing w:after="280" w:before="0"/>
+        <w:spacing w:after="80" w:before="0"/>
         <w:ind w:left="360" w:hanging="360"/>
       </w:pPr>
       <w:r>
@@ -7035,7 +7235,7 @@
     <w:p>
       <w:pPr>
         <w:jc w:val="both"/>
-        <w:spacing w:after="280" w:before="0"/>
+        <w:spacing w:after="80" w:before="0"/>
         <w:ind w:left="360" w:hanging="360"/>
       </w:pPr>
       <w:r>
@@ -7070,21 +7270,6 @@
           <w:sz w:val="36"/>
         </w:rPr>
         <w:t>5. Silnik cenowy</w:t>
-      </w:r>
-    </w:p>
-    <w:p>
-      <w:pPr>
-        <w:jc w:val="both"/>
-        <w:spacing w:after="120" w:before="0"/>
-      </w:pPr>
-      <w:r>
-        <w:rPr>
-          <w:rFonts w:ascii="Roboto Condensed Light" w:hAnsi="Roboto Condensed Light"/>
-          <w:b w:val="0"/>
-          <w:color w:val="2A324B"/>
-          <w:sz w:val="22"/>
-        </w:rPr>
-        <w:t>Cennik wyliczany jest z konfiguracji, a nie zapisywany na sztywno w kodzie:</w:t>
       </w:r>
     </w:p>
     <w:p>
@@ -7190,7 +7375,7 @@
     <w:p>
       <w:pPr>
         <w:jc w:val="both"/>
-        <w:spacing w:after="280" w:before="0"/>
+        <w:spacing w:after="80" w:before="0"/>
         <w:ind w:left="360" w:hanging="360"/>
       </w:pPr>
       <w:r>
@@ -7305,7 +7490,7 @@
     <w:p>
       <w:pPr>
         <w:jc w:val="both"/>
-        <w:spacing w:after="280" w:before="0"/>
+        <w:spacing w:after="80" w:before="0"/>
         <w:ind w:left="360" w:hanging="360"/>
       </w:pPr>
       <w:r>
@@ -7350,13 +7535,13 @@
         <w:tblLayout w:type="fixed"/>
       </w:tblPr>
       <w:tblGrid>
-        <w:gridCol w:w="2633"/>
-        <w:gridCol w:w="6772"/>
+        <w:gridCol w:w="2600"/>
+        <w:gridCol w:w="6806"/>
       </w:tblGrid>
       <w:tr>
         <w:tc>
           <w:tcPr>
-            <w:tcW w:type="dxa" w:w="2633"/>
+            <w:tcW w:type="dxa" w:w="2600"/>
             <w:shd w:fill="2A324B" w:val="clear"/>
             <w:tcBorders>
               <w:top w:val="single" w:sz="4" w:color="CCCCCC"/>
@@ -7385,7 +7570,7 @@
         </w:tc>
         <w:tc>
           <w:tcPr>
-            <w:tcW w:type="dxa" w:w="6772"/>
+            <w:tcW w:type="dxa" w:w="6806"/>
             <w:shd w:fill="2A324B" w:val="clear"/>
             <w:tcBorders>
               <w:top w:val="single" w:sz="4" w:color="CCCCCC"/>
@@ -7416,7 +7601,7 @@
       <w:tr>
         <w:tc>
           <w:tcPr>
-            <w:tcW w:type="dxa" w:w="2633"/>
+            <w:tcW w:type="dxa" w:w="2600"/>
             <w:tcBorders>
               <w:top w:val="single" w:sz="4" w:color="CCCCCC"/>
               <w:left w:val="single" w:sz="4" w:color="CCCCCC"/>
@@ -7444,7 +7629,7 @@
         </w:tc>
         <w:tc>
           <w:tcPr>
-            <w:tcW w:type="dxa" w:w="6772"/>
+            <w:tcW w:type="dxa" w:w="6806"/>
             <w:tcBorders>
               <w:top w:val="single" w:sz="4" w:color="CCCCCC"/>
               <w:left w:val="single" w:sz="4" w:color="CCCCCC"/>
@@ -7456,7 +7641,7 @@
           </w:tcPr>
           <w:p>
             <w:pPr>
-              <w:jc w:val="both"/>
+              <w:jc w:val="left"/>
               <w:spacing w:after="20" w:before="20"/>
             </w:pPr>
             <w:r>
@@ -7474,7 +7659,8 @@
       <w:tr>
         <w:tc>
           <w:tcPr>
-            <w:tcW w:type="dxa" w:w="2633"/>
+            <w:tcW w:type="dxa" w:w="2600"/>
+            <w:shd w:fill="ECECEC" w:val="clear"/>
             <w:tcBorders>
               <w:top w:val="single" w:sz="4" w:color="CCCCCC"/>
               <w:left w:val="single" w:sz="4" w:color="CCCCCC"/>
@@ -7502,7 +7688,8 @@
         </w:tc>
         <w:tc>
           <w:tcPr>
-            <w:tcW w:type="dxa" w:w="6772"/>
+            <w:tcW w:type="dxa" w:w="6806"/>
+            <w:shd w:fill="ECECEC" w:val="clear"/>
             <w:tcBorders>
               <w:top w:val="single" w:sz="4" w:color="CCCCCC"/>
               <w:left w:val="single" w:sz="4" w:color="CCCCCC"/>
@@ -7514,7 +7701,7 @@
           </w:tcPr>
           <w:p>
             <w:pPr>
-              <w:jc w:val="both"/>
+              <w:jc w:val="left"/>
               <w:spacing w:after="20" w:before="20"/>
             </w:pPr>
             <w:r>
@@ -7532,7 +7719,7 @@
       <w:tr>
         <w:tc>
           <w:tcPr>
-            <w:tcW w:type="dxa" w:w="2633"/>
+            <w:tcW w:type="dxa" w:w="2600"/>
             <w:tcBorders>
               <w:top w:val="single" w:sz="4" w:color="CCCCCC"/>
               <w:left w:val="single" w:sz="4" w:color="CCCCCC"/>
@@ -7560,7 +7747,7 @@
         </w:tc>
         <w:tc>
           <w:tcPr>
-            <w:tcW w:type="dxa" w:w="6772"/>
+            <w:tcW w:type="dxa" w:w="6806"/>
             <w:tcBorders>
               <w:top w:val="single" w:sz="4" w:color="CCCCCC"/>
               <w:left w:val="single" w:sz="4" w:color="CCCCCC"/>
@@ -7572,7 +7759,7 @@
           </w:tcPr>
           <w:p>
             <w:pPr>
-              <w:jc w:val="both"/>
+              <w:jc w:val="left"/>
               <w:spacing w:after="20" w:before="20"/>
             </w:pPr>
             <w:r>
@@ -7590,7 +7777,8 @@
       <w:tr>
         <w:tc>
           <w:tcPr>
-            <w:tcW w:type="dxa" w:w="2633"/>
+            <w:tcW w:type="dxa" w:w="2600"/>
+            <w:shd w:fill="ECECEC" w:val="clear"/>
             <w:tcBorders>
               <w:top w:val="single" w:sz="4" w:color="CCCCCC"/>
               <w:left w:val="single" w:sz="4" w:color="CCCCCC"/>
@@ -7618,7 +7806,8 @@
         </w:tc>
         <w:tc>
           <w:tcPr>
-            <w:tcW w:type="dxa" w:w="6772"/>
+            <w:tcW w:type="dxa" w:w="6806"/>
+            <w:shd w:fill="ECECEC" w:val="clear"/>
             <w:tcBorders>
               <w:top w:val="single" w:sz="4" w:color="CCCCCC"/>
               <w:left w:val="single" w:sz="4" w:color="CCCCCC"/>
@@ -7630,7 +7819,7 @@
           </w:tcPr>
           <w:p>
             <w:pPr>
-              <w:jc w:val="both"/>
+              <w:jc w:val="left"/>
               <w:spacing w:after="20" w:before="20"/>
             </w:pPr>
             <w:r>
@@ -7646,11 +7835,6 @@
         </w:tc>
       </w:tr>
     </w:tbl>
-    <w:p>
-      <w:pPr>
-        <w:spacing w:after="80"/>
-      </w:pPr>
-    </w:p>
     <w:p>
       <w:pPr>
         <w:jc w:val="left"/>
@@ -7744,7 +7928,7 @@
     <w:p>
       <w:pPr>
         <w:jc w:val="both"/>
-        <w:spacing w:after="280" w:before="0"/>
+        <w:spacing w:after="80" w:before="0"/>
         <w:ind w:left="360" w:hanging="360"/>
       </w:pPr>
       <w:r>
@@ -7764,6 +7948,136 @@
           <w:sz w:val="22"/>
         </w:rPr>
         <w:t>Parametry cennika (segmenty i konfiguracja) można zmieniać bez wdrożenia, bezpośrednio w panelu Supabase.</w:t>
+      </w:r>
+    </w:p>
+    <w:p>
+      <w:pPr>
+        <w:jc w:val="left"/>
+        <w:spacing w:before="160" w:after="40"/>
+      </w:pPr>
+      <w:r>
+        <w:rPr>
+          <w:rFonts w:ascii="Roboto Condensed" w:hAnsi="Roboto Condensed"/>
+          <w:b w:val="0"/>
+          <w:color w:val="2A324B"/>
+          <w:sz w:val="36"/>
+        </w:rPr>
+        <w:t>9. Wypełnianie oferty z transkrypcji (AI)</w:t>
+      </w:r>
+    </w:p>
+    <w:p>
+      <w:pPr>
+        <w:jc w:val="both"/>
+        <w:spacing w:after="120" w:before="0"/>
+      </w:pPr>
+      <w:r>
+        <w:rPr>
+          <w:rFonts w:ascii="Roboto Condensed Light" w:hAnsi="Roboto Condensed Light"/>
+          <w:b w:val="0"/>
+          <w:color w:val="2A324B"/>
+          <w:sz w:val="22"/>
+        </w:rPr>
+        <w:t>Endpoint POST /api/admin/offer-draft (dostęp tylko dla roli admin) przyjmuje wklejony tekst w formacie JSON lub plik przesłany jako multipart. Plik .docx jest parsowany w pamięci przez bibliotekę mammoth, a plik .txt czytany jako UTF-8. Model Claude (Haiku) z wymuszonym wywołaniem narzędzia zwraca ustrukturyzowany zestaw pól szkicu. Sugerowany program dopasowywany jest wyłącznie do realnych identyfikatorów z biblioteki alt_programs. Wynik modelu normalizuje moduł lib/offers/draft.ts, pokryty testami.</w:t>
+      </w:r>
+    </w:p>
+    <w:p>
+      <w:pPr>
+        <w:jc w:val="both"/>
+        <w:spacing w:after="80" w:before="0"/>
+        <w:ind w:left="360" w:hanging="360"/>
+      </w:pPr>
+      <w:r>
+        <w:rPr>
+          <w:rFonts w:ascii="Roboto Condensed Light" w:hAnsi="Roboto Condensed Light"/>
+          <w:b w:val="0"/>
+          <w:color w:val="2A324B"/>
+          <w:sz w:val="22"/>
+        </w:rPr>
+        <w:t xml:space="preserve">-  </w:t>
+      </w:r>
+      <w:r>
+        <w:rPr>
+          <w:rFonts w:ascii="Roboto Condensed Light" w:hAnsi="Roboto Condensed Light"/>
+          <w:b w:val="0"/>
+          <w:color w:val="2A324B"/>
+          <w:sz w:val="22"/>
+        </w:rPr>
+        <w:t>Zakres wejścia: minimum kilkanaście znaków; analizowany jest fragment do 50 000 znaków, nadmiar jest obcinany z ostrzeżeniem.</w:t>
+      </w:r>
+    </w:p>
+    <w:p>
+      <w:pPr>
+        <w:jc w:val="both"/>
+        <w:spacing w:after="80" w:before="0"/>
+        <w:ind w:left="360" w:hanging="360"/>
+      </w:pPr>
+      <w:r>
+        <w:rPr>
+          <w:rFonts w:ascii="Roboto Condensed Light" w:hAnsi="Roboto Condensed Light"/>
+          <w:b w:val="0"/>
+          <w:color w:val="2A324B"/>
+          <w:sz w:val="22"/>
+        </w:rPr>
+        <w:t xml:space="preserve">-  </w:t>
+      </w:r>
+      <w:r>
+        <w:rPr>
+          <w:rFonts w:ascii="Roboto Condensed Light" w:hAnsi="Roboto Condensed Light"/>
+          <w:b w:val="0"/>
+          <w:color w:val="2A324B"/>
+          <w:sz w:val="22"/>
+        </w:rPr>
+        <w:t>RODO: transkryptu ani pliku nie zapisujemy - przetwarzanie odbywa się w pamięci, nic nie trafia do bazy ani do audit_log.</w:t>
+      </w:r>
+    </w:p>
+    <w:p>
+      <w:pPr>
+        <w:jc w:val="both"/>
+        <w:spacing w:after="80" w:before="0"/>
+        <w:ind w:left="360" w:hanging="360"/>
+      </w:pPr>
+      <w:r>
+        <w:rPr>
+          <w:rFonts w:ascii="Roboto Condensed Light" w:hAnsi="Roboto Condensed Light"/>
+          <w:b w:val="0"/>
+          <w:color w:val="2A324B"/>
+          <w:sz w:val="22"/>
+        </w:rPr>
+        <w:t xml:space="preserve">-  </w:t>
+      </w:r>
+      <w:r>
+        <w:rPr>
+          <w:rFonts w:ascii="Roboto Condensed Light" w:hAnsi="Roboto Condensed Light"/>
+          <w:b w:val="0"/>
+          <w:color w:val="2A324B"/>
+          <w:sz w:val="22"/>
+        </w:rPr>
+        <w:t>Uzupełniane są wyłącznie puste pola formularza; wartość projektu proponowana jest tylko wtedy, gdy padła wprost, i zawsze oznaczana do potwierdzenia.</w:t>
+      </w:r>
+    </w:p>
+    <w:p>
+      <w:pPr>
+        <w:jc w:val="both"/>
+        <w:spacing w:after="80" w:before="0"/>
+        <w:ind w:left="360" w:hanging="360"/>
+      </w:pPr>
+      <w:r>
+        <w:rPr>
+          <w:rFonts w:ascii="Roboto Condensed Light" w:hAnsi="Roboto Condensed Light"/>
+          <w:b w:val="0"/>
+          <w:color w:val="2A324B"/>
+          <w:sz w:val="22"/>
+        </w:rPr>
+        <w:t xml:space="preserve">-  </w:t>
+      </w:r>
+      <w:r>
+        <w:rPr>
+          <w:rFonts w:ascii="Roboto Condensed Light" w:hAnsi="Roboto Condensed Light"/>
+          <w:b w:val="0"/>
+          <w:color w:val="2A324B"/>
+          <w:sz w:val="22"/>
+        </w:rPr>
+        <w:t>Funkcja wymaga zmiennej ANTHROPIC_API_KEY (dev: .env.local, prod: Vercel). Bez klucza endpoint zwraca kod 503.</w:t>
       </w:r>
     </w:p>
     <w:p>
@@ -7859,7 +8173,7 @@
     <w:p>
       <w:pPr>
         <w:jc w:val="both"/>
-        <w:spacing w:after="280" w:before="0"/>
+        <w:spacing w:after="80" w:before="0"/>
         <w:ind w:left="360" w:hanging="360"/>
       </w:pPr>
       <w:r>

</xml_diff>